<commit_message>
Record the self-found corrections in the round's response
The unstratified-White comparator fix came from checking the manuscript
against Table 1, not from any of the seven items, so it had nowhere to be
reported. Add a closing section to the fifth-round response for
corrections found this way, and put it there: the count (19 of 85), the
two errors in how the cells were described, and why Alaska Native is
listed apart from the other 18.

The section also points to Changes_for_review, so the supervisor knows
there is a document giving every changed paragraph with a phrase to
search for.

CLAUDE.md now says corrections found outside the numbered items belong in
that section, so none reaches the supervisor unannounced.

Co-Authored-By: Claude Opus 5 <noreply@anthropic.com>
Claude-Session: https://claude.ai/code/session_01CuLT4FKRBtsU22Vwfjj2qn
</commit_message>
<xml_diff>
--- a/meta_agents/search_v2/outputs/Changes_for_review.docx
+++ b/meta_agents/search_v2/outputs/Changes_for_review.docx
@@ -69,7 +69,7 @@
           <w:sz w:val="20"/>
           <w:szCs w:val="20"/>
         </w:rPr>
-        <w:t xml:space="preserve">범위: `42fa0b5` … `HEAD` (28개 문단)</w:t>
+        <w:t xml:space="preserve">범위: `42fa0b5` … `HEAD` (34개 문단)</w:t>
       </w:r>
     </w:p>
     <w:p>
@@ -223,6 +223,139 @@
     </w:p>
     <w:p>
       <w:pPr>
+        <w:spacing w:after="120" w:line="276"/>
+      </w:pPr>
+      <w:r>
+        <w:rPr>
+          <w:rFonts w:ascii="Malgun Gothic" w:cs="Malgun Gothic" w:eastAsia="Malgun Gothic" w:hAnsi="Malgun Gothic"/>
+          <w:b w:val="false"/>
+          <w:bCs w:val="false"/>
+          <w:color w:val="000000"/>
+          <w:sz w:val="20"/>
+          <w:szCs w:val="20"/>
+        </w:rPr>
+        <w:t xml:space="preserve">### 2. Abstract — 수정</w:t>
+      </w:r>
+    </w:p>
+    <w:p>
+      <w:pPr>
+        <w:spacing w:after="120" w:line="276"/>
+      </w:pPr>
+      <w:r>
+        <w:rPr>
+          <w:rFonts w:ascii="Malgun Gothic" w:cs="Malgun Gothic" w:eastAsia="Malgun Gothic" w:hAnsi="Malgun Gothic"/>
+          <w:b/>
+          <w:bCs/>
+          <w:color w:val="000000"/>
+          <w:sz w:val="20"/>
+          <w:szCs w:val="20"/>
+        </w:rPr>
+        <w:t xml:space="preserve">찾기:</w:t>
+      </w:r>
+      <w:r>
+        <w:rPr>
+          <w:rFonts w:ascii="Malgun Gothic" w:cs="Malgun Gothic" w:eastAsia="Malgun Gothic" w:hAnsi="Malgun Gothic"/>
+          <w:b w:val="false"/>
+          <w:bCs w:val="false"/>
+          <w:color w:val="000000"/>
+          <w:sz w:val="20"/>
+          <w:szCs w:val="20"/>
+        </w:rPr>
+        <w:t xml:space="preserve"> `Each was an incidence rate ratio (IRR) versus NHW women, or versus…`</w:t>
+      </w:r>
+    </w:p>
+    <w:p>
+      <w:pPr>
+        <w:spacing w:after="120" w:line="276"/>
+      </w:pPr>
+      <w:r>
+        <w:rPr>
+          <w:rFonts w:ascii="Malgun Gothic" w:cs="Malgun Gothic" w:eastAsia="Malgun Gothic" w:hAnsi="Malgun Gothic"/>
+          <w:b/>
+          <w:bCs/>
+          <w:color w:val="000000"/>
+          <w:sz w:val="20"/>
+          <w:szCs w:val="20"/>
+        </w:rPr>
+        <w:t xml:space="preserve">변경 전</w:t>
+      </w:r>
+    </w:p>
+    <w:p>
+      <w:pPr>
+        <w:pStyle w:val="ListParagraph"/>
+        <w:numPr>
+          <w:ilvl w:val="0"/>
+          <w:numId w:val="1"/>
+        </w:numPr>
+        <w:spacing w:after="80" w:line="276"/>
+      </w:pPr>
+      <w:r>
+        <w:rPr>
+          <w:rFonts w:ascii="Malgun Gothic" w:cs="Malgun Gothic" w:eastAsia="Malgun Gothic" w:hAnsi="Malgun Gothic"/>
+          <w:b w:val="false"/>
+          <w:bCs w:val="false"/>
+          <w:color w:val="000000"/>
+          <w:sz w:val="20"/>
+          <w:szCs w:val="20"/>
+        </w:rPr>
+        <w:t xml:space="preserve">Each was an incidence rate ratio (IRR) versus NHW women, or versus an unstratified White reference in a minority of cells; ratios not reported directly were recomputed from one master dataset, and risk of bias was assessed with the Joanna Briggs Institute checklist for incidence data.</w:t>
+      </w:r>
+    </w:p>
+    <w:p>
+      <w:pPr>
+        <w:spacing w:after="120" w:line="276"/>
+      </w:pPr>
+      <w:r>
+        <w:rPr>
+          <w:rFonts w:ascii="Malgun Gothic" w:cs="Malgun Gothic" w:eastAsia="Malgun Gothic" w:hAnsi="Malgun Gothic"/>
+          <w:b/>
+          <w:bCs/>
+          <w:color w:val="000000"/>
+          <w:sz w:val="20"/>
+          <w:szCs w:val="20"/>
+        </w:rPr>
+        <w:t xml:space="preserve">변경 후</w:t>
+      </w:r>
+    </w:p>
+    <w:p>
+      <w:pPr>
+        <w:pStyle w:val="ListParagraph"/>
+        <w:numPr>
+          <w:ilvl w:val="0"/>
+          <w:numId w:val="1"/>
+        </w:numPr>
+        <w:spacing w:after="80" w:line="276"/>
+      </w:pPr>
+      <w:r>
+        <w:rPr>
+          <w:rFonts w:ascii="Malgun Gothic" w:cs="Malgun Gothic" w:eastAsia="Malgun Gothic" w:hAnsi="Malgun Gothic"/>
+          <w:b w:val="false"/>
+          <w:bCs w:val="false"/>
+          <w:color w:val="000000"/>
+          <w:sz w:val="20"/>
+          <w:szCs w:val="20"/>
+        </w:rPr>
+        <w:t xml:space="preserve">Each was an incidence rate ratio (IRR) versus NHW women, or versus an unstratified White reference in 19 of the 85 cells; ratios not reported directly were recomputed from one master dataset, and risk of bias was assessed with the Joanna Briggs Institute checklist for incidence data.</w:t>
+      </w:r>
+    </w:p>
+    <w:p>
+      <w:pPr>
+        <w:spacing w:after="120" w:line="276"/>
+      </w:pPr>
+      <w:r>
+        <w:rPr>
+          <w:rFonts w:ascii="Malgun Gothic" w:cs="Malgun Gothic" w:eastAsia="Malgun Gothic" w:hAnsi="Malgun Gothic"/>
+          <w:b w:val="false"/>
+          <w:bCs w:val="false"/>
+          <w:color w:val="000000"/>
+          <w:sz w:val="20"/>
+          <w:szCs w:val="20"/>
+        </w:rPr>
+        <w:t xml:space="preserve">*사유: Give the number of unstratified-White cells instead of calling them a minority*</w:t>
+      </w:r>
+    </w:p>
+    <w:p>
+      <w:pPr>
         <w:spacing w:after="120" w:before="260"/>
       </w:pPr>
       <w:r>
@@ -1637,6 +1770,160 @@
     </w:p>
     <w:p>
       <w:pPr>
+        <w:spacing w:after="120" w:line="276"/>
+      </w:pPr>
+      <w:r>
+        <w:rPr>
+          <w:rFonts w:ascii="Malgun Gothic" w:cs="Malgun Gothic" w:eastAsia="Malgun Gothic" w:hAnsi="Malgun Gothic"/>
+          <w:b w:val="false"/>
+          <w:bCs w:val="false"/>
+          <w:color w:val="000000"/>
+          <w:sz w:val="20"/>
+          <w:szCs w:val="20"/>
+        </w:rPr>
+        <w:t xml:space="preserve">### 10. Selection of a representative population-based estimate — 수정</w:t>
+      </w:r>
+    </w:p>
+    <w:p>
+      <w:pPr>
+        <w:spacing w:after="120" w:line="276"/>
+      </w:pPr>
+      <w:r>
+        <w:rPr>
+          <w:rFonts w:ascii="Malgun Gothic" w:cs="Malgun Gothic" w:eastAsia="Malgun Gothic" w:hAnsi="Malgun Gothic"/>
+          <w:b/>
+          <w:bCs/>
+          <w:color w:val="000000"/>
+          <w:sz w:val="20"/>
+          <w:szCs w:val="20"/>
+        </w:rPr>
+        <w:t xml:space="preserve">찾기:</w:t>
+      </w:r>
+      <w:r>
+        <w:rPr>
+          <w:rFonts w:ascii="Malgun Gothic" w:cs="Malgun Gothic" w:eastAsia="Malgun Gothic" w:hAnsi="Malgun Gothic"/>
+          <w:b w:val="false"/>
+          <w:bCs w:val="false"/>
+          <w:color w:val="000000"/>
+          <w:sz w:val="20"/>
+          <w:szCs w:val="20"/>
+        </w:rPr>
+        <w:t xml:space="preserve"> `Where a cell had no NHW-comparator source—18 cells, being 16 of the…`</w:t>
+      </w:r>
+    </w:p>
+    <w:p>
+      <w:pPr>
+        <w:spacing w:after="120" w:line="276"/>
+      </w:pPr>
+      <w:r>
+        <w:rPr>
+          <w:rFonts w:ascii="Malgun Gothic" w:cs="Malgun Gothic" w:eastAsia="Malgun Gothic" w:hAnsi="Malgun Gothic"/>
+          <w:b/>
+          <w:bCs/>
+          <w:color w:val="000000"/>
+          <w:sz w:val="20"/>
+          <w:szCs w:val="20"/>
+        </w:rPr>
+        <w:t xml:space="preserve">변경 전</w:t>
+      </w:r>
+    </w:p>
+    <w:p>
+      <w:pPr>
+        <w:pStyle w:val="ListParagraph"/>
+        <w:numPr>
+          <w:ilvl w:val="0"/>
+          <w:numId w:val="1"/>
+        </w:numPr>
+        <w:spacing w:after="80" w:line="276"/>
+      </w:pPr>
+      <w:r>
+        <w:rPr>
+          <w:rFonts w:ascii="Malgun Gothic" w:cs="Malgun Gothic" w:eastAsia="Malgun Gothic" w:hAnsi="Malgun Gothic"/>
+          <w:b w:val="false"/>
+          <w:bCs w:val="false"/>
+          <w:color w:val="000000"/>
+          <w:sz w:val="20"/>
+          <w:szCs w:val="20"/>
+        </w:rPr>
+        <w:t xml:space="preserve">Where a cell had no NHW-comparator source—the receptor-defined subtype cells and two age-specific Black cells—the estimate using an unstratified White comparator was kept as the representative and marked †.</w:t>
+      </w:r>
+    </w:p>
+    <w:p>
+      <w:pPr>
+        <w:spacing w:after="120" w:line="276"/>
+      </w:pPr>
+      <w:r>
+        <w:rPr>
+          <w:rFonts w:ascii="Malgun Gothic" w:cs="Malgun Gothic" w:eastAsia="Malgun Gothic" w:hAnsi="Malgun Gothic"/>
+          <w:b/>
+          <w:bCs/>
+          <w:color w:val="000000"/>
+          <w:sz w:val="20"/>
+          <w:szCs w:val="20"/>
+        </w:rPr>
+        <w:t xml:space="preserve">변경 후</w:t>
+      </w:r>
+    </w:p>
+    <w:p>
+      <w:pPr>
+        <w:pStyle w:val="ListParagraph"/>
+        <w:numPr>
+          <w:ilvl w:val="0"/>
+          <w:numId w:val="1"/>
+        </w:numPr>
+        <w:spacing w:after="80" w:line="276"/>
+      </w:pPr>
+      <w:r>
+        <w:rPr>
+          <w:rFonts w:ascii="Malgun Gothic" w:cs="Malgun Gothic" w:eastAsia="Malgun Gothic" w:hAnsi="Malgun Gothic"/>
+          <w:b w:val="false"/>
+          <w:bCs w:val="false"/>
+          <w:color w:val="000000"/>
+          <w:sz w:val="20"/>
+          <w:szCs w:val="20"/>
+        </w:rPr>
+        <w:t xml:space="preserve">Where a cell had no NHW-comparator source—18 cells, being 16 of the 36 receptor-defined subtype cells and the two Black cells above and below age 40—the estimate using an unstratified White comparator was kept as the representative and marked †.</w:t>
+      </w:r>
+    </w:p>
+    <w:p>
+      <w:pPr>
+        <w:pStyle w:val="ListParagraph"/>
+        <w:numPr>
+          <w:ilvl w:val="0"/>
+          <w:numId w:val="1"/>
+        </w:numPr>
+        <w:spacing w:after="80" w:line="276"/>
+      </w:pPr>
+      <w:r>
+        <w:rPr>
+          <w:rFonts w:ascii="Malgun Gothic" w:cs="Malgun Gothic" w:eastAsia="Malgun Gothic" w:hAnsi="Malgun Gothic"/>
+          <w:b w:val="false"/>
+          <w:bCs w:val="false"/>
+          <w:color w:val="000000"/>
+          <w:sz w:val="20"/>
+          <w:szCs w:val="20"/>
+        </w:rPr>
+        <w:t xml:space="preserve">One further cell, Alaska Native, is marked † although an NHW-comparator source exists for it, the broader-coverage rule above having selected the registry that reports against an unstratified White reference; 19 of the 85 representatives carry the mark in all.</w:t>
+      </w:r>
+    </w:p>
+    <w:p>
+      <w:pPr>
+        <w:spacing w:after="120" w:line="276"/>
+      </w:pPr>
+      <w:r>
+        <w:rPr>
+          <w:rFonts w:ascii="Malgun Gothic" w:cs="Malgun Gothic" w:eastAsia="Malgun Gothic" w:hAnsi="Malgun Gothic"/>
+          <w:b w:val="false"/>
+          <w:bCs w:val="false"/>
+          <w:color w:val="000000"/>
+          <w:sz w:val="20"/>
+          <w:szCs w:val="20"/>
+        </w:rPr>
+        <w:t xml:space="preserve">*사유: Give the number of unstratified-White cells instead of calling them a minority*</w:t>
+      </w:r>
+    </w:p>
+    <w:p>
+      <w:pPr>
         <w:spacing w:after="120" w:before="260"/>
       </w:pPr>
       <w:r>
@@ -2493,6 +2780,272 @@
     </w:p>
     <w:p>
       <w:pPr>
+        <w:spacing w:after="120" w:line="276"/>
+      </w:pPr>
+      <w:r>
+        <w:rPr>
+          <w:rFonts w:ascii="Malgun Gothic" w:cs="Malgun Gothic" w:eastAsia="Malgun Gothic" w:hAnsi="Malgun Gothic"/>
+          <w:b w:val="false"/>
+          <w:bCs w:val="false"/>
+          <w:color w:val="000000"/>
+          <w:sz w:val="20"/>
+          <w:szCs w:val="20"/>
+        </w:rPr>
+        <w:t xml:space="preserve">### 7. Selection and characteristics of included studies — 수정</w:t>
+      </w:r>
+    </w:p>
+    <w:p>
+      <w:pPr>
+        <w:spacing w:after="120" w:line="276"/>
+      </w:pPr>
+      <w:r>
+        <w:rPr>
+          <w:rFonts w:ascii="Malgun Gothic" w:cs="Malgun Gothic" w:eastAsia="Malgun Gothic" w:hAnsi="Malgun Gothic"/>
+          <w:b/>
+          <w:bCs/>
+          <w:color w:val="000000"/>
+          <w:sz w:val="20"/>
+          <w:szCs w:val="20"/>
+        </w:rPr>
+        <w:t xml:space="preserve">찾기:</w:t>
+      </w:r>
+      <w:r>
+        <w:rPr>
+          <w:rFonts w:ascii="Malgun Gothic" w:cs="Malgun Gothic" w:eastAsia="Malgun Gothic" w:hAnsi="Malgun Gothic"/>
+          <w:b w:val="false"/>
+          <w:bCs w:val="false"/>
+          <w:color w:val="000000"/>
+          <w:sz w:val="20"/>
+          <w:szCs w:val="20"/>
+        </w:rPr>
+        <w:t xml:space="preserve"> `The reference group was NHW for 66 of the 85 representatives and…`</w:t>
+      </w:r>
+    </w:p>
+    <w:p>
+      <w:pPr>
+        <w:spacing w:after="120" w:line="276"/>
+      </w:pPr>
+      <w:r>
+        <w:rPr>
+          <w:rFonts w:ascii="Malgun Gothic" w:cs="Malgun Gothic" w:eastAsia="Malgun Gothic" w:hAnsi="Malgun Gothic"/>
+          <w:b/>
+          <w:bCs/>
+          <w:color w:val="000000"/>
+          <w:sz w:val="20"/>
+          <w:szCs w:val="20"/>
+        </w:rPr>
+        <w:t xml:space="preserve">변경 전</w:t>
+      </w:r>
+    </w:p>
+    <w:p>
+      <w:pPr>
+        <w:pStyle w:val="ListParagraph"/>
+        <w:numPr>
+          <w:ilvl w:val="0"/>
+          <w:numId w:val="1"/>
+        </w:numPr>
+        <w:spacing w:after="80" w:line="276"/>
+      </w:pPr>
+      <w:r>
+        <w:rPr>
+          <w:rFonts w:ascii="Malgun Gothic" w:cs="Malgun Gothic" w:eastAsia="Malgun Gothic" w:hAnsi="Malgun Gothic"/>
+          <w:b w:val="false"/>
+          <w:bCs w:val="false"/>
+          <w:color w:val="000000"/>
+          <w:sz w:val="20"/>
+          <w:szCs w:val="20"/>
+        </w:rPr>
+        <w:t xml:space="preserve">The reference group was NHW in most studies and an unstratified White group in a minority (marked †;</w:t>
+      </w:r>
+    </w:p>
+    <w:p>
+      <w:pPr>
+        <w:spacing w:after="120" w:line="276"/>
+      </w:pPr>
+      <w:r>
+        <w:rPr>
+          <w:rFonts w:ascii="Malgun Gothic" w:cs="Malgun Gothic" w:eastAsia="Malgun Gothic" w:hAnsi="Malgun Gothic"/>
+          <w:b/>
+          <w:bCs/>
+          <w:color w:val="000000"/>
+          <w:sz w:val="20"/>
+          <w:szCs w:val="20"/>
+        </w:rPr>
+        <w:t xml:space="preserve">변경 후</w:t>
+      </w:r>
+    </w:p>
+    <w:p>
+      <w:pPr>
+        <w:pStyle w:val="ListParagraph"/>
+        <w:numPr>
+          <w:ilvl w:val="0"/>
+          <w:numId w:val="1"/>
+        </w:numPr>
+        <w:spacing w:after="80" w:line="276"/>
+      </w:pPr>
+      <w:r>
+        <w:rPr>
+          <w:rFonts w:ascii="Malgun Gothic" w:cs="Malgun Gothic" w:eastAsia="Malgun Gothic" w:hAnsi="Malgun Gothic"/>
+          <w:b w:val="false"/>
+          <w:bCs w:val="false"/>
+          <w:color w:val="000000"/>
+          <w:sz w:val="20"/>
+          <w:szCs w:val="20"/>
+        </w:rPr>
+        <w:t xml:space="preserve">The reference group was NHW for 66 of the 85 representatives and an unstratified White group for the other 19 (marked †;</w:t>
+      </w:r>
+    </w:p>
+    <w:p>
+      <w:pPr>
+        <w:spacing w:after="120" w:line="276"/>
+      </w:pPr>
+      <w:r>
+        <w:rPr>
+          <w:rFonts w:ascii="Malgun Gothic" w:cs="Malgun Gothic" w:eastAsia="Malgun Gothic" w:hAnsi="Malgun Gothic"/>
+          <w:b w:val="false"/>
+          <w:bCs w:val="false"/>
+          <w:color w:val="000000"/>
+          <w:sz w:val="20"/>
+          <w:szCs w:val="20"/>
+        </w:rPr>
+        <w:t xml:space="preserve">*사유: Give the number of unstratified-White cells instead of calling them a minority*</w:t>
+      </w:r>
+    </w:p>
+    <w:p>
+      <w:pPr>
+        <w:spacing w:after="120" w:line="276"/>
+      </w:pPr>
+      <w:r>
+        <w:rPr>
+          <w:rFonts w:ascii="Malgun Gothic" w:cs="Malgun Gothic" w:eastAsia="Malgun Gothic" w:hAnsi="Malgun Gothic"/>
+          <w:b w:val="false"/>
+          <w:bCs w:val="false"/>
+          <w:color w:val="000000"/>
+          <w:sz w:val="20"/>
+          <w:szCs w:val="20"/>
+        </w:rPr>
+        <w:t xml:space="preserve">### 8. Risk of bias and sensitivity analyses — 수정</w:t>
+      </w:r>
+    </w:p>
+    <w:p>
+      <w:pPr>
+        <w:spacing w:after="120" w:line="276"/>
+      </w:pPr>
+      <w:r>
+        <w:rPr>
+          <w:rFonts w:ascii="Malgun Gothic" w:cs="Malgun Gothic" w:eastAsia="Malgun Gothic" w:hAnsi="Malgun Gothic"/>
+          <w:b/>
+          <w:bCs/>
+          <w:color w:val="000000"/>
+          <w:sz w:val="20"/>
+          <w:szCs w:val="20"/>
+        </w:rPr>
+        <w:t xml:space="preserve">찾기:</w:t>
+      </w:r>
+      <w:r>
+        <w:rPr>
+          <w:rFonts w:ascii="Malgun Gothic" w:cs="Malgun Gothic" w:eastAsia="Malgun Gothic" w:hAnsi="Malgun Gothic"/>
+          <w:b w:val="false"/>
+          <w:bCs w:val="false"/>
+          <w:color w:val="000000"/>
+          <w:sz w:val="20"/>
+          <w:szCs w:val="20"/>
+        </w:rPr>
+        <w:t xml:space="preserve"> `Supplementary Table 6c), the 18 dropped cells being those whose only representative…`</w:t>
+      </w:r>
+    </w:p>
+    <w:p>
+      <w:pPr>
+        <w:spacing w:after="120" w:line="276"/>
+      </w:pPr>
+      <w:r>
+        <w:rPr>
+          <w:rFonts w:ascii="Malgun Gothic" w:cs="Malgun Gothic" w:eastAsia="Malgun Gothic" w:hAnsi="Malgun Gothic"/>
+          <w:b/>
+          <w:bCs/>
+          <w:color w:val="000000"/>
+          <w:sz w:val="20"/>
+          <w:szCs w:val="20"/>
+        </w:rPr>
+        <w:t xml:space="preserve">변경 전</w:t>
+      </w:r>
+    </w:p>
+    <w:p>
+      <w:pPr>
+        <w:pStyle w:val="ListParagraph"/>
+        <w:numPr>
+          <w:ilvl w:val="0"/>
+          <w:numId w:val="1"/>
+        </w:numPr>
+        <w:spacing w:after="80" w:line="276"/>
+      </w:pPr>
+      <w:r>
+        <w:rPr>
+          <w:rFonts w:ascii="Malgun Gothic" w:cs="Malgun Gothic" w:eastAsia="Malgun Gothic" w:hAnsi="Malgun Gothic"/>
+          <w:b w:val="false"/>
+          <w:bCs w:val="false"/>
+          <w:color w:val="000000"/>
+          <w:sz w:val="20"/>
+          <w:szCs w:val="20"/>
+        </w:rPr>
+        <w:t xml:space="preserve">Supplementary Table 6c), the dropped cells being those whose only representative used an unstratified White comparator — the receptor-defined subtypes and two age-specific Black cells — and the one changed cell being Alaska Native, whose unstratified-White representative (1.09) gave way to an Indian Health Service–linked estimate reported against an NHW reference (1.25); and restricting to the 2000 U.S. standard population changed little, since 83 of the 85 representatives were already standardized to it, so the restriction dropped no cell and changed only two Black receptor-subtype cells, each from a 1960 Segi-world-standardized representative to a 2000 U.S.–standardized estimate in the same direction (hormone-receptor-negative 1.80 to 1.60, hormone-receptor-positive 0.82 to 0.70;</w:t>
+      </w:r>
+    </w:p>
+    <w:p>
+      <w:pPr>
+        <w:spacing w:after="120" w:line="276"/>
+      </w:pPr>
+      <w:r>
+        <w:rPr>
+          <w:rFonts w:ascii="Malgun Gothic" w:cs="Malgun Gothic" w:eastAsia="Malgun Gothic" w:hAnsi="Malgun Gothic"/>
+          <w:b/>
+          <w:bCs/>
+          <w:color w:val="000000"/>
+          <w:sz w:val="20"/>
+          <w:szCs w:val="20"/>
+        </w:rPr>
+        <w:t xml:space="preserve">변경 후</w:t>
+      </w:r>
+    </w:p>
+    <w:p>
+      <w:pPr>
+        <w:pStyle w:val="ListParagraph"/>
+        <w:numPr>
+          <w:ilvl w:val="0"/>
+          <w:numId w:val="1"/>
+        </w:numPr>
+        <w:spacing w:after="80" w:line="276"/>
+      </w:pPr>
+      <w:r>
+        <w:rPr>
+          <w:rFonts w:ascii="Malgun Gothic" w:cs="Malgun Gothic" w:eastAsia="Malgun Gothic" w:hAnsi="Malgun Gothic"/>
+          <w:b w:val="false"/>
+          <w:bCs w:val="false"/>
+          <w:color w:val="000000"/>
+          <w:sz w:val="20"/>
+          <w:szCs w:val="20"/>
+        </w:rPr>
+        <w:t xml:space="preserve">Supplementary Table 6c), the 18 dropped cells being those whose only representative used an unstratified White comparator — 16 receptor-defined subtype cells and the two Black cells above and below age 40 — and the one changed cell being Alaska Native, whose unstratified-White representative (1.09) gave way to an Indian Health Service–linked estimate reported against an NHW reference (1.25); and restricting to the 2000 U.S. standard population changed little, since 83 of the 85 representatives were already standardized to it, so the restriction dropped no cell and changed only two Black receptor-subtype cells, each from a 1960 Segi-world-standardized representative to a 2000 U.S.–standardized estimate in the same direction (hormone-receptor-negative 1.80 to 1.60, hormone-receptor-positive 0.82 to 0.70;</w:t>
+      </w:r>
+    </w:p>
+    <w:p>
+      <w:pPr>
+        <w:spacing w:after="120" w:line="276"/>
+      </w:pPr>
+      <w:r>
+        <w:rPr>
+          <w:rFonts w:ascii="Malgun Gothic" w:cs="Malgun Gothic" w:eastAsia="Malgun Gothic" w:hAnsi="Malgun Gothic"/>
+          <w:b w:val="false"/>
+          <w:bCs w:val="false"/>
+          <w:color w:val="000000"/>
+          <w:sz w:val="20"/>
+          <w:szCs w:val="20"/>
+        </w:rPr>
+        <w:t xml:space="preserve">*사유: Give the number of unstratified-White cells instead of calling them a minority*</w:t>
+      </w:r>
+    </w:p>
+    <w:p>
+      <w:pPr>
         <w:spacing w:after="120" w:before="260"/>
       </w:pPr>
       <w:r>
@@ -4351,6 +4904,272 @@
           <w:szCs w:val="20"/>
         </w:rPr>
         <w:t xml:space="preserve">*사유: Make every reference reachable, and finish the writing-guide sweep*</w:t>
+      </w:r>
+    </w:p>
+    <w:p>
+      <w:pPr>
+        <w:spacing w:after="120" w:line="276"/>
+      </w:pPr>
+      <w:r>
+        <w:rPr>
+          <w:rFonts w:ascii="Malgun Gothic" w:cs="Malgun Gothic" w:eastAsia="Malgun Gothic" w:hAnsi="Malgun Gothic"/>
+          <w:b w:val="false"/>
+          <w:bCs w:val="false"/>
+          <w:color w:val="000000"/>
+          <w:sz w:val="20"/>
+          <w:szCs w:val="20"/>
+        </w:rPr>
+        <w:t xml:space="preserve">### 12. Discussion — 수정</w:t>
+      </w:r>
+    </w:p>
+    <w:p>
+      <w:pPr>
+        <w:spacing w:after="120" w:line="276"/>
+      </w:pPr>
+      <w:r>
+        <w:rPr>
+          <w:rFonts w:ascii="Malgun Gothic" w:cs="Malgun Gothic" w:eastAsia="Malgun Gothic" w:hAnsi="Malgun Gothic"/>
+          <w:b/>
+          <w:bCs/>
+          <w:color w:val="000000"/>
+          <w:sz w:val="20"/>
+          <w:szCs w:val="20"/>
+        </w:rPr>
+        <w:t xml:space="preserve">찾기:</w:t>
+      </w:r>
+      <w:r>
+        <w:rPr>
+          <w:rFonts w:ascii="Malgun Gothic" w:cs="Malgun Gothic" w:eastAsia="Malgun Gothic" w:hAnsi="Malgun Gothic"/>
+          <w:b w:val="false"/>
+          <w:bCs w:val="false"/>
+          <w:color w:val="000000"/>
+          <w:sz w:val="20"/>
+          <w:szCs w:val="20"/>
+        </w:rPr>
+        <w:t xml:space="preserve"> `This review assembled disaggregated, population-based estimates of invasive breast cancer incidence for…`</w:t>
+      </w:r>
+    </w:p>
+    <w:p>
+      <w:pPr>
+        <w:spacing w:after="120" w:line="276"/>
+      </w:pPr>
+      <w:r>
+        <w:rPr>
+          <w:rFonts w:ascii="Malgun Gothic" w:cs="Malgun Gothic" w:eastAsia="Malgun Gothic" w:hAnsi="Malgun Gothic"/>
+          <w:b/>
+          <w:bCs/>
+          <w:color w:val="000000"/>
+          <w:sz w:val="20"/>
+          <w:szCs w:val="20"/>
+        </w:rPr>
+        <w:t xml:space="preserve">변경 전</w:t>
+      </w:r>
+    </w:p>
+    <w:p>
+      <w:pPr>
+        <w:pStyle w:val="ListParagraph"/>
+        <w:numPr>
+          <w:ilvl w:val="0"/>
+          <w:numId w:val="1"/>
+        </w:numPr>
+        <w:spacing w:after="80" w:line="276"/>
+      </w:pPr>
+      <w:r>
+        <w:rPr>
+          <w:rFonts w:ascii="Malgun Gothic" w:cs="Malgun Gothic" w:eastAsia="Malgun Gothic" w:hAnsi="Malgun Gothic"/>
+          <w:b w:val="false"/>
+          <w:bCs w:val="false"/>
+          <w:color w:val="000000"/>
+          <w:sz w:val="20"/>
+          <w:szCs w:val="20"/>
+        </w:rPr>
+        <w:t xml:space="preserve">This review assembled disaggregated, population-based estimates of invasive breast cancer incidence for U.S. racial and ethnic groups against a common NHW comparator (an unstratified White reference for a minority of cells, chiefly the receptor-defined subtypes).</w:t>
+      </w:r>
+    </w:p>
+    <w:p>
+      <w:pPr>
+        <w:spacing w:after="120" w:line="276"/>
+      </w:pPr>
+      <w:r>
+        <w:rPr>
+          <w:rFonts w:ascii="Malgun Gothic" w:cs="Malgun Gothic" w:eastAsia="Malgun Gothic" w:hAnsi="Malgun Gothic"/>
+          <w:b/>
+          <w:bCs/>
+          <w:color w:val="000000"/>
+          <w:sz w:val="20"/>
+          <w:szCs w:val="20"/>
+        </w:rPr>
+        <w:t xml:space="preserve">변경 후</w:t>
+      </w:r>
+    </w:p>
+    <w:p>
+      <w:pPr>
+        <w:pStyle w:val="ListParagraph"/>
+        <w:numPr>
+          <w:ilvl w:val="0"/>
+          <w:numId w:val="1"/>
+        </w:numPr>
+        <w:spacing w:after="80" w:line="276"/>
+      </w:pPr>
+      <w:r>
+        <w:rPr>
+          <w:rFonts w:ascii="Malgun Gothic" w:cs="Malgun Gothic" w:eastAsia="Malgun Gothic" w:hAnsi="Malgun Gothic"/>
+          <w:b w:val="false"/>
+          <w:bCs w:val="false"/>
+          <w:color w:val="000000"/>
+          <w:sz w:val="20"/>
+          <w:szCs w:val="20"/>
+        </w:rPr>
+        <w:t xml:space="preserve">This review assembled disaggregated, population-based estimates of invasive breast cancer incidence for U.S. racial and ethnic groups against a common NHW comparator (an unstratified White reference for 19 of the 85 cells, most of them receptor-defined subtypes).</w:t>
+      </w:r>
+    </w:p>
+    <w:p>
+      <w:pPr>
+        <w:spacing w:after="120" w:line="276"/>
+      </w:pPr>
+      <w:r>
+        <w:rPr>
+          <w:rFonts w:ascii="Malgun Gothic" w:cs="Malgun Gothic" w:eastAsia="Malgun Gothic" w:hAnsi="Malgun Gothic"/>
+          <w:b w:val="false"/>
+          <w:bCs w:val="false"/>
+          <w:color w:val="000000"/>
+          <w:sz w:val="20"/>
+          <w:szCs w:val="20"/>
+        </w:rPr>
+        <w:t xml:space="preserve">*사유: Give the number of unstratified-White cells instead of calling them a minority*</w:t>
+      </w:r>
+    </w:p>
+    <w:p>
+      <w:pPr>
+        <w:spacing w:after="120" w:line="276"/>
+      </w:pPr>
+      <w:r>
+        <w:rPr>
+          <w:rFonts w:ascii="Malgun Gothic" w:cs="Malgun Gothic" w:eastAsia="Malgun Gothic" w:hAnsi="Malgun Gothic"/>
+          <w:b w:val="false"/>
+          <w:bCs w:val="false"/>
+          <w:color w:val="000000"/>
+          <w:sz w:val="20"/>
+          <w:szCs w:val="20"/>
+        </w:rPr>
+        <w:t xml:space="preserve">### 13. Discussion — 수정</w:t>
+      </w:r>
+    </w:p>
+    <w:p>
+      <w:pPr>
+        <w:spacing w:after="120" w:line="276"/>
+      </w:pPr>
+      <w:r>
+        <w:rPr>
+          <w:rFonts w:ascii="Malgun Gothic" w:cs="Malgun Gothic" w:eastAsia="Malgun Gothic" w:hAnsi="Malgun Gothic"/>
+          <w:b/>
+          <w:bCs/>
+          <w:color w:val="000000"/>
+          <w:sz w:val="20"/>
+          <w:szCs w:val="20"/>
+        </w:rPr>
+        <w:t xml:space="preserve">찾기:</w:t>
+      </w:r>
+      <w:r>
+        <w:rPr>
+          <w:rFonts w:ascii="Malgun Gothic" w:cs="Malgun Gothic" w:eastAsia="Malgun Gothic" w:hAnsi="Malgun Gothic"/>
+          <w:b w:val="false"/>
+          <w:bCs w:val="false"/>
+          <w:color w:val="000000"/>
+          <w:sz w:val="20"/>
+          <w:szCs w:val="20"/>
+        </w:rPr>
+        <w:t xml:space="preserve"> `Second, reference groups differed across sources—66 of the 85 representatives used an…`</w:t>
+      </w:r>
+    </w:p>
+    <w:p>
+      <w:pPr>
+        <w:spacing w:after="120" w:line="276"/>
+      </w:pPr>
+      <w:r>
+        <w:rPr>
+          <w:rFonts w:ascii="Malgun Gothic" w:cs="Malgun Gothic" w:eastAsia="Malgun Gothic" w:hAnsi="Malgun Gothic"/>
+          <w:b/>
+          <w:bCs/>
+          <w:color w:val="000000"/>
+          <w:sz w:val="20"/>
+          <w:szCs w:val="20"/>
+        </w:rPr>
+        <w:t xml:space="preserve">변경 전</w:t>
+      </w:r>
+    </w:p>
+    <w:p>
+      <w:pPr>
+        <w:pStyle w:val="ListParagraph"/>
+        <w:numPr>
+          <w:ilvl w:val="0"/>
+          <w:numId w:val="1"/>
+        </w:numPr>
+        <w:spacing w:after="80" w:line="276"/>
+      </w:pPr>
+      <w:r>
+        <w:rPr>
+          <w:rFonts w:ascii="Malgun Gothic" w:cs="Malgun Gothic" w:eastAsia="Malgun Gothic" w:hAnsi="Malgun Gothic"/>
+          <w:b w:val="false"/>
+          <w:bCs w:val="false"/>
+          <w:color w:val="000000"/>
+          <w:sz w:val="20"/>
+          <w:szCs w:val="20"/>
+        </w:rPr>
+        <w:t xml:space="preserve">Second, reference groups differed across sources—most used an NHW comparator and a minority an unstratified White reference—so each comparator was recorded as its source defined it and a sensitivity analysis was restricted to NHW-comparator estimates; the unstratified-White cells, chiefly the receptor-defined subtypes, can shift a ratio slightly.</w:t>
+      </w:r>
+    </w:p>
+    <w:p>
+      <w:pPr>
+        <w:spacing w:after="120" w:line="276"/>
+      </w:pPr>
+      <w:r>
+        <w:rPr>
+          <w:rFonts w:ascii="Malgun Gothic" w:cs="Malgun Gothic" w:eastAsia="Malgun Gothic" w:hAnsi="Malgun Gothic"/>
+          <w:b/>
+          <w:bCs/>
+          <w:color w:val="000000"/>
+          <w:sz w:val="20"/>
+          <w:szCs w:val="20"/>
+        </w:rPr>
+        <w:t xml:space="preserve">변경 후</w:t>
+      </w:r>
+    </w:p>
+    <w:p>
+      <w:pPr>
+        <w:pStyle w:val="ListParagraph"/>
+        <w:numPr>
+          <w:ilvl w:val="0"/>
+          <w:numId w:val="1"/>
+        </w:numPr>
+        <w:spacing w:after="80" w:line="276"/>
+      </w:pPr>
+      <w:r>
+        <w:rPr>
+          <w:rFonts w:ascii="Malgun Gothic" w:cs="Malgun Gothic" w:eastAsia="Malgun Gothic" w:hAnsi="Malgun Gothic"/>
+          <w:b w:val="false"/>
+          <w:bCs w:val="false"/>
+          <w:color w:val="000000"/>
+          <w:sz w:val="20"/>
+          <w:szCs w:val="20"/>
+        </w:rPr>
+        <w:t xml:space="preserve">Second, reference groups differed across sources—66 of the 85 representatives used an NHW comparator and 19 an unstratified White reference—so each comparator was recorded as its source defined it and a sensitivity analysis was restricted to NHW-comparator estimates; the unstratified-White cells, 16 of them receptor-defined subtypes, can shift a ratio slightly.</w:t>
+      </w:r>
+    </w:p>
+    <w:p>
+      <w:pPr>
+        <w:spacing w:after="120" w:line="276"/>
+      </w:pPr>
+      <w:r>
+        <w:rPr>
+          <w:rFonts w:ascii="Malgun Gothic" w:cs="Malgun Gothic" w:eastAsia="Malgun Gothic" w:hAnsi="Malgun Gothic"/>
+          <w:b w:val="false"/>
+          <w:bCs w:val="false"/>
+          <w:color w:val="000000"/>
+          <w:sz w:val="20"/>
+          <w:szCs w:val="20"/>
+        </w:rPr>
+        <w:t xml:space="preserve">*사유: Give the number of unstratified-White cells instead of calling them a minority*</w:t>
       </w:r>
     </w:p>
     <w:sectPr>

</xml_diff>

<commit_message>
Reconcile the unstratified-White count inside Supplementary Table 4
The main text reports 19; counting the unstratified-White rows of
Supplementary Table 4 gives 31, because that table lists overlapping
estimates alongside representatives. Nothing in the table said so, so a
reader checking one against the other found a discrepancy and no
explanation. Its comparator note now states the split — 31 rows, 19 of
them the representative for their cell and the count the main text
reports, the other 12 overlaps carried only there — with the figures
counted from the rows so they cannot drift.

Co-Authored-By: Claude Opus 5 <noreply@anthropic.com>
Claude-Session: https://claude.ai/code/session_01CuLT4FKRBtsU22Vwfjj2qn
</commit_message>
<xml_diff>
--- a/meta_agents/search_v2/outputs/Changes_for_review.docx
+++ b/meta_agents/search_v2/outputs/Changes_for_review.docx
@@ -69,7 +69,7 @@
           <w:sz w:val="20"/>
           <w:szCs w:val="20"/>
         </w:rPr>
-        <w:t xml:space="preserve">범위: `42fa0b5` … `HEAD` (35개 문단)</w:t>
+        <w:t xml:space="preserve">범위: `42fa0b5` … `HEAD` (38개 문단)</w:t>
       </w:r>
     </w:p>
     <w:p>
@@ -1924,6 +1924,202 @@
     </w:p>
     <w:p>
       <w:pPr>
+        <w:spacing w:after="120" w:line="276"/>
+      </w:pPr>
+      <w:r>
+        <w:rPr>
+          <w:rFonts w:ascii="Malgun Gothic" w:cs="Malgun Gothic" w:eastAsia="Malgun Gothic" w:hAnsi="Malgun Gothic"/>
+          <w:b w:val="false"/>
+          <w:bCs w:val="false"/>
+          <w:color w:val="000000"/>
+          <w:sz w:val="20"/>
+          <w:szCs w:val="20"/>
+        </w:rPr>
+        <w:t xml:space="preserve">### 11. Selection of a representative population-based estimate — 수정</w:t>
+      </w:r>
+    </w:p>
+    <w:p>
+      <w:pPr>
+        <w:spacing w:after="120" w:line="276"/>
+      </w:pPr>
+      <w:r>
+        <w:rPr>
+          <w:rFonts w:ascii="Malgun Gothic" w:cs="Malgun Gothic" w:eastAsia="Malgun Gothic" w:hAnsi="Malgun Gothic"/>
+          <w:b/>
+          <w:bCs/>
+          <w:color w:val="000000"/>
+          <w:sz w:val="20"/>
+          <w:szCs w:val="20"/>
+        </w:rPr>
+        <w:t xml:space="preserve">찾기:</w:t>
+      </w:r>
+      <w:r>
+        <w:rPr>
+          <w:rFonts w:ascii="Malgun Gothic" w:cs="Malgun Gothic" w:eastAsia="Malgun Gothic" w:hAnsi="Malgun Gothic"/>
+          <w:b w:val="false"/>
+          <w:bCs w:val="false"/>
+          <w:color w:val="000000"/>
+          <w:sz w:val="20"/>
+          <w:szCs w:val="20"/>
+        </w:rPr>
+        <w:t xml:space="preserve"> `Where a cell had no NHW-comparator source—18 cells, being 16 of the…`</w:t>
+      </w:r>
+    </w:p>
+    <w:p>
+      <w:pPr>
+        <w:spacing w:after="120" w:line="276"/>
+      </w:pPr>
+      <w:r>
+        <w:rPr>
+          <w:rFonts w:ascii="Malgun Gothic" w:cs="Malgun Gothic" w:eastAsia="Malgun Gothic" w:hAnsi="Malgun Gothic"/>
+          <w:b/>
+          <w:bCs/>
+          <w:color w:val="000000"/>
+          <w:sz w:val="20"/>
+          <w:szCs w:val="20"/>
+        </w:rPr>
+        <w:t xml:space="preserve">변경 전</w:t>
+      </w:r>
+    </w:p>
+    <w:p>
+      <w:pPr>
+        <w:pStyle w:val="ListParagraph"/>
+        <w:numPr>
+          <w:ilvl w:val="0"/>
+          <w:numId w:val="1"/>
+        </w:numPr>
+        <w:spacing w:after="80" w:line="276"/>
+      </w:pPr>
+      <w:r>
+        <w:rPr>
+          <w:rFonts w:ascii="Malgun Gothic" w:cs="Malgun Gothic" w:eastAsia="Malgun Gothic" w:hAnsi="Malgun Gothic"/>
+          <w:b w:val="false"/>
+          <w:bCs w:val="false"/>
+          <w:color w:val="000000"/>
+          <w:sz w:val="20"/>
+          <w:szCs w:val="20"/>
+        </w:rPr>
+        <w:t xml:space="preserve">Where a cell had no NHW-comparator source—18 cells, being 16 of the 36 receptor-defined subtype cells and the two Black cells above and below age 40—the estimate using an unstratified White comparator was kept as the representative and marked †.</w:t>
+      </w:r>
+    </w:p>
+    <w:p>
+      <w:pPr>
+        <w:pStyle w:val="ListParagraph"/>
+        <w:numPr>
+          <w:ilvl w:val="0"/>
+          <w:numId w:val="1"/>
+        </w:numPr>
+        <w:spacing w:after="80" w:line="276"/>
+      </w:pPr>
+      <w:r>
+        <w:rPr>
+          <w:rFonts w:ascii="Malgun Gothic" w:cs="Malgun Gothic" w:eastAsia="Malgun Gothic" w:hAnsi="Malgun Gothic"/>
+          <w:b w:val="false"/>
+          <w:bCs w:val="false"/>
+          <w:color w:val="000000"/>
+          <w:sz w:val="20"/>
+          <w:szCs w:val="20"/>
+        </w:rPr>
+        <w:t xml:space="preserve">One further cell, Alaska Native, is marked † although an NHW-comparator source exists for it, the broader-coverage rule above having selected the registry that reports against an unstratified White reference; 19 of the 85 representatives carry the mark in all.</w:t>
+      </w:r>
+    </w:p>
+    <w:p>
+      <w:pPr>
+        <w:spacing w:after="120" w:line="276"/>
+      </w:pPr>
+      <w:r>
+        <w:rPr>
+          <w:rFonts w:ascii="Malgun Gothic" w:cs="Malgun Gothic" w:eastAsia="Malgun Gothic" w:hAnsi="Malgun Gothic"/>
+          <w:b/>
+          <w:bCs/>
+          <w:color w:val="000000"/>
+          <w:sz w:val="20"/>
+          <w:szCs w:val="20"/>
+        </w:rPr>
+        <w:t xml:space="preserve">변경 후</w:t>
+      </w:r>
+    </w:p>
+    <w:p>
+      <w:pPr>
+        <w:pStyle w:val="ListParagraph"/>
+        <w:numPr>
+          <w:ilvl w:val="0"/>
+          <w:numId w:val="1"/>
+        </w:numPr>
+        <w:spacing w:after="80" w:line="276"/>
+      </w:pPr>
+      <w:r>
+        <w:rPr>
+          <w:rFonts w:ascii="Malgun Gothic" w:cs="Malgun Gothic" w:eastAsia="Malgun Gothic" w:hAnsi="Malgun Gothic"/>
+          <w:b w:val="false"/>
+          <w:bCs w:val="false"/>
+          <w:color w:val="000000"/>
+          <w:sz w:val="20"/>
+          <w:szCs w:val="20"/>
+        </w:rPr>
+        <w:t xml:space="preserve">Where a cell had no NHW-comparator source—18 cells, being 16 of the 36 receptor-defined subtype cells and the two Black cells above and below age 40—the estimate using an unstratified White comparator was kept as the representative.</w:t>
+      </w:r>
+    </w:p>
+    <w:p>
+      <w:pPr>
+        <w:pStyle w:val="ListParagraph"/>
+        <w:numPr>
+          <w:ilvl w:val="0"/>
+          <w:numId w:val="1"/>
+        </w:numPr>
+        <w:spacing w:after="80" w:line="276"/>
+      </w:pPr>
+      <w:r>
+        <w:rPr>
+          <w:rFonts w:ascii="Malgun Gothic" w:cs="Malgun Gothic" w:eastAsia="Malgun Gothic" w:hAnsi="Malgun Gothic"/>
+          <w:b w:val="false"/>
+          <w:bCs w:val="false"/>
+          <w:color w:val="000000"/>
+          <w:sz w:val="20"/>
+          <w:szCs w:val="20"/>
+        </w:rPr>
+        <w:t xml:space="preserve">One further cell, Alaska Native, also rests on one although an NHW-comparator source exists for it, the broader-coverage rule above having selected the registry that reports against an unstratified White reference, so 19 of the 85 representatives use an unstratified White reference in all.</w:t>
+      </w:r>
+    </w:p>
+    <w:p>
+      <w:pPr>
+        <w:pStyle w:val="ListParagraph"/>
+        <w:numPr>
+          <w:ilvl w:val="0"/>
+          <w:numId w:val="1"/>
+        </w:numPr>
+        <w:spacing w:after="80" w:line="276"/>
+      </w:pPr>
+      <w:r>
+        <w:rPr>
+          <w:rFonts w:ascii="Malgun Gothic" w:cs="Malgun Gothic" w:eastAsia="Malgun Gothic" w:hAnsi="Malgun Gothic"/>
+          <w:b w:val="false"/>
+          <w:bCs w:val="false"/>
+          <w:color w:val="000000"/>
+          <w:sz w:val="20"/>
+          <w:szCs w:val="20"/>
+        </w:rPr>
+        <w:t xml:space="preserve">Each estimate's comparator is named in Supplementary Table 4; where such a cell appears in the main text it is marked †.</w:t>
+      </w:r>
+    </w:p>
+    <w:p>
+      <w:pPr>
+        <w:spacing w:after="120" w:line="276"/>
+      </w:pPr>
+      <w:r>
+        <w:rPr>
+          <w:rFonts w:ascii="Malgun Gothic" w:cs="Malgun Gothic" w:eastAsia="Malgun Gothic" w:hAnsi="Malgun Gothic"/>
+          <w:b w:val="false"/>
+          <w:bCs w:val="false"/>
+          <w:color w:val="000000"/>
+          <w:sz w:val="20"/>
+          <w:szCs w:val="20"/>
+        </w:rPr>
+        <w:t xml:space="preserve">*사유: Stop pointing at daggers in Supplementary Table 4, which has none*</w:t>
+      </w:r>
+    </w:p>
+    <w:p>
+      <w:pPr>
         <w:spacing w:after="120" w:before="260"/>
       </w:pPr>
       <w:r>
@@ -3242,6 +3438,139 @@
     </w:p>
     <w:p>
       <w:pPr>
+        <w:spacing w:after="120" w:line="276"/>
+      </w:pPr>
+      <w:r>
+        <w:rPr>
+          <w:rFonts w:ascii="Malgun Gothic" w:cs="Malgun Gothic" w:eastAsia="Malgun Gothic" w:hAnsi="Malgun Gothic"/>
+          <w:b w:val="false"/>
+          <w:bCs w:val="false"/>
+          <w:color w:val="000000"/>
+          <w:sz w:val="20"/>
+          <w:szCs w:val="20"/>
+        </w:rPr>
+        <w:t xml:space="preserve">### 10. Selection and characteristics of included studies — 수정</w:t>
+      </w:r>
+    </w:p>
+    <w:p>
+      <w:pPr>
+        <w:spacing w:after="120" w:line="276"/>
+      </w:pPr>
+      <w:r>
+        <w:rPr>
+          <w:rFonts w:ascii="Malgun Gothic" w:cs="Malgun Gothic" w:eastAsia="Malgun Gothic" w:hAnsi="Malgun Gothic"/>
+          <w:b/>
+          <w:bCs/>
+          <w:color w:val="000000"/>
+          <w:sz w:val="20"/>
+          <w:szCs w:val="20"/>
+        </w:rPr>
+        <w:t xml:space="preserve">찾기:</w:t>
+      </w:r>
+      <w:r>
+        <w:rPr>
+          <w:rFonts w:ascii="Malgun Gothic" w:cs="Malgun Gothic" w:eastAsia="Malgun Gothic" w:hAnsi="Malgun Gothic"/>
+          <w:b w:val="false"/>
+          <w:bCs w:val="false"/>
+          <w:color w:val="000000"/>
+          <w:sz w:val="20"/>
+          <w:szCs w:val="20"/>
+        </w:rPr>
+        <w:t xml:space="preserve"> `The reference group was NHW for 66 of the 85 representatives and…`</w:t>
+      </w:r>
+    </w:p>
+    <w:p>
+      <w:pPr>
+        <w:spacing w:after="120" w:line="276"/>
+      </w:pPr>
+      <w:r>
+        <w:rPr>
+          <w:rFonts w:ascii="Malgun Gothic" w:cs="Malgun Gothic" w:eastAsia="Malgun Gothic" w:hAnsi="Malgun Gothic"/>
+          <w:b/>
+          <w:bCs/>
+          <w:color w:val="000000"/>
+          <w:sz w:val="20"/>
+          <w:szCs w:val="20"/>
+        </w:rPr>
+        <w:t xml:space="preserve">변경 전</w:t>
+      </w:r>
+    </w:p>
+    <w:p>
+      <w:pPr>
+        <w:pStyle w:val="ListParagraph"/>
+        <w:numPr>
+          <w:ilvl w:val="0"/>
+          <w:numId w:val="1"/>
+        </w:numPr>
+        <w:spacing w:after="80" w:line="276"/>
+      </w:pPr>
+      <w:r>
+        <w:rPr>
+          <w:rFonts w:ascii="Malgun Gothic" w:cs="Malgun Gothic" w:eastAsia="Malgun Gothic" w:hAnsi="Malgun Gothic"/>
+          <w:b w:val="false"/>
+          <w:bCs w:val="false"/>
+          <w:color w:val="000000"/>
+          <w:sz w:val="20"/>
+          <w:szCs w:val="20"/>
+        </w:rPr>
+        <w:t xml:space="preserve">The reference group was NHW for 66 of the 85 representatives and an unstratified White group for the other 19, marked † wherever they appear—five of them in Table 1 and the other 14 in Supplementary Table 4.</w:t>
+      </w:r>
+    </w:p>
+    <w:p>
+      <w:pPr>
+        <w:spacing w:after="120" w:line="276"/>
+      </w:pPr>
+      <w:r>
+        <w:rPr>
+          <w:rFonts w:ascii="Malgun Gothic" w:cs="Malgun Gothic" w:eastAsia="Malgun Gothic" w:hAnsi="Malgun Gothic"/>
+          <w:b/>
+          <w:bCs/>
+          <w:color w:val="000000"/>
+          <w:sz w:val="20"/>
+          <w:szCs w:val="20"/>
+        </w:rPr>
+        <w:t xml:space="preserve">변경 후</w:t>
+      </w:r>
+    </w:p>
+    <w:p>
+      <w:pPr>
+        <w:pStyle w:val="ListParagraph"/>
+        <w:numPr>
+          <w:ilvl w:val="0"/>
+          <w:numId w:val="1"/>
+        </w:numPr>
+        <w:spacing w:after="80" w:line="276"/>
+      </w:pPr>
+      <w:r>
+        <w:rPr>
+          <w:rFonts w:ascii="Malgun Gothic" w:cs="Malgun Gothic" w:eastAsia="Malgun Gothic" w:hAnsi="Malgun Gothic"/>
+          <w:b w:val="false"/>
+          <w:bCs w:val="false"/>
+          <w:color w:val="000000"/>
+          <w:sz w:val="20"/>
+          <w:szCs w:val="20"/>
+        </w:rPr>
+        <w:t xml:space="preserve">The reference group was NHW for 66 of the 85 representatives and an unstratified White group for the other 19; five of those are among the cells shown in Table 1, where they carry a †, and Supplementary Table 4 names the comparator of every extracted estimate in a column rather than by mark.</w:t>
+      </w:r>
+    </w:p>
+    <w:p>
+      <w:pPr>
+        <w:spacing w:after="120" w:line="276"/>
+      </w:pPr>
+      <w:r>
+        <w:rPr>
+          <w:rFonts w:ascii="Malgun Gothic" w:cs="Malgun Gothic" w:eastAsia="Malgun Gothic" w:hAnsi="Malgun Gothic"/>
+          <w:b w:val="false"/>
+          <w:bCs w:val="false"/>
+          <w:color w:val="000000"/>
+          <w:sz w:val="20"/>
+          <w:szCs w:val="20"/>
+        </w:rPr>
+        <w:t xml:space="preserve">*사유: Stop pointing at daggers in Supplementary Table 4, which has none*</w:t>
+      </w:r>
+    </w:p>
+    <w:p>
+      <w:pPr>
         <w:spacing w:after="120" w:before="260"/>
       </w:pPr>
       <w:r>
@@ -5366,6 +5695,139 @@
           <w:szCs w:val="20"/>
         </w:rPr>
         <w:t xml:space="preserve">*사유: Give the number of unstratified-White cells instead of calling them a minority*</w:t>
+      </w:r>
+    </w:p>
+    <w:p>
+      <w:pPr>
+        <w:spacing w:after="120" w:line="276"/>
+      </w:pPr>
+      <w:r>
+        <w:rPr>
+          <w:rFonts w:ascii="Malgun Gothic" w:cs="Malgun Gothic" w:eastAsia="Malgun Gothic" w:hAnsi="Malgun Gothic"/>
+          <w:b w:val="false"/>
+          <w:bCs w:val="false"/>
+          <w:color w:val="000000"/>
+          <w:sz w:val="20"/>
+          <w:szCs w:val="20"/>
+        </w:rPr>
+        <w:t xml:space="preserve">### 14. Discussion — 수정</w:t>
+      </w:r>
+    </w:p>
+    <w:p>
+      <w:pPr>
+        <w:spacing w:after="120" w:line="276"/>
+      </w:pPr>
+      <w:r>
+        <w:rPr>
+          <w:rFonts w:ascii="Malgun Gothic" w:cs="Malgun Gothic" w:eastAsia="Malgun Gothic" w:hAnsi="Malgun Gothic"/>
+          <w:b/>
+          <w:bCs/>
+          <w:color w:val="000000"/>
+          <w:sz w:val="20"/>
+          <w:szCs w:val="20"/>
+        </w:rPr>
+        <w:t xml:space="preserve">찾기:</w:t>
+      </w:r>
+      <w:r>
+        <w:rPr>
+          <w:rFonts w:ascii="Malgun Gothic" w:cs="Malgun Gothic" w:eastAsia="Malgun Gothic" w:hAnsi="Malgun Gothic"/>
+          <w:b w:val="false"/>
+          <w:bCs w:val="false"/>
+          <w:color w:val="000000"/>
+          <w:sz w:val="20"/>
+          <w:szCs w:val="20"/>
+        </w:rPr>
+        <w:t xml:space="preserve"> `Because studies differed in diagnosis period and region, these estimates are best…`</w:t>
+      </w:r>
+    </w:p>
+    <w:p>
+      <w:pPr>
+        <w:spacing w:after="120" w:line="276"/>
+      </w:pPr>
+      <w:r>
+        <w:rPr>
+          <w:rFonts w:ascii="Malgun Gothic" w:cs="Malgun Gothic" w:eastAsia="Malgun Gothic" w:hAnsi="Malgun Gothic"/>
+          <w:b/>
+          <w:bCs/>
+          <w:color w:val="000000"/>
+          <w:sz w:val="20"/>
+          <w:szCs w:val="20"/>
+        </w:rPr>
+        <w:t xml:space="preserve">변경 전</w:t>
+      </w:r>
+    </w:p>
+    <w:p>
+      <w:pPr>
+        <w:pStyle w:val="ListParagraph"/>
+        <w:numPr>
+          <w:ilvl w:val="0"/>
+          <w:numId w:val="1"/>
+        </w:numPr>
+        <w:spacing w:after="80" w:line="276"/>
+      </w:pPr>
+      <w:r>
+        <w:rPr>
+          <w:rFonts w:ascii="Malgun Gothic" w:cs="Malgun Gothic" w:eastAsia="Malgun Gothic" w:hAnsi="Malgun Gothic"/>
+          <w:b w:val="false"/>
+          <w:bCs w:val="false"/>
+          <w:color w:val="000000"/>
+          <w:sz w:val="20"/>
+          <w:szCs w:val="20"/>
+        </w:rPr>
+        <w:t xml:space="preserve">Because studies differed in diagnosis period and region, these estimates are best read as a comparable-scale summary of the available evidence, with the provenance and comparator of each (computed CI ‡; unstratified White †) marked so readers can weigh them.</w:t>
+      </w:r>
+    </w:p>
+    <w:p>
+      <w:pPr>
+        <w:spacing w:after="120" w:line="276"/>
+      </w:pPr>
+      <w:r>
+        <w:rPr>
+          <w:rFonts w:ascii="Malgun Gothic" w:cs="Malgun Gothic" w:eastAsia="Malgun Gothic" w:hAnsi="Malgun Gothic"/>
+          <w:b/>
+          <w:bCs/>
+          <w:color w:val="000000"/>
+          <w:sz w:val="20"/>
+          <w:szCs w:val="20"/>
+        </w:rPr>
+        <w:t xml:space="preserve">변경 후</w:t>
+      </w:r>
+    </w:p>
+    <w:p>
+      <w:pPr>
+        <w:pStyle w:val="ListParagraph"/>
+        <w:numPr>
+          <w:ilvl w:val="0"/>
+          <w:numId w:val="1"/>
+        </w:numPr>
+        <w:spacing w:after="80" w:line="276"/>
+      </w:pPr>
+      <w:r>
+        <w:rPr>
+          <w:rFonts w:ascii="Malgun Gothic" w:cs="Malgun Gothic" w:eastAsia="Malgun Gothic" w:hAnsi="Malgun Gothic"/>
+          <w:b w:val="false"/>
+          <w:bCs w:val="false"/>
+          <w:color w:val="000000"/>
+          <w:sz w:val="20"/>
+          <w:szCs w:val="20"/>
+        </w:rPr>
+        <w:t xml:space="preserve">Because studies differed in diagnosis period and region, these estimates are best read as a comparable-scale summary of the available evidence, with the provenance and comparator of each recorded—marked in the main-text table and figures (computed CI ‡; unstratified White †) and named in full in Supplementary Table 4—so readers can weigh them.</w:t>
+      </w:r>
+    </w:p>
+    <w:p>
+      <w:pPr>
+        <w:spacing w:after="120" w:line="276"/>
+      </w:pPr>
+      <w:r>
+        <w:rPr>
+          <w:rFonts w:ascii="Malgun Gothic" w:cs="Malgun Gothic" w:eastAsia="Malgun Gothic" w:hAnsi="Malgun Gothic"/>
+          <w:b w:val="false"/>
+          <w:bCs w:val="false"/>
+          <w:color w:val="000000"/>
+          <w:sz w:val="20"/>
+          <w:szCs w:val="20"/>
+        </w:rPr>
+        <w:t xml:space="preserve">*사유: Stop pointing at daggers in Supplementary Table 4, which has none*</w:t>
       </w:r>
     </w:p>
     <w:sectPr>

</xml_diff>

<commit_message>
Name what two pronouns in Methods refer to
Sweeping for the ambiguity that "two such cases" had — a number or
pronoun whose unit the reader has to supply — found two more, both
written in this round.

"One further cell, Alaska Native, also rests on one" leaves "one"
pointing back two lines to "an unstratified White comparator", and reads
at first as a count. It now names the comparator.

"the author adjudicated both sets" never says which two sets; the
sentence before it describes include and exclude proposals, so it now
says the author reviewed the proposals of each kind.

The remaining number-plus-noun phrases name their unit — four sensitivity
analyses, two synthesis streams, two independent reviewers — and are left
alone.

Co-Authored-By: Claude Opus 5 <noreply@anthropic.com>
Claude-Session: https://claude.ai/code/session_01CuLT4FKRBtsU22Vwfjj2qn
</commit_message>
<xml_diff>
--- a/meta_agents/search_v2/outputs/Changes_for_review.docx
+++ b/meta_agents/search_v2/outputs/Changes_for_review.docx
@@ -69,7 +69,7 @@
           <w:sz w:val="20"/>
           <w:szCs w:val="20"/>
         </w:rPr>
-        <w:t xml:space="preserve">범위: `42fa0b5` … `HEAD` (42개 문단)</w:t>
+        <w:t xml:space="preserve">범위: `42fa0b5` … `HEAD` (44개 문단)</w:t>
       </w:r>
     </w:p>
     <w:p>
@@ -2445,6 +2445,393 @@
           <w:szCs w:val="20"/>
         </w:rPr>
         <w:t xml:space="preserve">*사유: Drop Table 1's Effect column, and fix what Methods says about SIRs*</w:t>
+      </w:r>
+    </w:p>
+    <w:p>
+      <w:pPr>
+        <w:spacing w:after="120" w:line="276"/>
+      </w:pPr>
+      <w:r>
+        <w:rPr>
+          <w:rFonts w:ascii="Malgun Gothic" w:cs="Malgun Gothic" w:eastAsia="Malgun Gothic" w:hAnsi="Malgun Gothic"/>
+          <w:b w:val="false"/>
+          <w:bCs w:val="false"/>
+          <w:color w:val="000000"/>
+          <w:sz w:val="20"/>
+          <w:szCs w:val="20"/>
+        </w:rPr>
+        <w:t xml:space="preserve">### 14. Eligibility criteria — 수정</w:t>
+      </w:r>
+    </w:p>
+    <w:p>
+      <w:pPr>
+        <w:spacing w:after="120" w:line="276"/>
+      </w:pPr>
+      <w:r>
+        <w:rPr>
+          <w:rFonts w:ascii="Malgun Gothic" w:cs="Malgun Gothic" w:eastAsia="Malgun Gothic" w:hAnsi="Malgun Gothic"/>
+          <w:b/>
+          <w:bCs/>
+          <w:color w:val="000000"/>
+          <w:sz w:val="20"/>
+          <w:szCs w:val="20"/>
+        </w:rPr>
+        <w:t xml:space="preserve">찾기:</w:t>
+      </w:r>
+      <w:r>
+        <w:rPr>
+          <w:rFonts w:ascii="Malgun Gothic" w:cs="Malgun Gothic" w:eastAsia="Malgun Gothic" w:hAnsi="Malgun Gothic"/>
+          <w:b w:val="false"/>
+          <w:bCs w:val="false"/>
+          <w:color w:val="000000"/>
+          <w:sz w:val="20"/>
+          <w:szCs w:val="20"/>
+        </w:rPr>
+        <w:t xml:space="preserve"> `A publication that re-reported an estimate already captured from the same registry,…`</w:t>
+      </w:r>
+    </w:p>
+    <w:p>
+      <w:pPr>
+        <w:spacing w:after="120" w:line="276"/>
+      </w:pPr>
+      <w:r>
+        <w:rPr>
+          <w:rFonts w:ascii="Malgun Gothic" w:cs="Malgun Gothic" w:eastAsia="Malgun Gothic" w:hAnsi="Malgun Gothic"/>
+          <w:b/>
+          <w:bCs/>
+          <w:color w:val="000000"/>
+          <w:sz w:val="20"/>
+          <w:szCs w:val="20"/>
+        </w:rPr>
+        <w:t xml:space="preserve">변경 전</w:t>
+      </w:r>
+    </w:p>
+    <w:p>
+      <w:pPr>
+        <w:pStyle w:val="ListParagraph"/>
+        <w:numPr>
+          <w:ilvl w:val="0"/>
+          <w:numId w:val="1"/>
+        </w:numPr>
+        <w:spacing w:after="80" w:line="276"/>
+      </w:pPr>
+      <w:r>
+        <w:rPr>
+          <w:rFonts w:ascii="Malgun Gothic" w:cs="Malgun Gothic" w:eastAsia="Malgun Gothic" w:hAnsi="Malgun Gothic"/>
+          <w:b w:val="false"/>
+          <w:bCs w:val="false"/>
+          <w:color w:val="000000"/>
+          <w:sz w:val="20"/>
+          <w:szCs w:val="20"/>
+        </w:rPr>
+        <w:t xml:space="preserve">A publication that re-reported an estimate already captured from the same registry, diagnosis period, and population was not an independent estimate, so it was never a candidate representative.</w:t>
+      </w:r>
+    </w:p>
+    <w:p>
+      <w:pPr>
+        <w:pStyle w:val="ListParagraph"/>
+        <w:numPr>
+          <w:ilvl w:val="0"/>
+          <w:numId w:val="1"/>
+        </w:numPr>
+        <w:spacing w:after="80" w:line="276"/>
+      </w:pPr>
+      <w:r>
+        <w:rPr>
+          <w:rFonts w:ascii="Malgun Gothic" w:cs="Malgun Gothic" w:eastAsia="Malgun Gothic" w:hAnsi="Malgun Gothic"/>
+          <w:b w:val="false"/>
+          <w:bCs w:val="false"/>
+          <w:color w:val="000000"/>
+          <w:sz w:val="20"/>
+          <w:szCs w:val="20"/>
+        </w:rPr>
+        <w:t xml:space="preserve">Two such cases were distinguished by whether another included publication already carries the same content.</w:t>
+      </w:r>
+    </w:p>
+    <w:p>
+      <w:pPr>
+        <w:pStyle w:val="ListParagraph"/>
+        <w:numPr>
+          <w:ilvl w:val="0"/>
+          <w:numId w:val="1"/>
+        </w:numPr>
+        <w:spacing w:after="80" w:line="276"/>
+      </w:pPr>
+      <w:r>
+        <w:rPr>
+          <w:rFonts w:ascii="Malgun Gothic" w:cs="Malgun Gothic" w:eastAsia="Malgun Gothic" w:hAnsi="Malgun Gothic"/>
+          <w:b w:val="false"/>
+          <w:bCs w:val="false"/>
+          <w:color w:val="000000"/>
+          <w:sz w:val="20"/>
+          <w:szCs w:val="20"/>
+        </w:rPr>
+        <w:t xml:space="preserve">A report whose content is carried by an included publication adds nothing to the review and was excluded as a duplicate dataset: this covers the earlier editions of a recurring statistics series and the preprint or book-chapter version of an included analysis (55 reports, 51 of them earlier editions of the annual cancer-statistics reports or the Annual Report to the Nation).</w:t>
+      </w:r>
+    </w:p>
+    <w:p>
+      <w:pPr>
+        <w:pStyle w:val="ListParagraph"/>
+        <w:numPr>
+          <w:ilvl w:val="0"/>
+          <w:numId w:val="1"/>
+        </w:numPr>
+        <w:spacing w:after="80" w:line="276"/>
+      </w:pPr>
+      <w:r>
+        <w:rPr>
+          <w:rFonts w:ascii="Malgun Gothic" w:cs="Malgun Gothic" w:eastAsia="Malgun Gothic" w:hAnsi="Malgun Gothic"/>
+          <w:b w:val="false"/>
+          <w:bCs w:val="false"/>
+          <w:color w:val="000000"/>
+          <w:sz w:val="20"/>
+          <w:szCs w:val="20"/>
+        </w:rPr>
+        <w:t xml:space="preserve">The most recent eligible edition of such a series is the only edition carrying that series' current account, so it was retained in the review; because the registry incidence it reports is already provided by the dedicated primary study for that registry and period, it contributes only to the narrative synthesis.</w:t>
+      </w:r>
+    </w:p>
+    <w:p>
+      <w:pPr>
+        <w:pStyle w:val="ListParagraph"/>
+        <w:numPr>
+          <w:ilvl w:val="0"/>
+          <w:numId w:val="1"/>
+        </w:numPr>
+        <w:spacing w:after="80" w:line="276"/>
+      </w:pPr>
+      <w:r>
+        <w:rPr>
+          <w:rFonts w:ascii="Malgun Gothic" w:cs="Malgun Gothic" w:eastAsia="Malgun Gothic" w:hAnsi="Malgun Gothic"/>
+          <w:b w:val="false"/>
+          <w:bCs w:val="false"/>
+          <w:color w:val="000000"/>
+          <w:sz w:val="20"/>
+          <w:szCs w:val="20"/>
+        </w:rPr>
+        <w:t xml:space="preserve">Separately, a publication drawing on the same registry family but a different period, region, or subset provided a distinct estimate and was retained as an overlapping estimate for the sensitivity analysis, not excluded; overlap handling is described under Selection of a representative population-based estimate.</w:t>
+      </w:r>
+    </w:p>
+    <w:p>
+      <w:pPr>
+        <w:spacing w:after="120" w:line="276"/>
+      </w:pPr>
+      <w:r>
+        <w:rPr>
+          <w:rFonts w:ascii="Malgun Gothic" w:cs="Malgun Gothic" w:eastAsia="Malgun Gothic" w:hAnsi="Malgun Gothic"/>
+          <w:b/>
+          <w:bCs/>
+          <w:color w:val="000000"/>
+          <w:sz w:val="20"/>
+          <w:szCs w:val="20"/>
+        </w:rPr>
+        <w:t xml:space="preserve">변경 후</w:t>
+      </w:r>
+    </w:p>
+    <w:p>
+      <w:pPr>
+        <w:pStyle w:val="ListParagraph"/>
+        <w:numPr>
+          <w:ilvl w:val="0"/>
+          <w:numId w:val="1"/>
+        </w:numPr>
+        <w:spacing w:after="80" w:line="276"/>
+      </w:pPr>
+      <w:r>
+        <w:rPr>
+          <w:rFonts w:ascii="Malgun Gothic" w:cs="Malgun Gothic" w:eastAsia="Malgun Gothic" w:hAnsi="Malgun Gothic"/>
+          <w:b w:val="false"/>
+          <w:bCs w:val="false"/>
+          <w:color w:val="000000"/>
+          <w:sz w:val="20"/>
+          <w:szCs w:val="20"/>
+        </w:rPr>
+        <w:t xml:space="preserve">A publication that re-reported an estimate already captured from the same registry, diagnosis period, and population was not an independent estimate, so it was never taken as a representative.</w:t>
+      </w:r>
+    </w:p>
+    <w:p>
+      <w:pPr>
+        <w:pStyle w:val="ListParagraph"/>
+        <w:numPr>
+          <w:ilvl w:val="0"/>
+          <w:numId w:val="1"/>
+        </w:numPr>
+        <w:spacing w:after="80" w:line="276"/>
+      </w:pPr>
+      <w:r>
+        <w:rPr>
+          <w:rFonts w:ascii="Malgun Gothic" w:cs="Malgun Gothic" w:eastAsia="Malgun Gothic" w:hAnsi="Malgun Gothic"/>
+          <w:b w:val="false"/>
+          <w:bCs w:val="false"/>
+          <w:color w:val="000000"/>
+          <w:sz w:val="20"/>
+          <w:szCs w:val="20"/>
+        </w:rPr>
+        <w:t xml:space="preserve">What then became of it depended on whether another included publication already carried the same content.</w:t>
+      </w:r>
+    </w:p>
+    <w:p>
+      <w:pPr>
+        <w:pStyle w:val="ListParagraph"/>
+        <w:numPr>
+          <w:ilvl w:val="0"/>
+          <w:numId w:val="1"/>
+        </w:numPr>
+        <w:spacing w:after="80" w:line="276"/>
+      </w:pPr>
+      <w:r>
+        <w:rPr>
+          <w:rFonts w:ascii="Malgun Gothic" w:cs="Malgun Gothic" w:eastAsia="Malgun Gothic" w:hAnsi="Malgun Gothic"/>
+          <w:b w:val="false"/>
+          <w:bCs w:val="false"/>
+          <w:color w:val="000000"/>
+          <w:sz w:val="20"/>
+          <w:szCs w:val="20"/>
+        </w:rPr>
+        <w:t xml:space="preserve">Where one did, the re-report added nothing and was excluded as a duplicate dataset: 55 reports, of which 51 were earlier editions of the annual cancer-statistics reports or of the Annual Report to the Nation, two were preprint versions of an included analysis, and two were book chapters.</w:t>
+      </w:r>
+    </w:p>
+    <w:p>
+      <w:pPr>
+        <w:pStyle w:val="ListParagraph"/>
+        <w:numPr>
+          <w:ilvl w:val="0"/>
+          <w:numId w:val="1"/>
+        </w:numPr>
+        <w:spacing w:after="80" w:line="276"/>
+      </w:pPr>
+      <w:r>
+        <w:rPr>
+          <w:rFonts w:ascii="Malgun Gothic" w:cs="Malgun Gothic" w:eastAsia="Malgun Gothic" w:hAnsi="Malgun Gothic"/>
+          <w:b w:val="false"/>
+          <w:bCs w:val="false"/>
+          <w:color w:val="000000"/>
+          <w:sz w:val="20"/>
+          <w:szCs w:val="20"/>
+        </w:rPr>
+        <w:t xml:space="preserve">Where none did, the report was kept.</w:t>
+      </w:r>
+    </w:p>
+    <w:p>
+      <w:pPr>
+        <w:pStyle w:val="ListParagraph"/>
+        <w:numPr>
+          <w:ilvl w:val="0"/>
+          <w:numId w:val="1"/>
+        </w:numPr>
+        <w:spacing w:after="80" w:line="276"/>
+      </w:pPr>
+      <w:r>
+        <w:rPr>
+          <w:rFonts w:ascii="Malgun Gothic" w:cs="Malgun Gothic" w:eastAsia="Malgun Gothic" w:hAnsi="Malgun Gothic"/>
+          <w:b w:val="false"/>
+          <w:bCs w:val="false"/>
+          <w:color w:val="000000"/>
+          <w:sz w:val="20"/>
+          <w:szCs w:val="20"/>
+        </w:rPr>
+        <w:t xml:space="preserve">This applied to the most recent eligible edition of a recurring series, which is the only edition carrying that series' current account; since the registry incidence it reports already came from the dedicated primary study for that registry and period, it contributed to the narrative synthesis alone.</w:t>
+      </w:r>
+    </w:p>
+    <w:p>
+      <w:pPr>
+        <w:spacing w:after="120" w:line="276"/>
+      </w:pPr>
+      <w:r>
+        <w:rPr>
+          <w:rFonts w:ascii="Malgun Gothic" w:cs="Malgun Gothic" w:eastAsia="Malgun Gothic" w:hAnsi="Malgun Gothic"/>
+          <w:b w:val="false"/>
+          <w:bCs w:val="false"/>
+          <w:color w:val="000000"/>
+          <w:sz w:val="20"/>
+          <w:szCs w:val="20"/>
+        </w:rPr>
+        <w:t xml:space="preserve">*사유: Rewrite the duplicate-handling paragraph in eligibility*</w:t>
+      </w:r>
+    </w:p>
+    <w:p>
+      <w:pPr>
+        <w:spacing w:after="120" w:line="276"/>
+      </w:pPr>
+      <w:r>
+        <w:rPr>
+          <w:rFonts w:ascii="Malgun Gothic" w:cs="Malgun Gothic" w:eastAsia="Malgun Gothic" w:hAnsi="Malgun Gothic"/>
+          <w:b w:val="false"/>
+          <w:bCs w:val="false"/>
+          <w:color w:val="000000"/>
+          <w:sz w:val="20"/>
+          <w:szCs w:val="20"/>
+        </w:rPr>
+        <w:t xml:space="preserve">### 15. Eligibility criteria — 추가</w:t>
+      </w:r>
+    </w:p>
+    <w:p>
+      <w:pPr>
+        <w:spacing w:after="120" w:line="276"/>
+      </w:pPr>
+      <w:r>
+        <w:rPr>
+          <w:rFonts w:ascii="Malgun Gothic" w:cs="Malgun Gothic" w:eastAsia="Malgun Gothic" w:hAnsi="Malgun Gothic"/>
+          <w:b/>
+          <w:bCs/>
+          <w:color w:val="000000"/>
+          <w:sz w:val="20"/>
+          <w:szCs w:val="20"/>
+        </w:rPr>
+        <w:t xml:space="preserve">찾기:</w:t>
+      </w:r>
+      <w:r>
+        <w:rPr>
+          <w:rFonts w:ascii="Malgun Gothic" w:cs="Malgun Gothic" w:eastAsia="Malgun Gothic" w:hAnsi="Malgun Gothic"/>
+          <w:b w:val="false"/>
+          <w:bCs w:val="false"/>
+          <w:color w:val="000000"/>
+          <w:sz w:val="20"/>
+          <w:szCs w:val="20"/>
+        </w:rPr>
+        <w:t xml:space="preserve"> `A publication drawing on the same registry family but a different period,…`</w:t>
+      </w:r>
+    </w:p>
+    <w:p>
+      <w:pPr>
+        <w:spacing w:after="120" w:line="276"/>
+      </w:pPr>
+      <w:r>
+        <w:rPr>
+          <w:rFonts w:ascii="Malgun Gothic" w:cs="Malgun Gothic" w:eastAsia="Malgun Gothic" w:hAnsi="Malgun Gothic"/>
+          <w:b/>
+          <w:bCs/>
+          <w:color w:val="000000"/>
+          <w:sz w:val="20"/>
+          <w:szCs w:val="20"/>
+        </w:rPr>
+        <w:t xml:space="preserve">추가된 문단</w:t>
+      </w:r>
+      <w:r>
+        <w:rPr>
+          <w:rFonts w:ascii="Malgun Gothic" w:cs="Malgun Gothic" w:eastAsia="Malgun Gothic" w:hAnsi="Malgun Gothic"/>
+          <w:b w:val="false"/>
+          <w:bCs w:val="false"/>
+          <w:color w:val="000000"/>
+          <w:sz w:val="20"/>
+          <w:szCs w:val="20"/>
+        </w:rPr>
+        <w:t xml:space="preserve"> A publication drawing on the same registry family but a different period, region, or subset was a different matter. Such a report gave a distinct estimate and was retained as an overlapping one for the sensitivity analysis rather than excluded; its handling is described under Selection of a representative population-based estimate.</w:t>
+      </w:r>
+    </w:p>
+    <w:p>
+      <w:pPr>
+        <w:spacing w:after="120" w:line="276"/>
+      </w:pPr>
+      <w:r>
+        <w:rPr>
+          <w:rFonts w:ascii="Malgun Gothic" w:cs="Malgun Gothic" w:eastAsia="Malgun Gothic" w:hAnsi="Malgun Gothic"/>
+          <w:b w:val="false"/>
+          <w:bCs w:val="false"/>
+          <w:color w:val="000000"/>
+          <w:sz w:val="20"/>
+          <w:szCs w:val="20"/>
+        </w:rPr>
+        <w:t xml:space="preserve">*사유: Rewrite the duplicate-handling paragraph in eligibility*</w:t>
       </w:r>
     </w:p>
     <w:p>

</xml_diff>

<commit_message>
Break up the risk-of-bias block in Methods
It ran as one paragraph of twenty-three lines covering the tool, the
rating rule, which items are judged at study level and which at estimate
level, and what a "No" on item 8 does and does not mean. Split at those
joins: the tool and the rule, the unit of appraisal, then the reading of
that rating.

"a variance counting as available when the source printed an interval or
when one could be recovered" had the same loose "one" fixed elsewhere;
it now says an interval.

The sentence ruling out a certainty grading had been left without a blank
line before it, so it rendered as the tail of the risk-of-bias paragraph
although it is a separate point. It stands on its own.

Co-Authored-By: Claude Opus 5 <noreply@anthropic.com>
Claude-Session: https://claude.ai/code/session_01CuLT4FKRBtsU22Vwfjj2qn
</commit_message>
<xml_diff>
--- a/meta_agents/search_v2/outputs/Changes_for_review.docx
+++ b/meta_agents/search_v2/outputs/Changes_for_review.docx
@@ -69,7 +69,7 @@
           <w:sz w:val="20"/>
           <w:szCs w:val="20"/>
         </w:rPr>
-        <w:t xml:space="preserve">범위: `42fa0b5` … `HEAD` (44개 문단)</w:t>
+        <w:t xml:space="preserve">범위: `42fa0b5` … `HEAD` (46개 문단)</w:t>
       </w:r>
     </w:p>
     <w:p>
@@ -2832,6 +2832,272 @@
           <w:szCs w:val="20"/>
         </w:rPr>
         <w:t xml:space="preserve">*사유: Rewrite the duplicate-handling paragraph in eligibility*</w:t>
+      </w:r>
+    </w:p>
+    <w:p>
+      <w:pPr>
+        <w:spacing w:after="120" w:line="276"/>
+      </w:pPr>
+      <w:r>
+        <w:rPr>
+          <w:rFonts w:ascii="Malgun Gothic" w:cs="Malgun Gothic" w:eastAsia="Malgun Gothic" w:hAnsi="Malgun Gothic"/>
+          <w:b w:val="false"/>
+          <w:bCs w:val="false"/>
+          <w:color w:val="000000"/>
+          <w:sz w:val="20"/>
+          <w:szCs w:val="20"/>
+        </w:rPr>
+        <w:t xml:space="preserve">### 16. Study selection and data extraction — 수정</w:t>
+      </w:r>
+    </w:p>
+    <w:p>
+      <w:pPr>
+        <w:spacing w:after="120" w:line="276"/>
+      </w:pPr>
+      <w:r>
+        <w:rPr>
+          <w:rFonts w:ascii="Malgun Gothic" w:cs="Malgun Gothic" w:eastAsia="Malgun Gothic" w:hAnsi="Malgun Gothic"/>
+          <w:b/>
+          <w:bCs/>
+          <w:color w:val="000000"/>
+          <w:sz w:val="20"/>
+          <w:szCs w:val="20"/>
+        </w:rPr>
+        <w:t xml:space="preserve">찾기:</w:t>
+      </w:r>
+      <w:r>
+        <w:rPr>
+          <w:rFonts w:ascii="Malgun Gothic" w:cs="Malgun Gothic" w:eastAsia="Malgun Gothic" w:hAnsi="Malgun Gothic"/>
+          <w:b w:val="false"/>
+          <w:bCs w:val="false"/>
+          <w:color w:val="000000"/>
+          <w:sz w:val="20"/>
+          <w:szCs w:val="20"/>
+        </w:rPr>
+        <w:t xml:space="preserve"> `Records were presented to the model in batches, each showing the title…`</w:t>
+      </w:r>
+    </w:p>
+    <w:p>
+      <w:pPr>
+        <w:spacing w:after="120" w:line="276"/>
+      </w:pPr>
+      <w:r>
+        <w:rPr>
+          <w:rFonts w:ascii="Malgun Gothic" w:cs="Malgun Gothic" w:eastAsia="Malgun Gothic" w:hAnsi="Malgun Gothic"/>
+          <w:b/>
+          <w:bCs/>
+          <w:color w:val="000000"/>
+          <w:sz w:val="20"/>
+          <w:szCs w:val="20"/>
+        </w:rPr>
+        <w:t xml:space="preserve">변경 전</w:t>
+      </w:r>
+    </w:p>
+    <w:p>
+      <w:pPr>
+        <w:pStyle w:val="ListParagraph"/>
+        <w:numPr>
+          <w:ilvl w:val="0"/>
+          <w:numId w:val="1"/>
+        </w:numPr>
+        <w:spacing w:after="80" w:line="276"/>
+      </w:pPr>
+      <w:r>
+        <w:rPr>
+          <w:rFonts w:ascii="Malgun Gothic" w:cs="Malgun Gothic" w:eastAsia="Malgun Gothic" w:hAnsi="Malgun Gothic"/>
+          <w:b w:val="false"/>
+          <w:bCs w:val="false"/>
+          <w:color w:val="000000"/>
+          <w:sz w:val="20"/>
+          <w:szCs w:val="20"/>
+        </w:rPr>
+        <w:t xml:space="preserve">Records were presented to the model in batches, each showing the title and the abstract truncated to the first 600 characters; the model applied the criteria to each record and proposed an include or exclude decision, and the author adjudicated both sets.</w:t>
+      </w:r>
+    </w:p>
+    <w:p>
+      <w:pPr>
+        <w:spacing w:after="120" w:line="276"/>
+      </w:pPr>
+      <w:r>
+        <w:rPr>
+          <w:rFonts w:ascii="Malgun Gothic" w:cs="Malgun Gothic" w:eastAsia="Malgun Gothic" w:hAnsi="Malgun Gothic"/>
+          <w:b/>
+          <w:bCs/>
+          <w:color w:val="000000"/>
+          <w:sz w:val="20"/>
+          <w:szCs w:val="20"/>
+        </w:rPr>
+        <w:t xml:space="preserve">변경 후</w:t>
+      </w:r>
+    </w:p>
+    <w:p>
+      <w:pPr>
+        <w:pStyle w:val="ListParagraph"/>
+        <w:numPr>
+          <w:ilvl w:val="0"/>
+          <w:numId w:val="1"/>
+        </w:numPr>
+        <w:spacing w:after="80" w:line="276"/>
+      </w:pPr>
+      <w:r>
+        <w:rPr>
+          <w:rFonts w:ascii="Malgun Gothic" w:cs="Malgun Gothic" w:eastAsia="Malgun Gothic" w:hAnsi="Malgun Gothic"/>
+          <w:b w:val="false"/>
+          <w:bCs w:val="false"/>
+          <w:color w:val="000000"/>
+          <w:sz w:val="20"/>
+          <w:szCs w:val="20"/>
+        </w:rPr>
+        <w:t xml:space="preserve">Records were presented to the model in batches, each showing the title and the abstract truncated to the first 600 characters; the model applied the criteria to each record and proposed an include or exclude decision, and the author reviewed the proposals of each kind.</w:t>
+      </w:r>
+    </w:p>
+    <w:p>
+      <w:pPr>
+        <w:spacing w:after="120" w:line="276"/>
+      </w:pPr>
+      <w:r>
+        <w:rPr>
+          <w:rFonts w:ascii="Malgun Gothic" w:cs="Malgun Gothic" w:eastAsia="Malgun Gothic" w:hAnsi="Malgun Gothic"/>
+          <w:b w:val="false"/>
+          <w:bCs w:val="false"/>
+          <w:color w:val="000000"/>
+          <w:sz w:val="20"/>
+          <w:szCs w:val="20"/>
+        </w:rPr>
+        <w:t xml:space="preserve">*사유: Name what two pronouns in Methods refer to*</w:t>
+      </w:r>
+    </w:p>
+    <w:p>
+      <w:pPr>
+        <w:spacing w:after="120" w:line="276"/>
+      </w:pPr>
+      <w:r>
+        <w:rPr>
+          <w:rFonts w:ascii="Malgun Gothic" w:cs="Malgun Gothic" w:eastAsia="Malgun Gothic" w:hAnsi="Malgun Gothic"/>
+          <w:b w:val="false"/>
+          <w:bCs w:val="false"/>
+          <w:color w:val="000000"/>
+          <w:sz w:val="20"/>
+          <w:szCs w:val="20"/>
+        </w:rPr>
+        <w:t xml:space="preserve">### 17. Selection of a representative population-based estimate — 수정</w:t>
+      </w:r>
+    </w:p>
+    <w:p>
+      <w:pPr>
+        <w:spacing w:after="120" w:line="276"/>
+      </w:pPr>
+      <w:r>
+        <w:rPr>
+          <w:rFonts w:ascii="Malgun Gothic" w:cs="Malgun Gothic" w:eastAsia="Malgun Gothic" w:hAnsi="Malgun Gothic"/>
+          <w:b/>
+          <w:bCs/>
+          <w:color w:val="000000"/>
+          <w:sz w:val="20"/>
+          <w:szCs w:val="20"/>
+        </w:rPr>
+        <w:t xml:space="preserve">찾기:</w:t>
+      </w:r>
+      <w:r>
+        <w:rPr>
+          <w:rFonts w:ascii="Malgun Gothic" w:cs="Malgun Gothic" w:eastAsia="Malgun Gothic" w:hAnsi="Malgun Gothic"/>
+          <w:b w:val="false"/>
+          <w:bCs w:val="false"/>
+          <w:color w:val="000000"/>
+          <w:sz w:val="20"/>
+          <w:szCs w:val="20"/>
+        </w:rPr>
+        <w:t xml:space="preserve"> `One further cell, Alaska Native, also rests on an unstratified White comparator…`</w:t>
+      </w:r>
+    </w:p>
+    <w:p>
+      <w:pPr>
+        <w:spacing w:after="120" w:line="276"/>
+      </w:pPr>
+      <w:r>
+        <w:rPr>
+          <w:rFonts w:ascii="Malgun Gothic" w:cs="Malgun Gothic" w:eastAsia="Malgun Gothic" w:hAnsi="Malgun Gothic"/>
+          <w:b/>
+          <w:bCs/>
+          <w:color w:val="000000"/>
+          <w:sz w:val="20"/>
+          <w:szCs w:val="20"/>
+        </w:rPr>
+        <w:t xml:space="preserve">변경 전</w:t>
+      </w:r>
+    </w:p>
+    <w:p>
+      <w:pPr>
+        <w:pStyle w:val="ListParagraph"/>
+        <w:numPr>
+          <w:ilvl w:val="0"/>
+          <w:numId w:val="1"/>
+        </w:numPr>
+        <w:spacing w:after="80" w:line="276"/>
+      </w:pPr>
+      <w:r>
+        <w:rPr>
+          <w:rFonts w:ascii="Malgun Gothic" w:cs="Malgun Gothic" w:eastAsia="Malgun Gothic" w:hAnsi="Malgun Gothic"/>
+          <w:b w:val="false"/>
+          <w:bCs w:val="false"/>
+          <w:color w:val="000000"/>
+          <w:sz w:val="20"/>
+          <w:szCs w:val="20"/>
+        </w:rPr>
+        <w:t xml:space="preserve">One further cell, Alaska Native, also rests on one although an NHW-comparator source exists for it, the broader-coverage rule above having selected the registry that reports against an unstratified White reference, so 19 of the 85 representatives use an unstratified White reference in all.</w:t>
+      </w:r>
+    </w:p>
+    <w:p>
+      <w:pPr>
+        <w:spacing w:after="120" w:line="276"/>
+      </w:pPr>
+      <w:r>
+        <w:rPr>
+          <w:rFonts w:ascii="Malgun Gothic" w:cs="Malgun Gothic" w:eastAsia="Malgun Gothic" w:hAnsi="Malgun Gothic"/>
+          <w:b/>
+          <w:bCs/>
+          <w:color w:val="000000"/>
+          <w:sz w:val="20"/>
+          <w:szCs w:val="20"/>
+        </w:rPr>
+        <w:t xml:space="preserve">변경 후</w:t>
+      </w:r>
+    </w:p>
+    <w:p>
+      <w:pPr>
+        <w:pStyle w:val="ListParagraph"/>
+        <w:numPr>
+          <w:ilvl w:val="0"/>
+          <w:numId w:val="1"/>
+        </w:numPr>
+        <w:spacing w:after="80" w:line="276"/>
+      </w:pPr>
+      <w:r>
+        <w:rPr>
+          <w:rFonts w:ascii="Malgun Gothic" w:cs="Malgun Gothic" w:eastAsia="Malgun Gothic" w:hAnsi="Malgun Gothic"/>
+          <w:b w:val="false"/>
+          <w:bCs w:val="false"/>
+          <w:color w:val="000000"/>
+          <w:sz w:val="20"/>
+          <w:szCs w:val="20"/>
+        </w:rPr>
+        <w:t xml:space="preserve">One further cell, Alaska Native, also rests on an unstratified White comparator although an NHW-comparator source exists for it, the broader-coverage rule above having selected the registry that reports against an unstratified White reference; 19 of the 85 representatives use such a reference in all.</w:t>
+      </w:r>
+    </w:p>
+    <w:p>
+      <w:pPr>
+        <w:spacing w:after="120" w:line="276"/>
+      </w:pPr>
+      <w:r>
+        <w:rPr>
+          <w:rFonts w:ascii="Malgun Gothic" w:cs="Malgun Gothic" w:eastAsia="Malgun Gothic" w:hAnsi="Malgun Gothic"/>
+          <w:b w:val="false"/>
+          <w:bCs w:val="false"/>
+          <w:color w:val="000000"/>
+          <w:sz w:val="20"/>
+          <w:szCs w:val="20"/>
+        </w:rPr>
+        <w:t xml:space="preserve">*사유: Name what two pronouns in Methods refer to*</w:t>
       </w:r>
     </w:p>
     <w:p>

</xml_diff>

<commit_message>
Fix the denominator in the Discussion's sensitivity paragraph
"The low-risk-of-bias restriction moved the most cells (19 of the 66 it
could re-examine)" took its denominator from the wrong analysis. That
restriction dropped 12 of the 85 cells, so it could re-examine 73; the 66
is the NHW restriction's unchanged count. It reads 73.

Numbers crossing between the four sensitivity analyses is a failure the
cross-check could not see, so check E now recomputes each one's
unchanged, changed, dropped and re-examinable counts from its own output
and matches them against the prose — 42 numbers checked, up from 32.
Confirmed it bites by putting 66 back: reported.

Co-Authored-By: Claude Opus 5 <noreply@anthropic.com>
Claude-Session: https://claude.ai/code/session_01CuLT4FKRBtsU22Vwfjj2qn
</commit_message>
<xml_diff>
--- a/meta_agents/search_v2/outputs/Changes_for_review.docx
+++ b/meta_agents/search_v2/outputs/Changes_for_review.docx
@@ -69,7 +69,7 @@
           <w:sz w:val="20"/>
           <w:szCs w:val="20"/>
         </w:rPr>
-        <w:t xml:space="preserve">범위: `42fa0b5` … `HEAD` (46개 문단)</w:t>
+        <w:t xml:space="preserve">범위: `42fa0b5` … `HEAD` (50개 문단)</w:t>
       </w:r>
     </w:p>
     <w:p>
@@ -3098,6 +3098,465 @@
           <w:szCs w:val="20"/>
         </w:rPr>
         <w:t xml:space="preserve">*사유: Name what two pronouns in Methods refer to*</w:t>
+      </w:r>
+    </w:p>
+    <w:p>
+      <w:pPr>
+        <w:spacing w:after="120" w:line="276"/>
+      </w:pPr>
+      <w:r>
+        <w:rPr>
+          <w:rFonts w:ascii="Malgun Gothic" w:cs="Malgun Gothic" w:eastAsia="Malgun Gothic" w:hAnsi="Malgun Gothic"/>
+          <w:b w:val="false"/>
+          <w:bCs w:val="false"/>
+          <w:color w:val="000000"/>
+          <w:sz w:val="20"/>
+          <w:szCs w:val="20"/>
+        </w:rPr>
+        <w:t xml:space="preserve">### 18. Risk of bias — 수정</w:t>
+      </w:r>
+    </w:p>
+    <w:p>
+      <w:pPr>
+        <w:spacing w:after="120" w:line="276"/>
+      </w:pPr>
+      <w:r>
+        <w:rPr>
+          <w:rFonts w:ascii="Malgun Gothic" w:cs="Malgun Gothic" w:eastAsia="Malgun Gothic" w:hAnsi="Malgun Gothic"/>
+          <w:b/>
+          <w:bCs/>
+          <w:color w:val="000000"/>
+          <w:sz w:val="20"/>
+          <w:szCs w:val="20"/>
+        </w:rPr>
+        <w:t xml:space="preserve">찾기:</w:t>
+      </w:r>
+      <w:r>
+        <w:rPr>
+          <w:rFonts w:ascii="Malgun Gothic" w:cs="Malgun Gothic" w:eastAsia="Malgun Gothic" w:hAnsi="Malgun Gothic"/>
+          <w:b w:val="false"/>
+          <w:bCs w:val="false"/>
+          <w:color w:val="000000"/>
+          <w:sz w:val="20"/>
+          <w:szCs w:val="20"/>
+        </w:rPr>
+        <w:t xml:space="preserve"> `Risk of bias was assessed with the Joanna Briggs Institute (JBI) critical…`</w:t>
+      </w:r>
+    </w:p>
+    <w:p>
+      <w:pPr>
+        <w:spacing w:after="120" w:line="276"/>
+      </w:pPr>
+      <w:r>
+        <w:rPr>
+          <w:rFonts w:ascii="Malgun Gothic" w:cs="Malgun Gothic" w:eastAsia="Malgun Gothic" w:hAnsi="Malgun Gothic"/>
+          <w:b/>
+          <w:bCs/>
+          <w:color w:val="000000"/>
+          <w:sz w:val="20"/>
+          <w:szCs w:val="20"/>
+        </w:rPr>
+        <w:t xml:space="preserve">변경 전</w:t>
+      </w:r>
+    </w:p>
+    <w:p>
+      <w:pPr>
+        <w:pStyle w:val="ListParagraph"/>
+        <w:numPr>
+          <w:ilvl w:val="0"/>
+          <w:numId w:val="1"/>
+        </w:numPr>
+        <w:spacing w:after="80" w:line="276"/>
+      </w:pPr>
+      <w:r>
+        <w:rPr>
+          <w:rFonts w:ascii="Malgun Gothic" w:cs="Malgun Gothic" w:eastAsia="Malgun Gothic" w:hAnsi="Malgun Gothic"/>
+          <w:b w:val="false"/>
+          <w:bCs w:val="false"/>
+          <w:color w:val="000000"/>
+          <w:sz w:val="20"/>
+          <w:szCs w:val="20"/>
+        </w:rPr>
+        <w:t xml:space="preserve">Each study was appraised as the source of the estimates taken from it here rather than as a whole publication, and the items divide accordingly.</w:t>
+      </w:r>
+    </w:p>
+    <w:p>
+      <w:pPr>
+        <w:pStyle w:val="ListParagraph"/>
+        <w:numPr>
+          <w:ilvl w:val="0"/>
+          <w:numId w:val="1"/>
+        </w:numPr>
+        <w:spacing w:after="80" w:line="276"/>
+      </w:pPr>
+      <w:r>
+        <w:rPr>
+          <w:rFonts w:ascii="Malgun Gothic" w:cs="Malgun Gothic" w:eastAsia="Malgun Gothic" w:hAnsi="Malgun Gothic"/>
+          <w:b w:val="false"/>
+          <w:bCs w:val="false"/>
+          <w:color w:val="000000"/>
+          <w:sz w:val="20"/>
+          <w:szCs w:val="20"/>
+        </w:rPr>
+        <w:t xml:space="preserve">Items 1 to 7 describe the study and its registry—the sample frame, case ascertainment, case numbers, description of setting and population, coverage, identification of invasive breast cancer, and how race and ethnicity were measured—and were judged at that level, so they do not change with which estimates were extracted.</w:t>
+      </w:r>
+    </w:p>
+    <w:p>
+      <w:pPr>
+        <w:pStyle w:val="ListParagraph"/>
+        <w:numPr>
+          <w:ilvl w:val="0"/>
+          <w:numId w:val="1"/>
+        </w:numPr>
+        <w:spacing w:after="80" w:line="276"/>
+      </w:pPr>
+      <w:r>
+        <w:rPr>
+          <w:rFonts w:ascii="Malgun Gothic" w:cs="Malgun Gothic" w:eastAsia="Malgun Gothic" w:hAnsi="Malgun Gothic"/>
+          <w:b w:val="false"/>
+          <w:bCs w:val="false"/>
+          <w:color w:val="000000"/>
+          <w:sz w:val="20"/>
+          <w:szCs w:val="20"/>
+        </w:rPr>
+        <w:t xml:space="preserve">Item 8 depends on the estimates themselves and was judged on those extracted for this review, a variance counting as available when the source printed an interval or when one could be recovered from what the source reports.</w:t>
+      </w:r>
+    </w:p>
+    <w:p>
+      <w:pPr>
+        <w:pStyle w:val="ListParagraph"/>
+        <w:numPr>
+          <w:ilvl w:val="0"/>
+          <w:numId w:val="1"/>
+        </w:numPr>
+        <w:spacing w:after="80" w:line="276"/>
+      </w:pPr>
+      <w:r>
+        <w:rPr>
+          <w:rFonts w:ascii="Malgun Gothic" w:cs="Malgun Gothic" w:eastAsia="Malgun Gothic" w:hAnsi="Malgun Gothic"/>
+          <w:b w:val="false"/>
+          <w:bCs w:val="false"/>
+          <w:color w:val="000000"/>
+          <w:sz w:val="20"/>
+          <w:szCs w:val="20"/>
+        </w:rPr>
+        <w:t xml:space="preserve">A study whose extracted estimates carry no interval therefore rates "No" on item 8 whether or not the source printed the ratio itself, which places a point estimate without a variance at moderate rather than low risk of bias.</w:t>
+      </w:r>
+    </w:p>
+    <w:p>
+      <w:pPr>
+        <w:pStyle w:val="ListParagraph"/>
+        <w:numPr>
+          <w:ilvl w:val="0"/>
+          <w:numId w:val="1"/>
+        </w:numPr>
+        <w:spacing w:after="80" w:line="276"/>
+      </w:pPr>
+      <w:r>
+        <w:rPr>
+          <w:rFonts w:ascii="Malgun Gothic" w:cs="Malgun Gothic" w:eastAsia="Malgun Gothic" w:hAnsi="Malgun Gothic"/>
+          <w:b w:val="false"/>
+          <w:bCs w:val="false"/>
+          <w:color w:val="000000"/>
+          <w:sz w:val="20"/>
+          <w:szCs w:val="20"/>
+        </w:rPr>
+        <w:t xml:space="preserve">That rating reflects incomplete reporting of uncertainty rather than evidence that the estimate is biased, and it is the reason several large registry analyses that report ratios without intervals are rated moderate.</w:t>
+      </w:r>
+    </w:p>
+    <w:p>
+      <w:pPr>
+        <w:pStyle w:val="ListParagraph"/>
+        <w:numPr>
+          <w:ilvl w:val="0"/>
+          <w:numId w:val="1"/>
+        </w:numPr>
+        <w:spacing w:after="80" w:line="276"/>
+      </w:pPr>
+      <w:r>
+        <w:rPr>
+          <w:rFonts w:ascii="Malgun Gothic" w:cs="Malgun Gothic" w:eastAsia="Malgun Gothic" w:hAnsi="Malgun Gothic"/>
+          <w:b w:val="false"/>
+          <w:bCs w:val="false"/>
+          <w:color w:val="000000"/>
+          <w:sz w:val="20"/>
+          <w:szCs w:val="20"/>
+        </w:rPr>
+        <w:t xml:space="preserve">Certainty of evidence was not graded, the review being descriptive rather than an estimate of a causal effect.</w:t>
+      </w:r>
+    </w:p>
+    <w:p>
+      <w:pPr>
+        <w:spacing w:after="120" w:line="276"/>
+      </w:pPr>
+      <w:r>
+        <w:rPr>
+          <w:rFonts w:ascii="Malgun Gothic" w:cs="Malgun Gothic" w:eastAsia="Malgun Gothic" w:hAnsi="Malgun Gothic"/>
+          <w:b w:val="false"/>
+          <w:bCs w:val="false"/>
+          <w:color w:val="000000"/>
+          <w:sz w:val="20"/>
+          <w:szCs w:val="20"/>
+        </w:rPr>
+        <w:t xml:space="preserve">*사유: Break up the risk-of-bias block in Methods*</w:t>
+      </w:r>
+    </w:p>
+    <w:p>
+      <w:pPr>
+        <w:spacing w:after="120" w:line="276"/>
+      </w:pPr>
+      <w:r>
+        <w:rPr>
+          <w:rFonts w:ascii="Malgun Gothic" w:cs="Malgun Gothic" w:eastAsia="Malgun Gothic" w:hAnsi="Malgun Gothic"/>
+          <w:b w:val="false"/>
+          <w:bCs w:val="false"/>
+          <w:color w:val="000000"/>
+          <w:sz w:val="20"/>
+          <w:szCs w:val="20"/>
+        </w:rPr>
+        <w:t xml:space="preserve">### 19. Risk of bias — 추가</w:t>
+      </w:r>
+    </w:p>
+    <w:p>
+      <w:pPr>
+        <w:spacing w:after="120" w:line="276"/>
+      </w:pPr>
+      <w:r>
+        <w:rPr>
+          <w:rFonts w:ascii="Malgun Gothic" w:cs="Malgun Gothic" w:eastAsia="Malgun Gothic" w:hAnsi="Malgun Gothic"/>
+          <w:b/>
+          <w:bCs/>
+          <w:color w:val="000000"/>
+          <w:sz w:val="20"/>
+          <w:szCs w:val="20"/>
+        </w:rPr>
+        <w:t xml:space="preserve">찾기:</w:t>
+      </w:r>
+      <w:r>
+        <w:rPr>
+          <w:rFonts w:ascii="Malgun Gothic" w:cs="Malgun Gothic" w:eastAsia="Malgun Gothic" w:hAnsi="Malgun Gothic"/>
+          <w:b w:val="false"/>
+          <w:bCs w:val="false"/>
+          <w:color w:val="000000"/>
+          <w:sz w:val="20"/>
+          <w:szCs w:val="20"/>
+        </w:rPr>
+        <w:t xml:space="preserve"> `Each study was appraised as the source of the estimates taken from…`</w:t>
+      </w:r>
+    </w:p>
+    <w:p>
+      <w:pPr>
+        <w:spacing w:after="120" w:line="276"/>
+      </w:pPr>
+      <w:r>
+        <w:rPr>
+          <w:rFonts w:ascii="Malgun Gothic" w:cs="Malgun Gothic" w:eastAsia="Malgun Gothic" w:hAnsi="Malgun Gothic"/>
+          <w:b/>
+          <w:bCs/>
+          <w:color w:val="000000"/>
+          <w:sz w:val="20"/>
+          <w:szCs w:val="20"/>
+        </w:rPr>
+        <w:t xml:space="preserve">추가된 문단</w:t>
+      </w:r>
+      <w:r>
+        <w:rPr>
+          <w:rFonts w:ascii="Malgun Gothic" w:cs="Malgun Gothic" w:eastAsia="Malgun Gothic" w:hAnsi="Malgun Gothic"/>
+          <w:b w:val="false"/>
+          <w:bCs w:val="false"/>
+          <w:color w:val="000000"/>
+          <w:sz w:val="20"/>
+          <w:szCs w:val="20"/>
+        </w:rPr>
+        <w:t xml:space="preserve"> Each study was appraised as the source of the estimates taken from it here rather than as a whole publication, and the items divide accordingly. Items 1 to 7 describe the study and its registry—the sample frame, case ascertainment, case numbers, description of setting and population, coverage, identification of invasive breast cancer, and how race and ethnicity were measured—and were judged at that level, so they do not change with which estimates were extracted. Item 8 depends on the estimates themselves and was judged on those extracted for this review, a variance counting as available when the source printed an interval or when an interval could be recovered from what the source reports.</w:t>
+      </w:r>
+    </w:p>
+    <w:p>
+      <w:pPr>
+        <w:spacing w:after="120" w:line="276"/>
+      </w:pPr>
+      <w:r>
+        <w:rPr>
+          <w:rFonts w:ascii="Malgun Gothic" w:cs="Malgun Gothic" w:eastAsia="Malgun Gothic" w:hAnsi="Malgun Gothic"/>
+          <w:b w:val="false"/>
+          <w:bCs w:val="false"/>
+          <w:color w:val="000000"/>
+          <w:sz w:val="20"/>
+          <w:szCs w:val="20"/>
+        </w:rPr>
+        <w:t xml:space="preserve">*사유: Break up the risk-of-bias block in Methods*</w:t>
+      </w:r>
+    </w:p>
+    <w:p>
+      <w:pPr>
+        <w:spacing w:after="120" w:line="276"/>
+      </w:pPr>
+      <w:r>
+        <w:rPr>
+          <w:rFonts w:ascii="Malgun Gothic" w:cs="Malgun Gothic" w:eastAsia="Malgun Gothic" w:hAnsi="Malgun Gothic"/>
+          <w:b w:val="false"/>
+          <w:bCs w:val="false"/>
+          <w:color w:val="000000"/>
+          <w:sz w:val="20"/>
+          <w:szCs w:val="20"/>
+        </w:rPr>
+        <w:t xml:space="preserve">### 20. Risk of bias — 추가</w:t>
+      </w:r>
+    </w:p>
+    <w:p>
+      <w:pPr>
+        <w:spacing w:after="120" w:line="276"/>
+      </w:pPr>
+      <w:r>
+        <w:rPr>
+          <w:rFonts w:ascii="Malgun Gothic" w:cs="Malgun Gothic" w:eastAsia="Malgun Gothic" w:hAnsi="Malgun Gothic"/>
+          <w:b/>
+          <w:bCs/>
+          <w:color w:val="000000"/>
+          <w:sz w:val="20"/>
+          <w:szCs w:val="20"/>
+        </w:rPr>
+        <w:t xml:space="preserve">찾기:</w:t>
+      </w:r>
+      <w:r>
+        <w:rPr>
+          <w:rFonts w:ascii="Malgun Gothic" w:cs="Malgun Gothic" w:eastAsia="Malgun Gothic" w:hAnsi="Malgun Gothic"/>
+          <w:b w:val="false"/>
+          <w:bCs w:val="false"/>
+          <w:color w:val="000000"/>
+          <w:sz w:val="20"/>
+          <w:szCs w:val="20"/>
+        </w:rPr>
+        <w:t xml:space="preserve"> `A study whose extracted estimates carry no interval therefore rates "No" on…`</w:t>
+      </w:r>
+    </w:p>
+    <w:p>
+      <w:pPr>
+        <w:spacing w:after="120" w:line="276"/>
+      </w:pPr>
+      <w:r>
+        <w:rPr>
+          <w:rFonts w:ascii="Malgun Gothic" w:cs="Malgun Gothic" w:eastAsia="Malgun Gothic" w:hAnsi="Malgun Gothic"/>
+          <w:b/>
+          <w:bCs/>
+          <w:color w:val="000000"/>
+          <w:sz w:val="20"/>
+          <w:szCs w:val="20"/>
+        </w:rPr>
+        <w:t xml:space="preserve">추가된 문단</w:t>
+      </w:r>
+      <w:r>
+        <w:rPr>
+          <w:rFonts w:ascii="Malgun Gothic" w:cs="Malgun Gothic" w:eastAsia="Malgun Gothic" w:hAnsi="Malgun Gothic"/>
+          <w:b w:val="false"/>
+          <w:bCs w:val="false"/>
+          <w:color w:val="000000"/>
+          <w:sz w:val="20"/>
+          <w:szCs w:val="20"/>
+        </w:rPr>
+        <w:t xml:space="preserve"> A study whose extracted estimates carry no interval therefore rates "No" on item 8 whether or not the source printed the ratio itself, which places a point estimate without a variance at moderate rather than low risk of bias. That rating reflects incomplete reporting of uncertainty rather than evidence that the estimate is biased, and it is the reason several large registry analyses that report ratios without intervals are rated moderate.</w:t>
+      </w:r>
+    </w:p>
+    <w:p>
+      <w:pPr>
+        <w:spacing w:after="120" w:line="276"/>
+      </w:pPr>
+      <w:r>
+        <w:rPr>
+          <w:rFonts w:ascii="Malgun Gothic" w:cs="Malgun Gothic" w:eastAsia="Malgun Gothic" w:hAnsi="Malgun Gothic"/>
+          <w:b w:val="false"/>
+          <w:bCs w:val="false"/>
+          <w:color w:val="000000"/>
+          <w:sz w:val="20"/>
+          <w:szCs w:val="20"/>
+        </w:rPr>
+        <w:t xml:space="preserve">*사유: Break up the risk-of-bias block in Methods*</w:t>
+      </w:r>
+    </w:p>
+    <w:p>
+      <w:pPr>
+        <w:spacing w:after="120" w:line="276"/>
+      </w:pPr>
+      <w:r>
+        <w:rPr>
+          <w:rFonts w:ascii="Malgun Gothic" w:cs="Malgun Gothic" w:eastAsia="Malgun Gothic" w:hAnsi="Malgun Gothic"/>
+          <w:b w:val="false"/>
+          <w:bCs w:val="false"/>
+          <w:color w:val="000000"/>
+          <w:sz w:val="20"/>
+          <w:szCs w:val="20"/>
+        </w:rPr>
+        <w:t xml:space="preserve">### 21. Risk of bias — 추가</w:t>
+      </w:r>
+    </w:p>
+    <w:p>
+      <w:pPr>
+        <w:spacing w:after="120" w:line="276"/>
+      </w:pPr>
+      <w:r>
+        <w:rPr>
+          <w:rFonts w:ascii="Malgun Gothic" w:cs="Malgun Gothic" w:eastAsia="Malgun Gothic" w:hAnsi="Malgun Gothic"/>
+          <w:b/>
+          <w:bCs/>
+          <w:color w:val="000000"/>
+          <w:sz w:val="20"/>
+          <w:szCs w:val="20"/>
+        </w:rPr>
+        <w:t xml:space="preserve">찾기:</w:t>
+      </w:r>
+      <w:r>
+        <w:rPr>
+          <w:rFonts w:ascii="Malgun Gothic" w:cs="Malgun Gothic" w:eastAsia="Malgun Gothic" w:hAnsi="Malgun Gothic"/>
+          <w:b w:val="false"/>
+          <w:bCs w:val="false"/>
+          <w:color w:val="000000"/>
+          <w:sz w:val="20"/>
+          <w:szCs w:val="20"/>
+        </w:rPr>
+        <w:t xml:space="preserve"> `Certainty of evidence was not graded, the review being descriptive rather than…`</w:t>
+      </w:r>
+    </w:p>
+    <w:p>
+      <w:pPr>
+        <w:spacing w:after="120" w:line="276"/>
+      </w:pPr>
+      <w:r>
+        <w:rPr>
+          <w:rFonts w:ascii="Malgun Gothic" w:cs="Malgun Gothic" w:eastAsia="Malgun Gothic" w:hAnsi="Malgun Gothic"/>
+          <w:b/>
+          <w:bCs/>
+          <w:color w:val="000000"/>
+          <w:sz w:val="20"/>
+          <w:szCs w:val="20"/>
+        </w:rPr>
+        <w:t xml:space="preserve">추가된 문단</w:t>
+      </w:r>
+      <w:r>
+        <w:rPr>
+          <w:rFonts w:ascii="Malgun Gothic" w:cs="Malgun Gothic" w:eastAsia="Malgun Gothic" w:hAnsi="Malgun Gothic"/>
+          <w:b w:val="false"/>
+          <w:bCs w:val="false"/>
+          <w:color w:val="000000"/>
+          <w:sz w:val="20"/>
+          <w:szCs w:val="20"/>
+        </w:rPr>
+        <w:t xml:space="preserve"> Certainty of evidence was not graded, the review being descriptive rather than an estimate of a causal effect.</w:t>
+      </w:r>
+    </w:p>
+    <w:p>
+      <w:pPr>
+        <w:spacing w:after="120" w:line="276"/>
+      </w:pPr>
+      <w:r>
+        <w:rPr>
+          <w:rFonts w:ascii="Malgun Gothic" w:cs="Malgun Gothic" w:eastAsia="Malgun Gothic" w:hAnsi="Malgun Gothic"/>
+          <w:b w:val="false"/>
+          <w:bCs w:val="false"/>
+          <w:color w:val="000000"/>
+          <w:sz w:val="20"/>
+          <w:szCs w:val="20"/>
+        </w:rPr>
+        <w:t xml:space="preserve">*사유: Break up the risk-of-bias block in Methods*</w:t>
       </w:r>
     </w:p>
     <w:p>

</xml_diff>

<commit_message>
Put the two robustness paragraphs together in the Discussion
The paragraph on subgroups whose incidence sits near the NHW rate, where
the representative study decides the sign, sat three paragraphs away from
the sensitivity account that refers back to it as "the Japanese cell
above". Both are about how much weight the estimates bear, so they now
run together, and the back-reference points at the paragraph before it
rather than across the AI/AN material.

That also leaves the two features of the data — ascertainment and
comparator — as an unbroken block after the findings.

Co-Authored-By: Claude Opus 5 <noreply@anthropic.com>
Claude-Session: https://claude.ai/code/session_01CuLT4FKRBtsU22Vwfjj2qn
</commit_message>
<xml_diff>
--- a/meta_agents/search_v2/outputs/Changes_for_review.docx
+++ b/meta_agents/search_v2/outputs/Changes_for_review.docx
@@ -69,7 +69,7 @@
           <w:sz w:val="20"/>
           <w:szCs w:val="20"/>
         </w:rPr>
-        <w:t xml:space="preserve">범위: `42fa0b5` … `HEAD` (51개 문단)</w:t>
+        <w:t xml:space="preserve">범위: `42fa0b5` … `HEAD` (54개 문단)</w:t>
       </w:r>
     </w:p>
     <w:p>
@@ -7668,6 +7668,437 @@
           <w:szCs w:val="20"/>
         </w:rPr>
         <w:t xml:space="preserve">*사유: Fix the denominator in the Discussion's sensitivity paragraph*</w:t>
+      </w:r>
+    </w:p>
+    <w:p>
+      <w:pPr>
+        <w:spacing w:after="120" w:line="276"/>
+      </w:pPr>
+      <w:r>
+        <w:rPr>
+          <w:rFonts w:ascii="Malgun Gothic" w:cs="Malgun Gothic" w:eastAsia="Malgun Gothic" w:hAnsi="Malgun Gothic"/>
+          <w:b w:val="false"/>
+          <w:bCs w:val="false"/>
+          <w:color w:val="000000"/>
+          <w:sz w:val="20"/>
+          <w:szCs w:val="20"/>
+        </w:rPr>
+        <w:t xml:space="preserve">### 16. Discussion — 수정</w:t>
+      </w:r>
+    </w:p>
+    <w:p>
+      <w:pPr>
+        <w:spacing w:after="120" w:line="276"/>
+      </w:pPr>
+      <w:r>
+        <w:rPr>
+          <w:rFonts w:ascii="Malgun Gothic" w:cs="Malgun Gothic" w:eastAsia="Malgun Gothic" w:hAnsi="Malgun Gothic"/>
+          <w:b/>
+          <w:bCs/>
+          <w:color w:val="000000"/>
+          <w:sz w:val="20"/>
+          <w:szCs w:val="20"/>
+        </w:rPr>
+        <w:t xml:space="preserve">찾기:</w:t>
+      </w:r>
+      <w:r>
+        <w:rPr>
+          <w:rFonts w:ascii="Malgun Gothic" w:cs="Malgun Gothic" w:eastAsia="Malgun Gothic" w:hAnsi="Malgun Gothic"/>
+          <w:b w:val="false"/>
+          <w:bCs w:val="false"/>
+          <w:color w:val="000000"/>
+          <w:sz w:val="20"/>
+          <w:szCs w:val="20"/>
+        </w:rPr>
+        <w:t xml:space="preserve"> `Two features of the underlying data shaped these estimates: how AI/AN cases…`</w:t>
+      </w:r>
+    </w:p>
+    <w:p>
+      <w:pPr>
+        <w:spacing w:after="120" w:line="276"/>
+      </w:pPr>
+      <w:r>
+        <w:rPr>
+          <w:rFonts w:ascii="Malgun Gothic" w:cs="Malgun Gothic" w:eastAsia="Malgun Gothic" w:hAnsi="Malgun Gothic"/>
+          <w:b/>
+          <w:bCs/>
+          <w:color w:val="000000"/>
+          <w:sz w:val="20"/>
+          <w:szCs w:val="20"/>
+        </w:rPr>
+        <w:t xml:space="preserve">변경 전</w:t>
+      </w:r>
+    </w:p>
+    <w:p>
+      <w:pPr>
+        <w:pStyle w:val="ListParagraph"/>
+        <w:numPr>
+          <w:ilvl w:val="0"/>
+          <w:numId w:val="1"/>
+        </w:numPr>
+        <w:spacing w:after="80" w:line="276"/>
+      </w:pPr>
+      <w:r>
+        <w:rPr>
+          <w:rFonts w:ascii="Malgun Gothic" w:cs="Malgun Gothic" w:eastAsia="Malgun Gothic" w:hAnsi="Malgun Gothic"/>
+          <w:b w:val="false"/>
+          <w:bCs w:val="false"/>
+          <w:color w:val="000000"/>
+          <w:sz w:val="20"/>
+          <w:szCs w:val="20"/>
+        </w:rPr>
+        <w:t xml:space="preserve">Two features of the underlying data shaped these estimates.</w:t>
+      </w:r>
+    </w:p>
+    <w:p>
+      <w:pPr>
+        <w:pStyle w:val="ListParagraph"/>
+        <w:numPr>
+          <w:ilvl w:val="0"/>
+          <w:numId w:val="1"/>
+        </w:numPr>
+        <w:spacing w:after="80" w:line="276"/>
+      </w:pPr>
+      <w:r>
+        <w:rPr>
+          <w:rFonts w:ascii="Malgun Gothic" w:cs="Malgun Gothic" w:eastAsia="Malgun Gothic" w:hAnsi="Malgun Gothic"/>
+          <w:b w:val="false"/>
+          <w:bCs w:val="false"/>
+          <w:color w:val="000000"/>
+          <w:sz w:val="20"/>
+          <w:szCs w:val="20"/>
+        </w:rPr>
+        <w:t xml:space="preserve">First, unlinked registries tend to undercount AI/AN cases, so the AI/AN estimates here draw on Indian Health Service–linked sources, which capture these cases more completely.¹⁰,⁵³ The two national figures differ substantially—0.56 from an unlinked source and 0.87 from an IHS-linked one—but they come from separate studies, so the gap cannot be read as the effect of linkage alone.</w:t>
+      </w:r>
+    </w:p>
+    <w:p>
+      <w:pPr>
+        <w:pStyle w:val="ListParagraph"/>
+        <w:numPr>
+          <w:ilvl w:val="0"/>
+          <w:numId w:val="1"/>
+        </w:numPr>
+        <w:spacing w:after="80" w:line="276"/>
+      </w:pPr>
+      <w:r>
+        <w:rPr>
+          <w:rFonts w:ascii="Malgun Gothic" w:cs="Malgun Gothic" w:eastAsia="Malgun Gothic" w:hAnsi="Malgun Gothic"/>
+          <w:b w:val="false"/>
+          <w:bCs w:val="false"/>
+          <w:color w:val="000000"/>
+          <w:sz w:val="20"/>
+          <w:szCs w:val="20"/>
+        </w:rPr>
+        <w:t xml:space="preserve">Among IHS-linked national estimates the ratio also rose over time, from 0.63 in 1999–2004 to 0.87 in 2010–2015, so the most recent IHS-linked estimate was taken as the representative and the earlier one retained for sensitivity.</w:t>
+      </w:r>
+    </w:p>
+    <w:p>
+      <w:pPr>
+        <w:pStyle w:val="ListParagraph"/>
+        <w:numPr>
+          <w:ilvl w:val="0"/>
+          <w:numId w:val="1"/>
+        </w:numPr>
+        <w:spacing w:after="80" w:line="276"/>
+      </w:pPr>
+      <w:r>
+        <w:rPr>
+          <w:rFonts w:ascii="Malgun Gothic" w:cs="Malgun Gothic" w:eastAsia="Malgun Gothic" w:hAnsi="Malgun Gothic"/>
+          <w:b w:val="false"/>
+          <w:bCs w:val="false"/>
+          <w:color w:val="000000"/>
+          <w:sz w:val="20"/>
+          <w:szCs w:val="20"/>
+        </w:rPr>
+        <w:t xml:space="preserve">The IHS-linked regional estimates vary widely and reach or exceed the NHW rate in the Northern and Southern Plains—and, against an unstratified White reference, among Alaska Native women (regional values in Table 1 and Figure 2).</w:t>
+      </w:r>
+    </w:p>
+    <w:p>
+      <w:pPr>
+        <w:pStyle w:val="ListParagraph"/>
+        <w:numPr>
+          <w:ilvl w:val="0"/>
+          <w:numId w:val="1"/>
+        </w:numPr>
+        <w:spacing w:after="80" w:line="276"/>
+      </w:pPr>
+      <w:r>
+        <w:rPr>
+          <w:rFonts w:ascii="Malgun Gothic" w:cs="Malgun Gothic" w:eastAsia="Malgun Gothic" w:hAnsi="Malgun Gothic"/>
+          <w:b w:val="false"/>
+          <w:bCs w:val="false"/>
+          <w:color w:val="000000"/>
+          <w:sz w:val="20"/>
+          <w:szCs w:val="20"/>
+        </w:rPr>
+        <w:t xml:space="preserve">The lower unlinked values therefore likely reflect incomplete case ascertainment, together with the wider diagnosis periods and the national rather than PRCDA coverage of those sources, rather than only lower underlying incidence; the AI/AN–NHW comparison therefore depends on the source's ascertainment as well as its diagnosis period and geographic scope.⁴¹,⁵⁸ The IHS-linked correction, however, was available only for the aggregate and regional estimates: no Indian Health Service–linked source reported AI/AN incidence by molecular subtype, so the AI/AN subtype figures (for example, the HR-positive/HER2-negative and triple-negative cells) rest on unlinked registries and may understate the true rates.</w:t>
+      </w:r>
+    </w:p>
+    <w:p>
+      <w:pPr>
+        <w:pStyle w:val="ListParagraph"/>
+        <w:numPr>
+          <w:ilvl w:val="0"/>
+          <w:numId w:val="1"/>
+        </w:numPr>
+        <w:spacing w:after="80" w:line="276"/>
+      </w:pPr>
+      <w:r>
+        <w:rPr>
+          <w:rFonts w:ascii="Malgun Gothic" w:cs="Malgun Gothic" w:eastAsia="Malgun Gothic" w:hAnsi="Malgun Gothic"/>
+          <w:b w:val="false"/>
+          <w:bCs w:val="false"/>
+          <w:color w:val="000000"/>
+          <w:sz w:val="20"/>
+          <w:szCs w:val="20"/>
+        </w:rPr>
+        <w:t xml:space="preserve">Second, reference groups differed across sources—66 of the 85 representatives used an NHW comparator and 19 an unstratified White reference—so each comparator was recorded as its source defined it and a sensitivity analysis was restricted to NHW-comparator estimates; the unstratified-White cells, 16 of them receptor-defined subtypes, can shift a ratio slightly.</w:t>
+      </w:r>
+    </w:p>
+    <w:p>
+      <w:pPr>
+        <w:spacing w:after="120" w:line="276"/>
+      </w:pPr>
+      <w:r>
+        <w:rPr>
+          <w:rFonts w:ascii="Malgun Gothic" w:cs="Malgun Gothic" w:eastAsia="Malgun Gothic" w:hAnsi="Malgun Gothic"/>
+          <w:b/>
+          <w:bCs/>
+          <w:color w:val="000000"/>
+          <w:sz w:val="20"/>
+          <w:szCs w:val="20"/>
+        </w:rPr>
+        <w:t xml:space="preserve">변경 후</w:t>
+      </w:r>
+    </w:p>
+    <w:p>
+      <w:pPr>
+        <w:pStyle w:val="ListParagraph"/>
+        <w:numPr>
+          <w:ilvl w:val="0"/>
+          <w:numId w:val="1"/>
+        </w:numPr>
+        <w:spacing w:after="80" w:line="276"/>
+      </w:pPr>
+      <w:r>
+        <w:rPr>
+          <w:rFonts w:ascii="Malgun Gothic" w:cs="Malgun Gothic" w:eastAsia="Malgun Gothic" w:hAnsi="Malgun Gothic"/>
+          <w:b w:val="false"/>
+          <w:bCs w:val="false"/>
+          <w:color w:val="000000"/>
+          <w:sz w:val="20"/>
+          <w:szCs w:val="20"/>
+        </w:rPr>
+        <w:t xml:space="preserve">Two features of the underlying data shaped these estimates: how AI/AN cases were ascertained, and which White group each source compared against.</w:t>
+      </w:r>
+    </w:p>
+    <w:p>
+      <w:pPr>
+        <w:pStyle w:val="ListParagraph"/>
+        <w:numPr>
+          <w:ilvl w:val="0"/>
+          <w:numId w:val="1"/>
+        </w:numPr>
+        <w:spacing w:after="80" w:line="276"/>
+      </w:pPr>
+      <w:r>
+        <w:rPr>
+          <w:rFonts w:ascii="Malgun Gothic" w:cs="Malgun Gothic" w:eastAsia="Malgun Gothic" w:hAnsi="Malgun Gothic"/>
+          <w:b w:val="false"/>
+          <w:bCs w:val="false"/>
+          <w:color w:val="000000"/>
+          <w:sz w:val="20"/>
+          <w:szCs w:val="20"/>
+        </w:rPr>
+        <w:t xml:space="preserve">Unlinked registries tend to undercount AI/AN cases, so the AI/AN estimates here draw on Indian Health Service–linked sources, which capture these cases more completely.¹⁰,⁵³ The two national figures differ substantially—0.56 from an unlinked source and 0.87 from an IHS-linked one—but they come from separate studies, so the gap cannot be read as the effect of linkage alone.</w:t>
+      </w:r>
+    </w:p>
+    <w:p>
+      <w:pPr>
+        <w:spacing w:after="120" w:line="276"/>
+      </w:pPr>
+      <w:r>
+        <w:rPr>
+          <w:rFonts w:ascii="Malgun Gothic" w:cs="Malgun Gothic" w:eastAsia="Malgun Gothic" w:hAnsi="Malgun Gothic"/>
+          <w:b w:val="false"/>
+          <w:bCs w:val="false"/>
+          <w:color w:val="000000"/>
+          <w:sz w:val="20"/>
+          <w:szCs w:val="20"/>
+        </w:rPr>
+        <w:t xml:space="preserve">*사유: Break up the 419-word paragraph in the Discussion*</w:t>
+      </w:r>
+    </w:p>
+    <w:p>
+      <w:pPr>
+        <w:spacing w:after="120" w:line="276"/>
+      </w:pPr>
+      <w:r>
+        <w:rPr>
+          <w:rFonts w:ascii="Malgun Gothic" w:cs="Malgun Gothic" w:eastAsia="Malgun Gothic" w:hAnsi="Malgun Gothic"/>
+          <w:b w:val="false"/>
+          <w:bCs w:val="false"/>
+          <w:color w:val="000000"/>
+          <w:sz w:val="20"/>
+          <w:szCs w:val="20"/>
+        </w:rPr>
+        <w:t xml:space="preserve">### 17. Discussion — 추가</w:t>
+      </w:r>
+    </w:p>
+    <w:p>
+      <w:pPr>
+        <w:spacing w:after="120" w:line="276"/>
+      </w:pPr>
+      <w:r>
+        <w:rPr>
+          <w:rFonts w:ascii="Malgun Gothic" w:cs="Malgun Gothic" w:eastAsia="Malgun Gothic" w:hAnsi="Malgun Gothic"/>
+          <w:b/>
+          <w:bCs/>
+          <w:color w:val="000000"/>
+          <w:sz w:val="20"/>
+          <w:szCs w:val="20"/>
+        </w:rPr>
+        <w:t xml:space="preserve">찾기:</w:t>
+      </w:r>
+      <w:r>
+        <w:rPr>
+          <w:rFonts w:ascii="Malgun Gothic" w:cs="Malgun Gothic" w:eastAsia="Malgun Gothic" w:hAnsi="Malgun Gothic"/>
+          <w:b w:val="false"/>
+          <w:bCs w:val="false"/>
+          <w:color w:val="000000"/>
+          <w:sz w:val="20"/>
+          <w:szCs w:val="20"/>
+        </w:rPr>
+        <w:t xml:space="preserve"> `Among IHS-linked national estimates the ratio also rose over time, from 0.63…`</w:t>
+      </w:r>
+    </w:p>
+    <w:p>
+      <w:pPr>
+        <w:spacing w:after="120" w:line="276"/>
+      </w:pPr>
+      <w:r>
+        <w:rPr>
+          <w:rFonts w:ascii="Malgun Gothic" w:cs="Malgun Gothic" w:eastAsia="Malgun Gothic" w:hAnsi="Malgun Gothic"/>
+          <w:b/>
+          <w:bCs/>
+          <w:color w:val="000000"/>
+          <w:sz w:val="20"/>
+          <w:szCs w:val="20"/>
+        </w:rPr>
+        <w:t xml:space="preserve">추가된 문단</w:t>
+      </w:r>
+      <w:r>
+        <w:rPr>
+          <w:rFonts w:ascii="Malgun Gothic" w:cs="Malgun Gothic" w:eastAsia="Malgun Gothic" w:hAnsi="Malgun Gothic"/>
+          <w:b w:val="false"/>
+          <w:bCs w:val="false"/>
+          <w:color w:val="000000"/>
+          <w:sz w:val="20"/>
+          <w:szCs w:val="20"/>
+        </w:rPr>
+        <w:t xml:space="preserve"> Among IHS-linked national estimates the ratio also rose over time, from 0.63 in 1999–2004 to 0.87 in 2010–2015, so the most recent IHS-linked estimate was taken as the representative and the earlier one retained for sensitivity. The IHS-linked regional estimates vary widely and reach or exceed the NHW rate in the Northern and Southern Plains—and, against an unstratified White reference, among Alaska Native women (regional values in Table 1 and Figure 2). The lower unlinked values therefore likely reflect incomplete case ascertainment, together with the wider diagnosis periods and the national rather than PRCDA coverage of those sources, rather than only lower underlying incidence; the AI/AN–NHW comparison therefore depends on the source's ascertainment as well as its diagnosis period and geographic scope.⁴¹,⁵⁸ The IHS-linked correction, however, was available only for the aggregate and regional estimates: no Indian Health Service–linked source reported AI/AN incidence by molecular subtype, so the AI/AN subtype figures (for example, the HR-positive/HER2-negative and triple-negative cells) rest on unlinked registries and may understate the true rates.</w:t>
+      </w:r>
+    </w:p>
+    <w:p>
+      <w:pPr>
+        <w:spacing w:after="120" w:line="276"/>
+      </w:pPr>
+      <w:r>
+        <w:rPr>
+          <w:rFonts w:ascii="Malgun Gothic" w:cs="Malgun Gothic" w:eastAsia="Malgun Gothic" w:hAnsi="Malgun Gothic"/>
+          <w:b w:val="false"/>
+          <w:bCs w:val="false"/>
+          <w:color w:val="000000"/>
+          <w:sz w:val="20"/>
+          <w:szCs w:val="20"/>
+        </w:rPr>
+        <w:t xml:space="preserve">*사유: Break up the 419-word paragraph in the Discussion*</w:t>
+      </w:r>
+    </w:p>
+    <w:p>
+      <w:pPr>
+        <w:spacing w:after="120" w:line="276"/>
+      </w:pPr>
+      <w:r>
+        <w:rPr>
+          <w:rFonts w:ascii="Malgun Gothic" w:cs="Malgun Gothic" w:eastAsia="Malgun Gothic" w:hAnsi="Malgun Gothic"/>
+          <w:b w:val="false"/>
+          <w:bCs w:val="false"/>
+          <w:color w:val="000000"/>
+          <w:sz w:val="20"/>
+          <w:szCs w:val="20"/>
+        </w:rPr>
+        <w:t xml:space="preserve">### 18. Discussion — 추가</w:t>
+      </w:r>
+    </w:p>
+    <w:p>
+      <w:pPr>
+        <w:spacing w:after="120" w:line="276"/>
+      </w:pPr>
+      <w:r>
+        <w:rPr>
+          <w:rFonts w:ascii="Malgun Gothic" w:cs="Malgun Gothic" w:eastAsia="Malgun Gothic" w:hAnsi="Malgun Gothic"/>
+          <w:b/>
+          <w:bCs/>
+          <w:color w:val="000000"/>
+          <w:sz w:val="20"/>
+          <w:szCs w:val="20"/>
+        </w:rPr>
+        <w:t xml:space="preserve">찾기:</w:t>
+      </w:r>
+      <w:r>
+        <w:rPr>
+          <w:rFonts w:ascii="Malgun Gothic" w:cs="Malgun Gothic" w:eastAsia="Malgun Gothic" w:hAnsi="Malgun Gothic"/>
+          <w:b w:val="false"/>
+          <w:bCs w:val="false"/>
+          <w:color w:val="000000"/>
+          <w:sz w:val="20"/>
+          <w:szCs w:val="20"/>
+        </w:rPr>
+        <w:t xml:space="preserve"> `Reference groups also differed across sources—66 of the 85 representatives used an…`</w:t>
+      </w:r>
+    </w:p>
+    <w:p>
+      <w:pPr>
+        <w:spacing w:after="120" w:line="276"/>
+      </w:pPr>
+      <w:r>
+        <w:rPr>
+          <w:rFonts w:ascii="Malgun Gothic" w:cs="Malgun Gothic" w:eastAsia="Malgun Gothic" w:hAnsi="Malgun Gothic"/>
+          <w:b/>
+          <w:bCs/>
+          <w:color w:val="000000"/>
+          <w:sz w:val="20"/>
+          <w:szCs w:val="20"/>
+        </w:rPr>
+        <w:t xml:space="preserve">추가된 문단</w:t>
+      </w:r>
+      <w:r>
+        <w:rPr>
+          <w:rFonts w:ascii="Malgun Gothic" w:cs="Malgun Gothic" w:eastAsia="Malgun Gothic" w:hAnsi="Malgun Gothic"/>
+          <w:b w:val="false"/>
+          <w:bCs w:val="false"/>
+          <w:color w:val="000000"/>
+          <w:sz w:val="20"/>
+          <w:szCs w:val="20"/>
+        </w:rPr>
+        <w:t xml:space="preserve"> Reference groups also differed across sources—66 of the 85 representatives used an NHW comparator and 19 an unstratified White reference—so each comparator was recorded as its source defined it and a sensitivity analysis was restricted to NHW-comparator estimates; the unstratified-White cells, 16 of them receptor-defined subtypes, can shift a ratio slightly.</w:t>
+      </w:r>
+    </w:p>
+    <w:p>
+      <w:pPr>
+        <w:spacing w:after="120" w:line="276"/>
+      </w:pPr>
+      <w:r>
+        <w:rPr>
+          <w:rFonts w:ascii="Malgun Gothic" w:cs="Malgun Gothic" w:eastAsia="Malgun Gothic" w:hAnsi="Malgun Gothic"/>
+          <w:b w:val="false"/>
+          <w:bCs w:val="false"/>
+          <w:color w:val="000000"/>
+          <w:sz w:val="20"/>
+          <w:szCs w:val="20"/>
+        </w:rPr>
+        <w:t xml:space="preserve">*사유: Break up the 419-word paragraph in the Discussion*</w:t>
       </w:r>
     </w:p>
     <w:sectPr>

</xml_diff>

<commit_message>
Revert the paragraph move in the Discussion
Putting the near-null paragraph next to the sensitivity account is not
wanted. It goes back where it was, after the central finding, so the
Discussion reads: findings, the near-null caveat on them, the two
features of the data, then the sensitivity analyses.

The split of the 419-word paragraph stays as it is.

Co-Authored-By: Claude Opus 5 <noreply@anthropic.com>
Claude-Session: https://claude.ai/code/session_01CuLT4FKRBtsU22Vwfjj2qn
</commit_message>
<xml_diff>
--- a/meta_agents/search_v2/outputs/Changes_for_review.docx
+++ b/meta_agents/search_v2/outputs/Changes_for_review.docx
@@ -69,7 +69,7 @@
           <w:sz w:val="20"/>
           <w:szCs w:val="20"/>
         </w:rPr>
-        <w:t xml:space="preserve">범위: `42fa0b5` … `HEAD` (54개 문단)</w:t>
+        <w:t xml:space="preserve">범위: `42fa0b5` … `HEAD` (56개 문단)</w:t>
       </w:r>
     </w:p>
     <w:p>
@@ -8099,6 +8099,151 @@
           <w:szCs w:val="20"/>
         </w:rPr>
         <w:t xml:space="preserve">*사유: Break up the 419-word paragraph in the Discussion*</w:t>
+      </w:r>
+    </w:p>
+    <w:p>
+      <w:pPr>
+        <w:spacing w:after="120" w:line="276"/>
+      </w:pPr>
+      <w:r>
+        <w:rPr>
+          <w:rFonts w:ascii="Malgun Gothic" w:cs="Malgun Gothic" w:eastAsia="Malgun Gothic" w:hAnsi="Malgun Gothic"/>
+          <w:b w:val="false"/>
+          <w:bCs w:val="false"/>
+          <w:color w:val="000000"/>
+          <w:sz w:val="20"/>
+          <w:szCs w:val="20"/>
+        </w:rPr>
+        <w:t xml:space="preserve">### 19. Discussion — 삭제</w:t>
+      </w:r>
+    </w:p>
+    <w:p>
+      <w:pPr>
+        <w:spacing w:after="120" w:line="276"/>
+      </w:pPr>
+      <w:r>
+        <w:rPr>
+          <w:rFonts w:ascii="Malgun Gothic" w:cs="Malgun Gothic" w:eastAsia="Malgun Gothic" w:hAnsi="Malgun Gothic"/>
+          <w:b/>
+          <w:bCs/>
+          <w:color w:val="000000"/>
+          <w:sz w:val="20"/>
+          <w:szCs w:val="20"/>
+        </w:rPr>
+        <w:t xml:space="preserve">삭제된 문단</w:t>
+      </w:r>
+      <w:r>
+        <w:rPr>
+          <w:rFonts w:ascii="Malgun Gothic" w:cs="Malgun Gothic" w:eastAsia="Malgun Gothic" w:hAnsi="Malgun Gothic"/>
+          <w:b w:val="false"/>
+          <w:bCs w:val="false"/>
+          <w:color w:val="000000"/>
+          <w:sz w:val="20"/>
+          <w:szCs w:val="20"/>
+        </w:rPr>
+        <w:t xml:space="preserve"> For the subgroups whose incidence sits close to the NHW rate, which study represents the cell can change the direction of the small difference. Japanese women are the clearest example: the representative estimate, from a recent SEER source,³¹ places their overall incidence just above the NHW rate (1.05), but that study is at moderate risk of bias, and when the representative selection is restricted to low-risk-of-bias studies the cell is instead filled by an earlier eight-state SEER+NPCR estimate⁶⁰ that places it just below (0.95). The flip does not overturn the finding that Japanese incidence is near the NHW level, but it shows that the sign of a near-null difference is not robust for this subgroup. Such a change on restriction reflects more than risk of bias: the substituted study also differs in diagnosis period (2009–2011 versus 2018–2022) and in the registries it draws on, either of which can move a borderline estimate across 1.0.</w:t>
+      </w:r>
+    </w:p>
+    <w:p>
+      <w:pPr>
+        <w:spacing w:after="120" w:line="276"/>
+      </w:pPr>
+      <w:r>
+        <w:rPr>
+          <w:rFonts w:ascii="Malgun Gothic" w:cs="Malgun Gothic" w:eastAsia="Malgun Gothic" w:hAnsi="Malgun Gothic"/>
+          <w:b w:val="false"/>
+          <w:bCs w:val="false"/>
+          <w:color w:val="000000"/>
+          <w:sz w:val="20"/>
+          <w:szCs w:val="20"/>
+        </w:rPr>
+        <w:t xml:space="preserve">*사유: Put the two robustness paragraphs together in the Discussion*</w:t>
+      </w:r>
+    </w:p>
+    <w:p>
+      <w:pPr>
+        <w:spacing w:after="120" w:line="276"/>
+      </w:pPr>
+      <w:r>
+        <w:rPr>
+          <w:rFonts w:ascii="Malgun Gothic" w:cs="Malgun Gothic" w:eastAsia="Malgun Gothic" w:hAnsi="Malgun Gothic"/>
+          <w:b w:val="false"/>
+          <w:bCs w:val="false"/>
+          <w:color w:val="000000"/>
+          <w:sz w:val="20"/>
+          <w:szCs w:val="20"/>
+        </w:rPr>
+        <w:t xml:space="preserve">### 20. Discussion — 추가</w:t>
+      </w:r>
+    </w:p>
+    <w:p>
+      <w:pPr>
+        <w:spacing w:after="120" w:line="276"/>
+      </w:pPr>
+      <w:r>
+        <w:rPr>
+          <w:rFonts w:ascii="Malgun Gothic" w:cs="Malgun Gothic" w:eastAsia="Malgun Gothic" w:hAnsi="Malgun Gothic"/>
+          <w:b/>
+          <w:bCs/>
+          <w:color w:val="000000"/>
+          <w:sz w:val="20"/>
+          <w:szCs w:val="20"/>
+        </w:rPr>
+        <w:t xml:space="preserve">찾기:</w:t>
+      </w:r>
+      <w:r>
+        <w:rPr>
+          <w:rFonts w:ascii="Malgun Gothic" w:cs="Malgun Gothic" w:eastAsia="Malgun Gothic" w:hAnsi="Malgun Gothic"/>
+          <w:b w:val="false"/>
+          <w:bCs w:val="false"/>
+          <w:color w:val="000000"/>
+          <w:sz w:val="20"/>
+          <w:szCs w:val="20"/>
+        </w:rPr>
+        <w:t xml:space="preserve"> `For the subgroups whose incidence sits close to the NHW rate, which…`</w:t>
+      </w:r>
+    </w:p>
+    <w:p>
+      <w:pPr>
+        <w:spacing w:after="120" w:line="276"/>
+      </w:pPr>
+      <w:r>
+        <w:rPr>
+          <w:rFonts w:ascii="Malgun Gothic" w:cs="Malgun Gothic" w:eastAsia="Malgun Gothic" w:hAnsi="Malgun Gothic"/>
+          <w:b/>
+          <w:bCs/>
+          <w:color w:val="000000"/>
+          <w:sz w:val="20"/>
+          <w:szCs w:val="20"/>
+        </w:rPr>
+        <w:t xml:space="preserve">추가된 문단</w:t>
+      </w:r>
+      <w:r>
+        <w:rPr>
+          <w:rFonts w:ascii="Malgun Gothic" w:cs="Malgun Gothic" w:eastAsia="Malgun Gothic" w:hAnsi="Malgun Gothic"/>
+          <w:b w:val="false"/>
+          <w:bCs w:val="false"/>
+          <w:color w:val="000000"/>
+          <w:sz w:val="20"/>
+          <w:szCs w:val="20"/>
+        </w:rPr>
+        <w:t xml:space="preserve"> For the subgroups whose incidence sits close to the NHW rate, which study represents the cell can change the direction of the small difference. Japanese women are the clearest example: the representative estimate, from a recent SEER source,³¹ places their overall incidence just above the NHW rate (1.05), but that study is at moderate risk of bias, and when the representative selection is restricted to low-risk-of-bias studies the cell is instead filled by an earlier eight-state SEER+NPCR estimate⁶⁰ that places it just below (0.95). The flip does not overturn the finding that Japanese incidence is near the NHW level, but it shows that the sign of a near-null difference is not robust for this subgroup. Such a change on restriction reflects more than risk of bias: the substituted study also differs in diagnosis period (2009–2011 versus 2018–2022) and in the registries it draws on, either of which can move a borderline estimate across 1.0.</w:t>
+      </w:r>
+    </w:p>
+    <w:p>
+      <w:pPr>
+        <w:spacing w:after="120" w:line="276"/>
+      </w:pPr>
+      <w:r>
+        <w:rPr>
+          <w:rFonts w:ascii="Malgun Gothic" w:cs="Malgun Gothic" w:eastAsia="Malgun Gothic" w:hAnsi="Malgun Gothic"/>
+          <w:b w:val="false"/>
+          <w:bCs w:val="false"/>
+          <w:color w:val="000000"/>
+          <w:sz w:val="20"/>
+          <w:szCs w:val="20"/>
+        </w:rPr>
+        <w:t xml:space="preserve">*사유: Put the two robustness paragraphs together in the Discussion*</w:t>
       </w:r>
     </w:p>
     <w:sectPr>

</xml_diff>

<commit_message>
Rewrap the comparator paragraph's first line
It began mid-sentence on its own line, left over from where the split
fell. No wording change.

Co-Authored-By: Claude Opus 5 <noreply@anthropic.com>
Claude-Session: https://claude.ai/code/session_01CuLT4FKRBtsU22Vwfjj2qn
</commit_message>
<xml_diff>
--- a/meta_agents/search_v2/outputs/Changes_for_review.docx
+++ b/meta_agents/search_v2/outputs/Changes_for_review.docx
@@ -69,7 +69,7 @@
           <w:sz w:val="20"/>
           <w:szCs w:val="20"/>
         </w:rPr>
-        <w:t xml:space="preserve">범위: `42fa0b5` … `HEAD` (56개 문단)</w:t>
+        <w:t xml:space="preserve">범위: `42fa0b5` … `HEAD` (58개 문단)</w:t>
       </w:r>
     </w:p>
     <w:p>
@@ -8244,6 +8244,151 @@
           <w:szCs w:val="20"/>
         </w:rPr>
         <w:t xml:space="preserve">*사유: Put the two robustness paragraphs together in the Discussion*</w:t>
+      </w:r>
+    </w:p>
+    <w:p>
+      <w:pPr>
+        <w:spacing w:after="120" w:line="276"/>
+      </w:pPr>
+      <w:r>
+        <w:rPr>
+          <w:rFonts w:ascii="Malgun Gothic" w:cs="Malgun Gothic" w:eastAsia="Malgun Gothic" w:hAnsi="Malgun Gothic"/>
+          <w:b w:val="false"/>
+          <w:bCs w:val="false"/>
+          <w:color w:val="000000"/>
+          <w:sz w:val="20"/>
+          <w:szCs w:val="20"/>
+        </w:rPr>
+        <w:t xml:space="preserve">### 21. Discussion — 추가</w:t>
+      </w:r>
+    </w:p>
+    <w:p>
+      <w:pPr>
+        <w:spacing w:after="120" w:line="276"/>
+      </w:pPr>
+      <w:r>
+        <w:rPr>
+          <w:rFonts w:ascii="Malgun Gothic" w:cs="Malgun Gothic" w:eastAsia="Malgun Gothic" w:hAnsi="Malgun Gothic"/>
+          <w:b/>
+          <w:bCs/>
+          <w:color w:val="000000"/>
+          <w:sz w:val="20"/>
+          <w:szCs w:val="20"/>
+        </w:rPr>
+        <w:t xml:space="preserve">찾기:</w:t>
+      </w:r>
+      <w:r>
+        <w:rPr>
+          <w:rFonts w:ascii="Malgun Gothic" w:cs="Malgun Gothic" w:eastAsia="Malgun Gothic" w:hAnsi="Malgun Gothic"/>
+          <w:b w:val="false"/>
+          <w:bCs w:val="false"/>
+          <w:color w:val="000000"/>
+          <w:sz w:val="20"/>
+          <w:szCs w:val="20"/>
+        </w:rPr>
+        <w:t xml:space="preserve"> `For the subgroups whose incidence sits close to the NHW rate, which…`</w:t>
+      </w:r>
+    </w:p>
+    <w:p>
+      <w:pPr>
+        <w:spacing w:after="120" w:line="276"/>
+      </w:pPr>
+      <w:r>
+        <w:rPr>
+          <w:rFonts w:ascii="Malgun Gothic" w:cs="Malgun Gothic" w:eastAsia="Malgun Gothic" w:hAnsi="Malgun Gothic"/>
+          <w:b/>
+          <w:bCs/>
+          <w:color w:val="000000"/>
+          <w:sz w:val="20"/>
+          <w:szCs w:val="20"/>
+        </w:rPr>
+        <w:t xml:space="preserve">추가된 문단</w:t>
+      </w:r>
+      <w:r>
+        <w:rPr>
+          <w:rFonts w:ascii="Malgun Gothic" w:cs="Malgun Gothic" w:eastAsia="Malgun Gothic" w:hAnsi="Malgun Gothic"/>
+          <w:b w:val="false"/>
+          <w:bCs w:val="false"/>
+          <w:color w:val="000000"/>
+          <w:sz w:val="20"/>
+          <w:szCs w:val="20"/>
+        </w:rPr>
+        <w:t xml:space="preserve"> For the subgroups whose incidence sits close to the NHW rate, which study represents the cell can change the direction of the small difference. Japanese women are the clearest example: the representative estimate, from a recent SEER source,³¹ places their overall incidence just above the NHW rate (1.05), but that study is at moderate risk of bias, and when the representative selection is restricted to low-risk-of-bias studies the cell is instead filled by an earlier eight-state SEER+NPCR estimate⁶⁰ that places it just below (0.95). The flip does not overturn the finding that Japanese incidence is near the NHW level, but it shows that the sign of a near-null difference is not robust for this subgroup. Such a change on restriction reflects more than risk of bias: the substituted study also differs in diagnosis period (2009–2011 versus 2018–2022) and in the registries it draws on, either of which can move a borderline estimate across 1.0.</w:t>
+      </w:r>
+    </w:p>
+    <w:p>
+      <w:pPr>
+        <w:spacing w:after="120" w:line="276"/>
+      </w:pPr>
+      <w:r>
+        <w:rPr>
+          <w:rFonts w:ascii="Malgun Gothic" w:cs="Malgun Gothic" w:eastAsia="Malgun Gothic" w:hAnsi="Malgun Gothic"/>
+          <w:b w:val="false"/>
+          <w:bCs w:val="false"/>
+          <w:color w:val="000000"/>
+          <w:sz w:val="20"/>
+          <w:szCs w:val="20"/>
+        </w:rPr>
+        <w:t xml:space="preserve">*사유: Revert the paragraph move in the Discussion*</w:t>
+      </w:r>
+    </w:p>
+    <w:p>
+      <w:pPr>
+        <w:spacing w:after="120" w:line="276"/>
+      </w:pPr>
+      <w:r>
+        <w:rPr>
+          <w:rFonts w:ascii="Malgun Gothic" w:cs="Malgun Gothic" w:eastAsia="Malgun Gothic" w:hAnsi="Malgun Gothic"/>
+          <w:b w:val="false"/>
+          <w:bCs w:val="false"/>
+          <w:color w:val="000000"/>
+          <w:sz w:val="20"/>
+          <w:szCs w:val="20"/>
+        </w:rPr>
+        <w:t xml:space="preserve">### 22. Discussion — 삭제</w:t>
+      </w:r>
+    </w:p>
+    <w:p>
+      <w:pPr>
+        <w:spacing w:after="120" w:line="276"/>
+      </w:pPr>
+      <w:r>
+        <w:rPr>
+          <w:rFonts w:ascii="Malgun Gothic" w:cs="Malgun Gothic" w:eastAsia="Malgun Gothic" w:hAnsi="Malgun Gothic"/>
+          <w:b/>
+          <w:bCs/>
+          <w:color w:val="000000"/>
+          <w:sz w:val="20"/>
+          <w:szCs w:val="20"/>
+        </w:rPr>
+        <w:t xml:space="preserve">삭제된 문단</w:t>
+      </w:r>
+      <w:r>
+        <w:rPr>
+          <w:rFonts w:ascii="Malgun Gothic" w:cs="Malgun Gothic" w:eastAsia="Malgun Gothic" w:hAnsi="Malgun Gothic"/>
+          <w:b w:val="false"/>
+          <w:bCs w:val="false"/>
+          <w:color w:val="000000"/>
+          <w:sz w:val="20"/>
+          <w:szCs w:val="20"/>
+        </w:rPr>
+        <w:t xml:space="preserve"> For the subgroups whose incidence sits close to the NHW rate, which study represents the cell can change the direction of the small difference. Japanese women are the clearest example: the representative estimate, from a recent SEER source,³¹ places their overall incidence just above the NHW rate (1.05), but that study is at moderate risk of bias, and when the representative selection is restricted to low-risk-of-bias studies the cell is instead filled by an earlier eight-state SEER+NPCR estimate⁶⁰ that places it just below (0.95). The flip does not overturn the finding that Japanese incidence is near the NHW level, but it shows that the sign of a near-null difference is not robust for this subgroup. Such a change on restriction reflects more than risk of bias: the substituted study also differs in diagnosis period (2009–2011 versus 2018–2022) and in the registries it draws on, either of which can move a borderline estimate across 1.0.</w:t>
+      </w:r>
+    </w:p>
+    <w:p>
+      <w:pPr>
+        <w:spacing w:after="120" w:line="276"/>
+      </w:pPr>
+      <w:r>
+        <w:rPr>
+          <w:rFonts w:ascii="Malgun Gothic" w:cs="Malgun Gothic" w:eastAsia="Malgun Gothic" w:hAnsi="Malgun Gothic"/>
+          <w:b w:val="false"/>
+          <w:bCs w:val="false"/>
+          <w:color w:val="000000"/>
+          <w:sz w:val="20"/>
+          <w:szCs w:val="20"/>
+        </w:rPr>
+        <w:t xml:space="preserve">*사유: Revert the paragraph move in the Discussion*</w:t>
       </w:r>
     </w:p>
     <w:sectPr>

</xml_diff>

<commit_message>
Cut the argument back out of the AI/AN override rule
Four of the six lines added to that paragraph argued why ascertainment
should outrank coverage — the same defending-a-choice that was taken out
of the item 8 rule earlier, and redundant besides, since the sentence
before already gives the reason as the undercount. What was missing was
the fact, not the case for it.

One sentence remains: the national AI/AN cell set aside a source covering
about 99% of the US population for one confined to PRCDA counties, and
the demoted estimates went to the sensitivity analysis.

Co-Authored-By: Claude Opus 5 <noreply@anthropic.com>
Claude-Session: https://claude.ai/code/session_01CuLT4FKRBtsU22Vwfjj2qn
</commit_message>
<xml_diff>
--- a/meta_agents/search_v2/outputs/Changes_for_review.docx
+++ b/meta_agents/search_v2/outputs/Changes_for_review.docx
@@ -69,7 +69,7 @@
           <w:sz w:val="20"/>
           <w:szCs w:val="20"/>
         </w:rPr>
-        <w:t xml:space="preserve">범위: `42fa0b5` … `HEAD` (58개 문단)</w:t>
+        <w:t xml:space="preserve">범위: `42fa0b5` … `HEAD` (59개 문단)</w:t>
       </w:r>
     </w:p>
     <w:p>
@@ -3557,6 +3557,181 @@
           <w:szCs w:val="20"/>
         </w:rPr>
         <w:t xml:space="preserve">*사유: Break up the risk-of-bias block in Methods*</w:t>
+      </w:r>
+    </w:p>
+    <w:p>
+      <w:pPr>
+        <w:spacing w:after="120" w:line="276"/>
+      </w:pPr>
+      <w:r>
+        <w:rPr>
+          <w:rFonts w:ascii="Malgun Gothic" w:cs="Malgun Gothic" w:eastAsia="Malgun Gothic" w:hAnsi="Malgun Gothic"/>
+          <w:b w:val="false"/>
+          <w:bCs w:val="false"/>
+          <w:color w:val="000000"/>
+          <w:sz w:val="20"/>
+          <w:szCs w:val="20"/>
+        </w:rPr>
+        <w:t xml:space="preserve">### 22. Selection of a representative population-based estimate — 수정</w:t>
+      </w:r>
+    </w:p>
+    <w:p>
+      <w:pPr>
+        <w:spacing w:after="120" w:line="276"/>
+      </w:pPr>
+      <w:r>
+        <w:rPr>
+          <w:rFonts w:ascii="Malgun Gothic" w:cs="Malgun Gothic" w:eastAsia="Malgun Gothic" w:hAnsi="Malgun Gothic"/>
+          <w:b/>
+          <w:bCs/>
+          <w:color w:val="000000"/>
+          <w:sz w:val="20"/>
+          <w:szCs w:val="20"/>
+        </w:rPr>
+        <w:t xml:space="preserve">찾기:</w:t>
+      </w:r>
+      <w:r>
+        <w:rPr>
+          <w:rFonts w:ascii="Malgun Gothic" w:cs="Malgun Gothic" w:eastAsia="Malgun Gothic" w:hAnsi="Malgun Gothic"/>
+          <w:b w:val="false"/>
+          <w:bCs w:val="false"/>
+          <w:color w:val="000000"/>
+          <w:sz w:val="20"/>
+          <w:szCs w:val="20"/>
+        </w:rPr>
+        <w:t xml:space="preserve"> `Breadth of coverage does not substitute for correct ascertainment here: a national…`</w:t>
+      </w:r>
+    </w:p>
+    <w:p>
+      <w:pPr>
+        <w:spacing w:after="120" w:line="276"/>
+      </w:pPr>
+      <w:r>
+        <w:rPr>
+          <w:rFonts w:ascii="Malgun Gothic" w:cs="Malgun Gothic" w:eastAsia="Malgun Gothic" w:hAnsi="Malgun Gothic"/>
+          <w:b/>
+          <w:bCs/>
+          <w:color w:val="000000"/>
+          <w:sz w:val="20"/>
+          <w:szCs w:val="20"/>
+        </w:rPr>
+        <w:t xml:space="preserve">변경 전</w:t>
+      </w:r>
+    </w:p>
+    <w:p>
+      <w:pPr>
+        <w:pStyle w:val="ListParagraph"/>
+        <w:numPr>
+          <w:ilvl w:val="0"/>
+          <w:numId w:val="1"/>
+        </w:numPr>
+        <w:spacing w:after="80" w:line="276"/>
+      </w:pPr>
+      <w:r>
+        <w:rPr>
+          <w:rFonts w:ascii="Malgun Gothic" w:cs="Malgun Gothic" w:eastAsia="Malgun Gothic" w:hAnsi="Malgun Gothic"/>
+          <w:b w:val="false"/>
+          <w:bCs w:val="false"/>
+          <w:color w:val="000000"/>
+          <w:sz w:val="20"/>
+          <w:szCs w:val="20"/>
+        </w:rPr>
+        <w:t xml:space="preserve">Alaska Native women are an example.</w:t>
+      </w:r>
+    </w:p>
+    <w:p>
+      <w:pPr>
+        <w:spacing w:after="120" w:line="276"/>
+      </w:pPr>
+      <w:r>
+        <w:rPr>
+          <w:rFonts w:ascii="Malgun Gothic" w:cs="Malgun Gothic" w:eastAsia="Malgun Gothic" w:hAnsi="Malgun Gothic"/>
+          <w:b/>
+          <w:bCs/>
+          <w:color w:val="000000"/>
+          <w:sz w:val="20"/>
+          <w:szCs w:val="20"/>
+        </w:rPr>
+        <w:t xml:space="preserve">변경 후</w:t>
+      </w:r>
+    </w:p>
+    <w:p>
+      <w:pPr>
+        <w:pStyle w:val="ListParagraph"/>
+        <w:numPr>
+          <w:ilvl w:val="0"/>
+          <w:numId w:val="1"/>
+        </w:numPr>
+        <w:spacing w:after="80" w:line="276"/>
+      </w:pPr>
+      <w:r>
+        <w:rPr>
+          <w:rFonts w:ascii="Malgun Gothic" w:cs="Malgun Gothic" w:eastAsia="Malgun Gothic" w:hAnsi="Malgun Gothic"/>
+          <w:b w:val="false"/>
+          <w:bCs w:val="false"/>
+          <w:color w:val="000000"/>
+          <w:sz w:val="20"/>
+          <w:szCs w:val="20"/>
+        </w:rPr>
+        <w:t xml:space="preserve">Breadth of coverage does not substitute for correct ascertainment here: a national registry covers nearly the whole population but assigns race by observation, so its AI/AN numerator is undercounted, whereas a linked source counts those cases and applies its geographic restriction to the comparison group as well.</w:t>
+      </w:r>
+    </w:p>
+    <w:p>
+      <w:pPr>
+        <w:pStyle w:val="ListParagraph"/>
+        <w:numPr>
+          <w:ilvl w:val="0"/>
+          <w:numId w:val="1"/>
+        </w:numPr>
+        <w:spacing w:after="80" w:line="276"/>
+      </w:pPr>
+      <w:r>
+        <w:rPr>
+          <w:rFonts w:ascii="Malgun Gothic" w:cs="Malgun Gothic" w:eastAsia="Malgun Gothic" w:hAnsi="Malgun Gothic"/>
+          <w:b w:val="false"/>
+          <w:bCs w:val="false"/>
+          <w:color w:val="000000"/>
+          <w:sz w:val="20"/>
+          <w:szCs w:val="20"/>
+        </w:rPr>
+        <w:t xml:space="preserve">For the national AI/AN cell this meant setting aside a source covering about 99% of the U.S. population for one confined to Purchased/Referred Care Delivery Area counties, which hold about half the AI/AN population; the demoted estimates were carried in the sensitivity analysis.</w:t>
+      </w:r>
+    </w:p>
+    <w:p>
+      <w:pPr>
+        <w:pStyle w:val="ListParagraph"/>
+        <w:numPr>
+          <w:ilvl w:val="0"/>
+          <w:numId w:val="1"/>
+        </w:numPr>
+        <w:spacing w:after="80" w:line="276"/>
+      </w:pPr>
+      <w:r>
+        <w:rPr>
+          <w:rFonts w:ascii="Malgun Gothic" w:cs="Malgun Gothic" w:eastAsia="Malgun Gothic" w:hAnsi="Malgun Gothic"/>
+          <w:b w:val="false"/>
+          <w:bCs w:val="false"/>
+          <w:color w:val="000000"/>
+          <w:sz w:val="20"/>
+          <w:szCs w:val="20"/>
+        </w:rPr>
+        <w:t xml:space="preserve">The comparator criterion was given up in the same way, and Alaska Native women are the example.</w:t>
+      </w:r>
+    </w:p>
+    <w:p>
+      <w:pPr>
+        <w:spacing w:after="120" w:line="276"/>
+      </w:pPr>
+      <w:r>
+        <w:rPr>
+          <w:rFonts w:ascii="Malgun Gothic" w:cs="Malgun Gothic" w:eastAsia="Malgun Gothic" w:hAnsi="Malgun Gothic"/>
+          <w:b w:val="false"/>
+          <w:bCs w:val="false"/>
+          <w:color w:val="000000"/>
+          <w:sz w:val="20"/>
+          <w:szCs w:val="20"/>
+        </w:rPr>
+        <w:t xml:space="preserve">*사유: Say what the AI/AN selection override costs in coverage*</w:t>
       </w:r>
     </w:p>
     <w:p>

</xml_diff>

<commit_message>
Stop Results claiming the pattern held throughout
The Discussion was rewritten this round to say the pattern held for most
of the cells each restriction could re-examine, but not uniformly.
Results still said it "held throughout", which overstates the same
finding and sits badly beside what follows in the very next clause: the
low-risk restriction moves the AI/AN aggregate from 0.87 to 0.63, and
the Discussion says that leaves the ordering of the aggregates not
preserved. Results now states what each restriction did, and the 6a
paragraph carries the reordering as a result rather than leaving it to
the Discussion alone.

The four restrictions also ran as a single 219-word sentence with seven
semicolons. One paragraph each, 21 to 73 words.

Counts unchanged; the sensitivity probes in check E all still match.

Co-Authored-By: Claude Opus 5 <noreply@anthropic.com>
Claude-Session: https://claude.ai/code/session_01CuLT4FKRBtsU22Vwfjj2qn
</commit_message>
<xml_diff>
--- a/meta_agents/search_v2/outputs/Changes_for_review.docx
+++ b/meta_agents/search_v2/outputs/Changes_for_review.docx
@@ -69,7 +69,7 @@
           <w:sz w:val="20"/>
           <w:szCs w:val="20"/>
         </w:rPr>
-        <w:t xml:space="preserve">범위: `42fa0b5` … `HEAD` (59개 문단)</w:t>
+        <w:t xml:space="preserve">범위: `42fa0b5` … `HEAD` (60개 문단)</w:t>
       </w:r>
     </w:p>
     <w:p>
@@ -3732,6 +3732,202 @@
           <w:szCs w:val="20"/>
         </w:rPr>
         <w:t xml:space="preserve">*사유: Say what the AI/AN selection override costs in coverage*</w:t>
+      </w:r>
+    </w:p>
+    <w:p>
+      <w:pPr>
+        <w:spacing w:after="120" w:line="276"/>
+      </w:pPr>
+      <w:r>
+        <w:rPr>
+          <w:rFonts w:ascii="Malgun Gothic" w:cs="Malgun Gothic" w:eastAsia="Malgun Gothic" w:hAnsi="Malgun Gothic"/>
+          <w:b w:val="false"/>
+          <w:bCs w:val="false"/>
+          <w:color w:val="000000"/>
+          <w:sz w:val="20"/>
+          <w:szCs w:val="20"/>
+        </w:rPr>
+        <w:t xml:space="preserve">### 23. Selection of a representative population-based estimate — 수정</w:t>
+      </w:r>
+    </w:p>
+    <w:p>
+      <w:pPr>
+        <w:spacing w:after="120" w:line="276"/>
+      </w:pPr>
+      <w:r>
+        <w:rPr>
+          <w:rFonts w:ascii="Malgun Gothic" w:cs="Malgun Gothic" w:eastAsia="Malgun Gothic" w:hAnsi="Malgun Gothic"/>
+          <w:b/>
+          <w:bCs/>
+          <w:color w:val="000000"/>
+          <w:sz w:val="20"/>
+          <w:szCs w:val="20"/>
+        </w:rPr>
+        <w:t xml:space="preserve">찾기:</w:t>
+      </w:r>
+      <w:r>
+        <w:rPr>
+          <w:rFonts w:ascii="Malgun Gothic" w:cs="Malgun Gothic" w:eastAsia="Malgun Gothic" w:hAnsi="Malgun Gothic"/>
+          <w:b w:val="false"/>
+          <w:bCs w:val="false"/>
+          <w:color w:val="000000"/>
+          <w:sz w:val="20"/>
+          <w:szCs w:val="20"/>
+        </w:rPr>
+        <w:t xml:space="preserve"> `For the national AI/AN cell this set aside a source covering about…`</w:t>
+      </w:r>
+    </w:p>
+    <w:p>
+      <w:pPr>
+        <w:spacing w:after="120" w:line="276"/>
+      </w:pPr>
+      <w:r>
+        <w:rPr>
+          <w:rFonts w:ascii="Malgun Gothic" w:cs="Malgun Gothic" w:eastAsia="Malgun Gothic" w:hAnsi="Malgun Gothic"/>
+          <w:b/>
+          <w:bCs/>
+          <w:color w:val="000000"/>
+          <w:sz w:val="20"/>
+          <w:szCs w:val="20"/>
+        </w:rPr>
+        <w:t xml:space="preserve">변경 전</w:t>
+      </w:r>
+    </w:p>
+    <w:p>
+      <w:pPr>
+        <w:pStyle w:val="ListParagraph"/>
+        <w:numPr>
+          <w:ilvl w:val="0"/>
+          <w:numId w:val="1"/>
+        </w:numPr>
+        <w:spacing w:after="80" w:line="276"/>
+      </w:pPr>
+      <w:r>
+        <w:rPr>
+          <w:rFonts w:ascii="Malgun Gothic" w:cs="Malgun Gothic" w:eastAsia="Malgun Gothic" w:hAnsi="Malgun Gothic"/>
+          <w:b w:val="false"/>
+          <w:bCs w:val="false"/>
+          <w:color w:val="000000"/>
+          <w:sz w:val="20"/>
+          <w:szCs w:val="20"/>
+        </w:rPr>
+        <w:t xml:space="preserve">Breadth of coverage does not substitute for correct ascertainment here: a national registry covers nearly the whole population but assigns race by observation, so its AI/AN numerator is undercounted, whereas a linked source counts those cases and applies its geographic restriction to the comparison group as well.</w:t>
+      </w:r>
+    </w:p>
+    <w:p>
+      <w:pPr>
+        <w:pStyle w:val="ListParagraph"/>
+        <w:numPr>
+          <w:ilvl w:val="0"/>
+          <w:numId w:val="1"/>
+        </w:numPr>
+        <w:spacing w:after="80" w:line="276"/>
+      </w:pPr>
+      <w:r>
+        <w:rPr>
+          <w:rFonts w:ascii="Malgun Gothic" w:cs="Malgun Gothic" w:eastAsia="Malgun Gothic" w:hAnsi="Malgun Gothic"/>
+          <w:b w:val="false"/>
+          <w:bCs w:val="false"/>
+          <w:color w:val="000000"/>
+          <w:sz w:val="20"/>
+          <w:szCs w:val="20"/>
+        </w:rPr>
+        <w:t xml:space="preserve">For the national AI/AN cell this meant setting aside a source covering about 99% of the U.S. population for one confined to Purchased/Referred Care Delivery Area counties, which hold about half the AI/AN population; the demoted estimates were carried in the sensitivity analysis.</w:t>
+      </w:r>
+    </w:p>
+    <w:p>
+      <w:pPr>
+        <w:pStyle w:val="ListParagraph"/>
+        <w:numPr>
+          <w:ilvl w:val="0"/>
+          <w:numId w:val="1"/>
+        </w:numPr>
+        <w:spacing w:after="80" w:line="276"/>
+      </w:pPr>
+      <w:r>
+        <w:rPr>
+          <w:rFonts w:ascii="Malgun Gothic" w:cs="Malgun Gothic" w:eastAsia="Malgun Gothic" w:hAnsi="Malgun Gothic"/>
+          <w:b w:val="false"/>
+          <w:bCs w:val="false"/>
+          <w:color w:val="000000"/>
+          <w:sz w:val="20"/>
+          <w:szCs w:val="20"/>
+        </w:rPr>
+        <w:t xml:space="preserve">The comparator criterion was given up in the same way, and Alaska Native women are the example.</w:t>
+      </w:r>
+    </w:p>
+    <w:p>
+      <w:pPr>
+        <w:spacing w:after="120" w:line="276"/>
+      </w:pPr>
+      <w:r>
+        <w:rPr>
+          <w:rFonts w:ascii="Malgun Gothic" w:cs="Malgun Gothic" w:eastAsia="Malgun Gothic" w:hAnsi="Malgun Gothic"/>
+          <w:b/>
+          <w:bCs/>
+          <w:color w:val="000000"/>
+          <w:sz w:val="20"/>
+          <w:szCs w:val="20"/>
+        </w:rPr>
+        <w:t xml:space="preserve">변경 후</w:t>
+      </w:r>
+    </w:p>
+    <w:p>
+      <w:pPr>
+        <w:pStyle w:val="ListParagraph"/>
+        <w:numPr>
+          <w:ilvl w:val="0"/>
+          <w:numId w:val="1"/>
+        </w:numPr>
+        <w:spacing w:after="80" w:line="276"/>
+      </w:pPr>
+      <w:r>
+        <w:rPr>
+          <w:rFonts w:ascii="Malgun Gothic" w:cs="Malgun Gothic" w:eastAsia="Malgun Gothic" w:hAnsi="Malgun Gothic"/>
+          <w:b w:val="false"/>
+          <w:bCs w:val="false"/>
+          <w:color w:val="000000"/>
+          <w:sz w:val="20"/>
+          <w:szCs w:val="20"/>
+        </w:rPr>
+        <w:t xml:space="preserve">For the national AI/AN cell this set aside a source covering about 99% of the U.S. population for one confined to Purchased/Referred Care Delivery Area counties; the demoted estimates were carried in the sensitivity analysis.</w:t>
+      </w:r>
+    </w:p>
+    <w:p>
+      <w:pPr>
+        <w:pStyle w:val="ListParagraph"/>
+        <w:numPr>
+          <w:ilvl w:val="0"/>
+          <w:numId w:val="1"/>
+        </w:numPr>
+        <w:spacing w:after="80" w:line="276"/>
+      </w:pPr>
+      <w:r>
+        <w:rPr>
+          <w:rFonts w:ascii="Malgun Gothic" w:cs="Malgun Gothic" w:eastAsia="Malgun Gothic" w:hAnsi="Malgun Gothic"/>
+          <w:b w:val="false"/>
+          <w:bCs w:val="false"/>
+          <w:color w:val="000000"/>
+          <w:sz w:val="20"/>
+          <w:szCs w:val="20"/>
+        </w:rPr>
+        <w:t xml:space="preserve">Alaska Native women are an example on the comparator side.</w:t>
+      </w:r>
+    </w:p>
+    <w:p>
+      <w:pPr>
+        <w:spacing w:after="120" w:line="276"/>
+      </w:pPr>
+      <w:r>
+        <w:rPr>
+          <w:rFonts w:ascii="Malgun Gothic" w:cs="Malgun Gothic" w:eastAsia="Malgun Gothic" w:hAnsi="Malgun Gothic"/>
+          <w:b w:val="false"/>
+          <w:bCs w:val="false"/>
+          <w:color w:val="000000"/>
+          <w:sz w:val="20"/>
+          <w:szCs w:val="20"/>
+        </w:rPr>
+        <w:t xml:space="preserve">*사유: Cut the argument back out of the AI/AN override rule*</w:t>
       </w:r>
     </w:p>
     <w:p>

</xml_diff>

<commit_message>
Add the appraisal to the single-reviewer limitation, and split the paragraph
The limitation named screening, full-text selection and extraction as
single-reviewer work and left out the risk-of-bias appraisal, which the
author also did alone — and which the checklist itself asks two
appraisers to do. Since the second round raised exactly that, it belongs
in the limitations. It now reads with the appraisal included and says
what the checklist asks for.

The paragraph also ran 293 words over six separate limitations, with
"Finally" arriving two limitations before the end. Split four ways, and
"Finally" moved to the last of them.

Co-Authored-By: Claude Opus 5 <noreply@anthropic.com>
Claude-Session: https://claude.ai/code/session_01CuLT4FKRBtsU22Vwfjj2qn
</commit_message>
<xml_diff>
--- a/meta_agents/search_v2/outputs/Changes_for_review.docx
+++ b/meta_agents/search_v2/outputs/Changes_for_review.docx
@@ -69,7 +69,7 @@
           <w:sz w:val="20"/>
           <w:szCs w:val="20"/>
         </w:rPr>
-        <w:t xml:space="preserve">범위: `42fa0b5` … `HEAD` (60개 문단)</w:t>
+        <w:t xml:space="preserve">범위: `42fa0b5` … `HEAD` (65개 문단)</w:t>
       </w:r>
     </w:p>
     <w:p>
@@ -5645,6 +5645,588 @@
           <w:szCs w:val="20"/>
         </w:rPr>
         <w:t xml:space="preserve">*사유: There are two SIRs, not one, and neither reaches the main text*</w:t>
+      </w:r>
+    </w:p>
+    <w:p>
+      <w:pPr>
+        <w:spacing w:after="120" w:line="276"/>
+      </w:pPr>
+      <w:r>
+        <w:rPr>
+          <w:rFonts w:ascii="Malgun Gothic" w:cs="Malgun Gothic" w:eastAsia="Malgun Gothic" w:hAnsi="Malgun Gothic"/>
+          <w:b w:val="false"/>
+          <w:bCs w:val="false"/>
+          <w:color w:val="000000"/>
+          <w:sz w:val="20"/>
+          <w:szCs w:val="20"/>
+        </w:rPr>
+        <w:t xml:space="preserve">### 13. Risk of bias and sensitivity analyses — 수정</w:t>
+      </w:r>
+    </w:p>
+    <w:p>
+      <w:pPr>
+        <w:spacing w:after="120" w:line="276"/>
+      </w:pPr>
+      <w:r>
+        <w:rPr>
+          <w:rFonts w:ascii="Malgun Gothic" w:cs="Malgun Gothic" w:eastAsia="Malgun Gothic" w:hAnsi="Malgun Gothic"/>
+          <w:b/>
+          <w:bCs/>
+          <w:color w:val="000000"/>
+          <w:sz w:val="20"/>
+          <w:szCs w:val="20"/>
+        </w:rPr>
+        <w:t xml:space="preserve">찾기:</w:t>
+      </w:r>
+      <w:r>
+        <w:rPr>
+          <w:rFonts w:ascii="Malgun Gothic" w:cs="Malgun Gothic" w:eastAsia="Malgun Gothic" w:hAnsi="Malgun Gothic"/>
+          <w:b w:val="false"/>
+          <w:bCs w:val="false"/>
+          <w:color w:val="000000"/>
+          <w:sz w:val="20"/>
+          <w:szCs w:val="20"/>
+        </w:rPr>
+        <w:t xml:space="preserve"> `The representative selection was examined in four ways (Supplementary Table 6).`</w:t>
+      </w:r>
+    </w:p>
+    <w:p>
+      <w:pPr>
+        <w:spacing w:after="120" w:line="276"/>
+      </w:pPr>
+      <w:r>
+        <w:rPr>
+          <w:rFonts w:ascii="Malgun Gothic" w:cs="Malgun Gothic" w:eastAsia="Malgun Gothic" w:hAnsi="Malgun Gothic"/>
+          <w:b/>
+          <w:bCs/>
+          <w:color w:val="000000"/>
+          <w:sz w:val="20"/>
+          <w:szCs w:val="20"/>
+        </w:rPr>
+        <w:t xml:space="preserve">변경 전</w:t>
+      </w:r>
+    </w:p>
+    <w:p>
+      <w:pPr>
+        <w:pStyle w:val="ListParagraph"/>
+        <w:numPr>
+          <w:ilvl w:val="0"/>
+          <w:numId w:val="1"/>
+        </w:numPr>
+        <w:spacing w:after="80" w:line="276"/>
+      </w:pPr>
+      <w:r>
+        <w:rPr>
+          <w:rFonts w:ascii="Malgun Gothic" w:cs="Malgun Gothic" w:eastAsia="Malgun Gothic" w:hAnsi="Malgun Gothic"/>
+          <w:b w:val="false"/>
+          <w:bCs w:val="false"/>
+          <w:color w:val="000000"/>
+          <w:sz w:val="20"/>
+          <w:szCs w:val="20"/>
+        </w:rPr>
+        <w:t xml:space="preserve">The representative selection was examined in four ways (Supplementary Table 6), and the pattern held throughout.</w:t>
+      </w:r>
+    </w:p>
+    <w:p>
+      <w:pPr>
+        <w:pStyle w:val="ListParagraph"/>
+        <w:numPr>
+          <w:ilvl w:val="0"/>
+          <w:numId w:val="1"/>
+        </w:numPr>
+        <w:spacing w:after="80" w:line="276"/>
+      </w:pPr>
+      <w:r>
+        <w:rPr>
+          <w:rFonts w:ascii="Malgun Gothic" w:cs="Malgun Gothic" w:eastAsia="Malgun Gothic" w:hAnsi="Malgun Gothic"/>
+          <w:b w:val="false"/>
+          <w:bCs w:val="false"/>
+          <w:color w:val="000000"/>
+          <w:sz w:val="20"/>
+          <w:szCs w:val="20"/>
+        </w:rPr>
+        <w:t xml:space="preserve">Restricting to low-risk-of-bias studies left 54 of 85 cell representatives unchanged, with the 19 changed and 12 dropped cells falling mainly among the disaggregated AANHPI subgroups and the AI/AN cells, and in smaller numbers among the receptor-subtype, age-specific, and Middle Eastern cells; the largest change was the AI/AN national aggregate, where the restriction replaced the 2010-2015 IHS-linked estimate (0.87) with the 1999-2004 IHS-linked estimate (0.63) (Supplementary Table 6a); restricting to directly reported IRRs—which also excludes the two indirectly standardized SIRs—left 35 unchanged (4 changed, 46 dropped;</w:t>
+      </w:r>
+    </w:p>
+    <w:p>
+      <w:pPr>
+        <w:pStyle w:val="ListParagraph"/>
+        <w:numPr>
+          <w:ilvl w:val="0"/>
+          <w:numId w:val="1"/>
+        </w:numPr>
+        <w:spacing w:after="80" w:line="276"/>
+      </w:pPr>
+      <w:r>
+        <w:rPr>
+          <w:rFonts w:ascii="Malgun Gothic" w:cs="Malgun Gothic" w:eastAsia="Malgun Gothic" w:hAnsi="Malgun Gothic"/>
+          <w:b w:val="false"/>
+          <w:bCs w:val="false"/>
+          <w:color w:val="000000"/>
+          <w:sz w:val="20"/>
+          <w:szCs w:val="20"/>
+        </w:rPr>
+        <w:t xml:space="preserve">Supplementary Table 6b); restricting to NHW-comparator estimates left 66 unchanged (1 changed, 18 dropped;</w:t>
+      </w:r>
+    </w:p>
+    <w:p>
+      <w:pPr>
+        <w:pStyle w:val="ListParagraph"/>
+        <w:numPr>
+          <w:ilvl w:val="0"/>
+          <w:numId w:val="1"/>
+        </w:numPr>
+        <w:spacing w:after="80" w:line="276"/>
+      </w:pPr>
+      <w:r>
+        <w:rPr>
+          <w:rFonts w:ascii="Malgun Gothic" w:cs="Malgun Gothic" w:eastAsia="Malgun Gothic" w:hAnsi="Malgun Gothic"/>
+          <w:b w:val="false"/>
+          <w:bCs w:val="false"/>
+          <w:color w:val="000000"/>
+          <w:sz w:val="20"/>
+          <w:szCs w:val="20"/>
+        </w:rPr>
+        <w:t xml:space="preserve">Supplementary Table 6c), the 18 dropped cells being those whose only representative used an unstratified White comparator — 16 receptor-defined subtype cells and the two Black cells above and below age 40 — and the one changed cell being Alaska Native, whose unstratified-White representative (1.09) gave way to an Indian Health Service–linked estimate reported against an NHW reference (1.25); and restricting to the 2000 U.S. standard population changed little, since 83 of the 85 representatives were already standardized to it, so the restriction dropped no cell and changed only two Black receptor-subtype cells, each from a 1960 Segi-world-standardized representative to a 2000 U.S.–standardized estimate in the same direction (hormone-receptor-negative 1.80 to 1.60, hormone-receptor-positive 0.82 to 0.70;</w:t>
+      </w:r>
+    </w:p>
+    <w:p>
+      <w:pPr>
+        <w:pStyle w:val="ListParagraph"/>
+        <w:numPr>
+          <w:ilvl w:val="0"/>
+          <w:numId w:val="1"/>
+        </w:numPr>
+        <w:spacing w:after="80" w:line="276"/>
+      </w:pPr>
+      <w:r>
+        <w:rPr>
+          <w:rFonts w:ascii="Malgun Gothic" w:cs="Malgun Gothic" w:eastAsia="Malgun Gothic" w:hAnsi="Malgun Gothic"/>
+          <w:b w:val="false"/>
+          <w:bCs w:val="false"/>
+          <w:color w:val="000000"/>
+          <w:sz w:val="20"/>
+          <w:szCs w:val="20"/>
+        </w:rPr>
+        <w:t xml:space="preserve">Supplementary Table 6d).</w:t>
+      </w:r>
+    </w:p>
+    <w:p>
+      <w:pPr>
+        <w:spacing w:after="120" w:line="276"/>
+      </w:pPr>
+      <w:r>
+        <w:rPr>
+          <w:rFonts w:ascii="Malgun Gothic" w:cs="Malgun Gothic" w:eastAsia="Malgun Gothic" w:hAnsi="Malgun Gothic"/>
+          <w:b/>
+          <w:bCs/>
+          <w:color w:val="000000"/>
+          <w:sz w:val="20"/>
+          <w:szCs w:val="20"/>
+        </w:rPr>
+        <w:t xml:space="preserve">변경 후</w:t>
+      </w:r>
+    </w:p>
+    <w:p>
+      <w:pPr>
+        <w:pStyle w:val="ListParagraph"/>
+        <w:numPr>
+          <w:ilvl w:val="0"/>
+          <w:numId w:val="1"/>
+        </w:numPr>
+        <w:spacing w:after="80" w:line="276"/>
+      </w:pPr>
+      <w:r>
+        <w:rPr>
+          <w:rFonts w:ascii="Malgun Gothic" w:cs="Malgun Gothic" w:eastAsia="Malgun Gothic" w:hAnsi="Malgun Gothic"/>
+          <w:b w:val="false"/>
+          <w:bCs w:val="false"/>
+          <w:color w:val="000000"/>
+          <w:sz w:val="20"/>
+          <w:szCs w:val="20"/>
+        </w:rPr>
+        <w:t xml:space="preserve">The representative selection was examined in four ways (Supplementary Table 6).</w:t>
+      </w:r>
+    </w:p>
+    <w:p>
+      <w:pPr>
+        <w:pStyle w:val="ListParagraph"/>
+        <w:numPr>
+          <w:ilvl w:val="0"/>
+          <w:numId w:val="1"/>
+        </w:numPr>
+        <w:spacing w:after="80" w:line="276"/>
+      </w:pPr>
+      <w:r>
+        <w:rPr>
+          <w:rFonts w:ascii="Malgun Gothic" w:cs="Malgun Gothic" w:eastAsia="Malgun Gothic" w:hAnsi="Malgun Gothic"/>
+          <w:b w:val="false"/>
+          <w:bCs w:val="false"/>
+          <w:color w:val="000000"/>
+          <w:sz w:val="20"/>
+          <w:szCs w:val="20"/>
+        </w:rPr>
+        <w:t xml:space="preserve">Each restriction re-selected a representative in the cells it could fill and dropped the rest.</w:t>
+      </w:r>
+    </w:p>
+    <w:p>
+      <w:pPr>
+        <w:spacing w:after="120" w:line="276"/>
+      </w:pPr>
+      <w:r>
+        <w:rPr>
+          <w:rFonts w:ascii="Malgun Gothic" w:cs="Malgun Gothic" w:eastAsia="Malgun Gothic" w:hAnsi="Malgun Gothic"/>
+          <w:b w:val="false"/>
+          <w:bCs w:val="false"/>
+          <w:color w:val="000000"/>
+          <w:sz w:val="20"/>
+          <w:szCs w:val="20"/>
+        </w:rPr>
+        <w:t xml:space="preserve">*사유: Stop Results claiming the pattern held throughout*</w:t>
+      </w:r>
+    </w:p>
+    <w:p>
+      <w:pPr>
+        <w:spacing w:after="120" w:line="276"/>
+      </w:pPr>
+      <w:r>
+        <w:rPr>
+          <w:rFonts w:ascii="Malgun Gothic" w:cs="Malgun Gothic" w:eastAsia="Malgun Gothic" w:hAnsi="Malgun Gothic"/>
+          <w:b w:val="false"/>
+          <w:bCs w:val="false"/>
+          <w:color w:val="000000"/>
+          <w:sz w:val="20"/>
+          <w:szCs w:val="20"/>
+        </w:rPr>
+        <w:t xml:space="preserve">### 14. Risk of bias and sensitivity analyses — 추가</w:t>
+      </w:r>
+    </w:p>
+    <w:p>
+      <w:pPr>
+        <w:spacing w:after="120" w:line="276"/>
+      </w:pPr>
+      <w:r>
+        <w:rPr>
+          <w:rFonts w:ascii="Malgun Gothic" w:cs="Malgun Gothic" w:eastAsia="Malgun Gothic" w:hAnsi="Malgun Gothic"/>
+          <w:b/>
+          <w:bCs/>
+          <w:color w:val="000000"/>
+          <w:sz w:val="20"/>
+          <w:szCs w:val="20"/>
+        </w:rPr>
+        <w:t xml:space="preserve">찾기:</w:t>
+      </w:r>
+      <w:r>
+        <w:rPr>
+          <w:rFonts w:ascii="Malgun Gothic" w:cs="Malgun Gothic" w:eastAsia="Malgun Gothic" w:hAnsi="Malgun Gothic"/>
+          <w:b w:val="false"/>
+          <w:bCs w:val="false"/>
+          <w:color w:val="000000"/>
+          <w:sz w:val="20"/>
+          <w:szCs w:val="20"/>
+        </w:rPr>
+        <w:t xml:space="preserve"> `Restricting to low-risk-of-bias studies left 54 of 85 cell representatives unchanged, with…`</w:t>
+      </w:r>
+    </w:p>
+    <w:p>
+      <w:pPr>
+        <w:spacing w:after="120" w:line="276"/>
+      </w:pPr>
+      <w:r>
+        <w:rPr>
+          <w:rFonts w:ascii="Malgun Gothic" w:cs="Malgun Gothic" w:eastAsia="Malgun Gothic" w:hAnsi="Malgun Gothic"/>
+          <w:b/>
+          <w:bCs/>
+          <w:color w:val="000000"/>
+          <w:sz w:val="20"/>
+          <w:szCs w:val="20"/>
+        </w:rPr>
+        <w:t xml:space="preserve">추가된 문단</w:t>
+      </w:r>
+      <w:r>
+        <w:rPr>
+          <w:rFonts w:ascii="Malgun Gothic" w:cs="Malgun Gothic" w:eastAsia="Malgun Gothic" w:hAnsi="Malgun Gothic"/>
+          <w:b w:val="false"/>
+          <w:bCs w:val="false"/>
+          <w:color w:val="000000"/>
+          <w:sz w:val="20"/>
+          <w:szCs w:val="20"/>
+        </w:rPr>
+        <w:t xml:space="preserve"> Restricting to low-risk-of-bias studies left 54 of 85 cell representatives unchanged, with the 19 changed and 12 dropped cells falling mainly among the disaggregated AANHPI subgroups and the AI/AN cells, and in smaller numbers among the receptor-subtype, age-specific, and Middle Eastern cells. The largest change was the AI/AN national aggregate, where the restriction replaced the 2010-2015 IHS-linked estimate (0.87) with the 1999-2004 IHS-linked estimate (0.63), moving AI/AN below Hispanic/Latina women (Supplementary Table 6a).</w:t>
+      </w:r>
+    </w:p>
+    <w:p>
+      <w:pPr>
+        <w:spacing w:after="120" w:line="276"/>
+      </w:pPr>
+      <w:r>
+        <w:rPr>
+          <w:rFonts w:ascii="Malgun Gothic" w:cs="Malgun Gothic" w:eastAsia="Malgun Gothic" w:hAnsi="Malgun Gothic"/>
+          <w:b w:val="false"/>
+          <w:bCs w:val="false"/>
+          <w:color w:val="000000"/>
+          <w:sz w:val="20"/>
+          <w:szCs w:val="20"/>
+        </w:rPr>
+        <w:t xml:space="preserve">*사유: Stop Results claiming the pattern held throughout*</w:t>
+      </w:r>
+    </w:p>
+    <w:p>
+      <w:pPr>
+        <w:spacing w:after="120" w:line="276"/>
+      </w:pPr>
+      <w:r>
+        <w:rPr>
+          <w:rFonts w:ascii="Malgun Gothic" w:cs="Malgun Gothic" w:eastAsia="Malgun Gothic" w:hAnsi="Malgun Gothic"/>
+          <w:b w:val="false"/>
+          <w:bCs w:val="false"/>
+          <w:color w:val="000000"/>
+          <w:sz w:val="20"/>
+          <w:szCs w:val="20"/>
+        </w:rPr>
+        <w:t xml:space="preserve">### 15. Risk of bias and sensitivity analyses — 추가</w:t>
+      </w:r>
+    </w:p>
+    <w:p>
+      <w:pPr>
+        <w:spacing w:after="120" w:line="276"/>
+      </w:pPr>
+      <w:r>
+        <w:rPr>
+          <w:rFonts w:ascii="Malgun Gothic" w:cs="Malgun Gothic" w:eastAsia="Malgun Gothic" w:hAnsi="Malgun Gothic"/>
+          <w:b/>
+          <w:bCs/>
+          <w:color w:val="000000"/>
+          <w:sz w:val="20"/>
+          <w:szCs w:val="20"/>
+        </w:rPr>
+        <w:t xml:space="preserve">찾기:</w:t>
+      </w:r>
+      <w:r>
+        <w:rPr>
+          <w:rFonts w:ascii="Malgun Gothic" w:cs="Malgun Gothic" w:eastAsia="Malgun Gothic" w:hAnsi="Malgun Gothic"/>
+          <w:b w:val="false"/>
+          <w:bCs w:val="false"/>
+          <w:color w:val="000000"/>
+          <w:sz w:val="20"/>
+          <w:szCs w:val="20"/>
+        </w:rPr>
+        <w:t xml:space="preserve"> `Restricting to directly reported IRRs—which also excludes the two indirectly standardized SIRs—left…`</w:t>
+      </w:r>
+    </w:p>
+    <w:p>
+      <w:pPr>
+        <w:spacing w:after="120" w:line="276"/>
+      </w:pPr>
+      <w:r>
+        <w:rPr>
+          <w:rFonts w:ascii="Malgun Gothic" w:cs="Malgun Gothic" w:eastAsia="Malgun Gothic" w:hAnsi="Malgun Gothic"/>
+          <w:b/>
+          <w:bCs/>
+          <w:color w:val="000000"/>
+          <w:sz w:val="20"/>
+          <w:szCs w:val="20"/>
+        </w:rPr>
+        <w:t xml:space="preserve">추가된 문단</w:t>
+      </w:r>
+      <w:r>
+        <w:rPr>
+          <w:rFonts w:ascii="Malgun Gothic" w:cs="Malgun Gothic" w:eastAsia="Malgun Gothic" w:hAnsi="Malgun Gothic"/>
+          <w:b w:val="false"/>
+          <w:bCs w:val="false"/>
+          <w:color w:val="000000"/>
+          <w:sz w:val="20"/>
+          <w:szCs w:val="20"/>
+        </w:rPr>
+        <w:t xml:space="preserve"> Restricting to directly reported IRRs—which also excludes the two indirectly standardized SIRs—left 35 unchanged (4 changed, 46 dropped; Supplementary Table 6b).</w:t>
+      </w:r>
+    </w:p>
+    <w:p>
+      <w:pPr>
+        <w:spacing w:after="120" w:line="276"/>
+      </w:pPr>
+      <w:r>
+        <w:rPr>
+          <w:rFonts w:ascii="Malgun Gothic" w:cs="Malgun Gothic" w:eastAsia="Malgun Gothic" w:hAnsi="Malgun Gothic"/>
+          <w:b w:val="false"/>
+          <w:bCs w:val="false"/>
+          <w:color w:val="000000"/>
+          <w:sz w:val="20"/>
+          <w:szCs w:val="20"/>
+        </w:rPr>
+        <w:t xml:space="preserve">*사유: Stop Results claiming the pattern held throughout*</w:t>
+      </w:r>
+    </w:p>
+    <w:p>
+      <w:pPr>
+        <w:spacing w:after="120" w:line="276"/>
+      </w:pPr>
+      <w:r>
+        <w:rPr>
+          <w:rFonts w:ascii="Malgun Gothic" w:cs="Malgun Gothic" w:eastAsia="Malgun Gothic" w:hAnsi="Malgun Gothic"/>
+          <w:b w:val="false"/>
+          <w:bCs w:val="false"/>
+          <w:color w:val="000000"/>
+          <w:sz w:val="20"/>
+          <w:szCs w:val="20"/>
+        </w:rPr>
+        <w:t xml:space="preserve">### 16. Risk of bias and sensitivity analyses — 추가</w:t>
+      </w:r>
+    </w:p>
+    <w:p>
+      <w:pPr>
+        <w:spacing w:after="120" w:line="276"/>
+      </w:pPr>
+      <w:r>
+        <w:rPr>
+          <w:rFonts w:ascii="Malgun Gothic" w:cs="Malgun Gothic" w:eastAsia="Malgun Gothic" w:hAnsi="Malgun Gothic"/>
+          <w:b/>
+          <w:bCs/>
+          <w:color w:val="000000"/>
+          <w:sz w:val="20"/>
+          <w:szCs w:val="20"/>
+        </w:rPr>
+        <w:t xml:space="preserve">찾기:</w:t>
+      </w:r>
+      <w:r>
+        <w:rPr>
+          <w:rFonts w:ascii="Malgun Gothic" w:cs="Malgun Gothic" w:eastAsia="Malgun Gothic" w:hAnsi="Malgun Gothic"/>
+          <w:b w:val="false"/>
+          <w:bCs w:val="false"/>
+          <w:color w:val="000000"/>
+          <w:sz w:val="20"/>
+          <w:szCs w:val="20"/>
+        </w:rPr>
+        <w:t xml:space="preserve"> `Restricting to NHW-comparator estimates left 66 unchanged (1 changed, 18 dropped; Supplementary…`</w:t>
+      </w:r>
+    </w:p>
+    <w:p>
+      <w:pPr>
+        <w:spacing w:after="120" w:line="276"/>
+      </w:pPr>
+      <w:r>
+        <w:rPr>
+          <w:rFonts w:ascii="Malgun Gothic" w:cs="Malgun Gothic" w:eastAsia="Malgun Gothic" w:hAnsi="Malgun Gothic"/>
+          <w:b/>
+          <w:bCs/>
+          <w:color w:val="000000"/>
+          <w:sz w:val="20"/>
+          <w:szCs w:val="20"/>
+        </w:rPr>
+        <w:t xml:space="preserve">추가된 문단</w:t>
+      </w:r>
+      <w:r>
+        <w:rPr>
+          <w:rFonts w:ascii="Malgun Gothic" w:cs="Malgun Gothic" w:eastAsia="Malgun Gothic" w:hAnsi="Malgun Gothic"/>
+          <w:b w:val="false"/>
+          <w:bCs w:val="false"/>
+          <w:color w:val="000000"/>
+          <w:sz w:val="20"/>
+          <w:szCs w:val="20"/>
+        </w:rPr>
+        <w:t xml:space="preserve"> Restricting to NHW-comparator estimates left 66 unchanged (1 changed, 18 dropped; Supplementary Table 6c). The 18 dropped cells are those whose only representative used an unstratified White comparator—16 receptor-defined subtype cells and the two Black cells above and below age 40—and the one changed cell is Alaska Native, whose unstratified-White representative (1.09) gave way to an Indian Health Service–linked estimate reported against an NHW reference (1.25).</w:t>
+      </w:r>
+    </w:p>
+    <w:p>
+      <w:pPr>
+        <w:spacing w:after="120" w:line="276"/>
+      </w:pPr>
+      <w:r>
+        <w:rPr>
+          <w:rFonts w:ascii="Malgun Gothic" w:cs="Malgun Gothic" w:eastAsia="Malgun Gothic" w:hAnsi="Malgun Gothic"/>
+          <w:b w:val="false"/>
+          <w:bCs w:val="false"/>
+          <w:color w:val="000000"/>
+          <w:sz w:val="20"/>
+          <w:szCs w:val="20"/>
+        </w:rPr>
+        <w:t xml:space="preserve">*사유: Stop Results claiming the pattern held throughout*</w:t>
+      </w:r>
+    </w:p>
+    <w:p>
+      <w:pPr>
+        <w:spacing w:after="120" w:line="276"/>
+      </w:pPr>
+      <w:r>
+        <w:rPr>
+          <w:rFonts w:ascii="Malgun Gothic" w:cs="Malgun Gothic" w:eastAsia="Malgun Gothic" w:hAnsi="Malgun Gothic"/>
+          <w:b w:val="false"/>
+          <w:bCs w:val="false"/>
+          <w:color w:val="000000"/>
+          <w:sz w:val="20"/>
+          <w:szCs w:val="20"/>
+        </w:rPr>
+        <w:t xml:space="preserve">### 17. Risk of bias and sensitivity analyses — 추가</w:t>
+      </w:r>
+    </w:p>
+    <w:p>
+      <w:pPr>
+        <w:spacing w:after="120" w:line="276"/>
+      </w:pPr>
+      <w:r>
+        <w:rPr>
+          <w:rFonts w:ascii="Malgun Gothic" w:cs="Malgun Gothic" w:eastAsia="Malgun Gothic" w:hAnsi="Malgun Gothic"/>
+          <w:b/>
+          <w:bCs/>
+          <w:color w:val="000000"/>
+          <w:sz w:val="20"/>
+          <w:szCs w:val="20"/>
+        </w:rPr>
+        <w:t xml:space="preserve">찾기:</w:t>
+      </w:r>
+      <w:r>
+        <w:rPr>
+          <w:rFonts w:ascii="Malgun Gothic" w:cs="Malgun Gothic" w:eastAsia="Malgun Gothic" w:hAnsi="Malgun Gothic"/>
+          <w:b w:val="false"/>
+          <w:bCs w:val="false"/>
+          <w:color w:val="000000"/>
+          <w:sz w:val="20"/>
+          <w:szCs w:val="20"/>
+        </w:rPr>
+        <w:t xml:space="preserve"> `Restricting to the 2000 U.S. standard population changed little, since 83 of…`</w:t>
+      </w:r>
+    </w:p>
+    <w:p>
+      <w:pPr>
+        <w:spacing w:after="120" w:line="276"/>
+      </w:pPr>
+      <w:r>
+        <w:rPr>
+          <w:rFonts w:ascii="Malgun Gothic" w:cs="Malgun Gothic" w:eastAsia="Malgun Gothic" w:hAnsi="Malgun Gothic"/>
+          <w:b/>
+          <w:bCs/>
+          <w:color w:val="000000"/>
+          <w:sz w:val="20"/>
+          <w:szCs w:val="20"/>
+        </w:rPr>
+        <w:t xml:space="preserve">추가된 문단</w:t>
+      </w:r>
+      <w:r>
+        <w:rPr>
+          <w:rFonts w:ascii="Malgun Gothic" w:cs="Malgun Gothic" w:eastAsia="Malgun Gothic" w:hAnsi="Malgun Gothic"/>
+          <w:b w:val="false"/>
+          <w:bCs w:val="false"/>
+          <w:color w:val="000000"/>
+          <w:sz w:val="20"/>
+          <w:szCs w:val="20"/>
+        </w:rPr>
+        <w:t xml:space="preserve"> Restricting to the 2000 U.S. standard population changed little, since 83 of the 85 representatives were already standardized to it: it dropped no cell and changed only two Black receptor-subtype cells, each from a 1960 Segi-world-standardized representative to a 2000 U.S.–standardized estimate in the same direction (hormone-receptor-negative 1.80 to 1.60, hormone-receptor-positive 0.82 to 0.70; Supplementary Table 6d).</w:t>
+      </w:r>
+    </w:p>
+    <w:p>
+      <w:pPr>
+        <w:spacing w:after="120" w:line="276"/>
+      </w:pPr>
+      <w:r>
+        <w:rPr>
+          <w:rFonts w:ascii="Malgun Gothic" w:cs="Malgun Gothic" w:eastAsia="Malgun Gothic" w:hAnsi="Malgun Gothic"/>
+          <w:b w:val="false"/>
+          <w:bCs w:val="false"/>
+          <w:color w:val="000000"/>
+          <w:sz w:val="20"/>
+          <w:szCs w:val="20"/>
+        </w:rPr>
+        <w:t xml:space="preserve">*사유: Stop Results claiming the pattern held throughout*</w:t>
       </w:r>
     </w:p>
     <w:p>

</xml_diff>

<commit_message>
Correct the evidence-gap claims in the contribution paragraph
It said the AI/AN regional and national aggregate figures are point
estimates without a confidence interval. Three of the seven regional
figures do carry one — Navajo 0.49 [0.44, 0.55], Alaska Native 1.09
[0.99, 1.21] and Southern Plains 1.33 [1.26, 1.41]. It now says four of
the seven, plus the national aggregate.

The same sentence lumped the other gaps as each resting "on a single
regional or unlinked source". Checked against the data and stated
separately: Middle Eastern women, all four Hispanic-origin subgroups and
two Pacific Islander ones rest on a single source apiece, while AI/AN by
molecular subtype rests on unlinked registries in all four of its cells
and on a single source in three of them.

Co-Authored-By: Claude Opus 5 <noreply@anthropic.com>
Claude-Session: https://claude.ai/code/session_01CuLT4FKRBtsU22Vwfjj2qn
</commit_message>
<xml_diff>
--- a/meta_agents/search_v2/outputs/Changes_for_review.docx
+++ b/meta_agents/search_v2/outputs/Changes_for_review.docx
@@ -69,7 +69,7 @@
           <w:sz w:val="20"/>
           <w:szCs w:val="20"/>
         </w:rPr>
-        <w:t xml:space="preserve">범위: `42fa0b5` … `HEAD` (65개 문단)</w:t>
+        <w:t xml:space="preserve">범위: `42fa0b5` … `HEAD` (69개 문단)</w:t>
       </w:r>
     </w:p>
     <w:p>
@@ -9342,6 +9342,507 @@
           <w:szCs w:val="20"/>
         </w:rPr>
         <w:t xml:space="preserve">*사유: Revert the paragraph move in the Discussion*</w:t>
+      </w:r>
+    </w:p>
+    <w:p>
+      <w:pPr>
+        <w:spacing w:after="120" w:line="276"/>
+      </w:pPr>
+      <w:r>
+        <w:rPr>
+          <w:rFonts w:ascii="Malgun Gothic" w:cs="Malgun Gothic" w:eastAsia="Malgun Gothic" w:hAnsi="Malgun Gothic"/>
+          <w:b w:val="false"/>
+          <w:bCs w:val="false"/>
+          <w:color w:val="000000"/>
+          <w:sz w:val="20"/>
+          <w:szCs w:val="20"/>
+        </w:rPr>
+        <w:t xml:space="preserve">### 23. Discussion — 수정</w:t>
+      </w:r>
+    </w:p>
+    <w:p>
+      <w:pPr>
+        <w:spacing w:after="120" w:line="276"/>
+      </w:pPr>
+      <w:r>
+        <w:rPr>
+          <w:rFonts w:ascii="Malgun Gothic" w:cs="Malgun Gothic" w:eastAsia="Malgun Gothic" w:hAnsi="Malgun Gothic"/>
+          <w:b/>
+          <w:bCs/>
+          <w:color w:val="000000"/>
+          <w:sz w:val="20"/>
+          <w:szCs w:val="20"/>
+        </w:rPr>
+        <w:t xml:space="preserve">찾기:</w:t>
+      </w:r>
+      <w:r>
+        <w:rPr>
+          <w:rFonts w:ascii="Malgun Gothic" w:cs="Malgun Gothic" w:eastAsia="Malgun Gothic" w:hAnsi="Malgun Gothic"/>
+          <w:b w:val="false"/>
+          <w:bCs w:val="false"/>
+          <w:color w:val="000000"/>
+          <w:sz w:val="20"/>
+          <w:szCs w:val="20"/>
+        </w:rPr>
+        <w:t xml:space="preserve"> `The review has limitations. About three fifths of the representative rate ratios…`</w:t>
+      </w:r>
+    </w:p>
+    <w:p>
+      <w:pPr>
+        <w:spacing w:after="120" w:line="276"/>
+      </w:pPr>
+      <w:r>
+        <w:rPr>
+          <w:rFonts w:ascii="Malgun Gothic" w:cs="Malgun Gothic" w:eastAsia="Malgun Gothic" w:hAnsi="Malgun Gothic"/>
+          <w:b/>
+          <w:bCs/>
+          <w:color w:val="000000"/>
+          <w:sz w:val="20"/>
+          <w:szCs w:val="20"/>
+        </w:rPr>
+        <w:t xml:space="preserve">변경 전</w:t>
+      </w:r>
+    </w:p>
+    <w:p>
+      <w:pPr>
+        <w:pStyle w:val="ListParagraph"/>
+        <w:numPr>
+          <w:ilvl w:val="0"/>
+          <w:numId w:val="1"/>
+        </w:numPr>
+        <w:spacing w:after="80" w:line="276"/>
+      </w:pPr>
+      <w:r>
+        <w:rPr>
+          <w:rFonts w:ascii="Malgun Gothic" w:cs="Malgun Gothic" w:eastAsia="Malgun Gothic" w:hAnsi="Malgun Gothic"/>
+          <w:b w:val="false"/>
+          <w:bCs w:val="false"/>
+          <w:color w:val="000000"/>
+          <w:sz w:val="20"/>
+          <w:szCs w:val="20"/>
+        </w:rPr>
+        <w:t xml:space="preserve">Expressing each group's incidence as a ratio to the NHW rate does not by itself make the estimates commensurable.</w:t>
+      </w:r>
+    </w:p>
+    <w:p>
+      <w:pPr>
+        <w:pStyle w:val="ListParagraph"/>
+        <w:numPr>
+          <w:ilvl w:val="0"/>
+          <w:numId w:val="1"/>
+        </w:numPr>
+        <w:spacing w:after="80" w:line="276"/>
+      </w:pPr>
+      <w:r>
+        <w:rPr>
+          <w:rFonts w:ascii="Malgun Gothic" w:cs="Malgun Gothic" w:eastAsia="Malgun Gothic" w:hAnsi="Malgun Gothic"/>
+          <w:b w:val="false"/>
+          <w:bCs w:val="false"/>
+          <w:color w:val="000000"/>
+          <w:sz w:val="20"/>
+          <w:szCs w:val="20"/>
+        </w:rPr>
+        <w:t xml:space="preserve">Within a cell the numerator and denominator share one standard population, period, and region, so the ratio is internally consistent; the ratio does not, however, cancel the standard population, because the age-specific rates of two groups differ in shape and another set of standard weights would move their standardized rates—and so their ratio—by different amounts.</w:t>
+      </w:r>
+    </w:p>
+    <w:p>
+      <w:pPr>
+        <w:pStyle w:val="ListParagraph"/>
+        <w:numPr>
+          <w:ilvl w:val="0"/>
+          <w:numId w:val="1"/>
+        </w:numPr>
+        <w:spacing w:after="80" w:line="276"/>
+      </w:pPr>
+      <w:r>
+        <w:rPr>
+          <w:rFonts w:ascii="Malgun Gothic" w:cs="Malgun Gothic" w:eastAsia="Malgun Gothic" w:hAnsi="Malgun Gothic"/>
+          <w:b w:val="false"/>
+          <w:bCs w:val="false"/>
+          <w:color w:val="000000"/>
+          <w:sz w:val="20"/>
+          <w:szCs w:val="20"/>
+        </w:rPr>
+        <w:t xml:space="preserve">Across cells, differences in standard population, underlying age structure, registry region, and diagnosis period therefore remain embedded.</w:t>
+      </w:r>
+    </w:p>
+    <w:p>
+      <w:pPr>
+        <w:pStyle w:val="ListParagraph"/>
+        <w:numPr>
+          <w:ilvl w:val="0"/>
+          <w:numId w:val="1"/>
+        </w:numPr>
+        <w:spacing w:after="80" w:line="276"/>
+      </w:pPr>
+      <w:r>
+        <w:rPr>
+          <w:rFonts w:ascii="Malgun Gothic" w:cs="Malgun Gothic" w:eastAsia="Malgun Gothic" w:hAnsi="Malgun Gothic"/>
+          <w:b w:val="false"/>
+          <w:bCs w:val="false"/>
+          <w:color w:val="000000"/>
+          <w:sz w:val="20"/>
+          <w:szCs w:val="20"/>
+        </w:rPr>
+        <w:t xml:space="preserve">Diagnosis period and registry region are the main limits on cross-cell comparability; standard population differed less—most estimates used the 2000 US standard, with a 1970 (world or US) or the 1960 Segi world standard in a few older studies, and restricting to the 2000 US standard left the pattern essentially unchanged.</w:t>
+      </w:r>
+    </w:p>
+    <w:p>
+      <w:pPr>
+        <w:pStyle w:val="ListParagraph"/>
+        <w:numPr>
+          <w:ilvl w:val="0"/>
+          <w:numId w:val="1"/>
+        </w:numPr>
+        <w:spacing w:after="80" w:line="276"/>
+      </w:pPr>
+      <w:r>
+        <w:rPr>
+          <w:rFonts w:ascii="Malgun Gothic" w:cs="Malgun Gothic" w:eastAsia="Malgun Gothic" w:hAnsi="Malgun Gothic"/>
+          <w:b w:val="false"/>
+          <w:bCs w:val="false"/>
+          <w:color w:val="000000"/>
+          <w:sz w:val="20"/>
+          <w:szCs w:val="20"/>
+        </w:rPr>
+        <w:t xml:space="preserve">The review was restricted to U.S.-resident populations, so the estimates are not generalizable to countries that use a different White reference, different racial and ethnic categories, and different standard populations.</w:t>
+      </w:r>
+    </w:p>
+    <w:p>
+      <w:pPr>
+        <w:pStyle w:val="ListParagraph"/>
+        <w:numPr>
+          <w:ilvl w:val="0"/>
+          <w:numId w:val="1"/>
+        </w:numPr>
+        <w:spacing w:after="80" w:line="276"/>
+      </w:pPr>
+      <w:r>
+        <w:rPr>
+          <w:rFonts w:ascii="Malgun Gothic" w:cs="Malgun Gothic" w:eastAsia="Malgun Gothic" w:hAnsi="Malgun Gothic"/>
+          <w:b w:val="false"/>
+          <w:bCs w:val="false"/>
+          <w:color w:val="000000"/>
+          <w:sz w:val="20"/>
+          <w:szCs w:val="20"/>
+        </w:rPr>
+        <w:t xml:space="preserve">Finally, estimates for the smallest subgroups rested on limited numbers, studies contributing only to the narrative synthesis were not quantified, and grey literature was not searched.</w:t>
+      </w:r>
+    </w:p>
+    <w:p>
+      <w:pPr>
+        <w:pStyle w:val="ListParagraph"/>
+        <w:numPr>
+          <w:ilvl w:val="0"/>
+          <w:numId w:val="1"/>
+        </w:numPr>
+        <w:spacing w:after="80" w:line="276"/>
+      </w:pPr>
+      <w:r>
+        <w:rPr>
+          <w:rFonts w:ascii="Malgun Gothic" w:cs="Malgun Gothic" w:eastAsia="Malgun Gothic" w:hAnsi="Malgun Gothic"/>
+          <w:b w:val="false"/>
+          <w:bCs w:val="false"/>
+          <w:color w:val="000000"/>
+          <w:sz w:val="20"/>
+          <w:szCs w:val="20"/>
+        </w:rPr>
+        <w:t xml:space="preserve">Screening, full-text selection, and extraction were carried out by a single reviewer with large-language-model assistance rather than by two independent reviewers.</w:t>
+      </w:r>
+    </w:p>
+    <w:p>
+      <w:pPr>
+        <w:pStyle w:val="ListParagraph"/>
+        <w:numPr>
+          <w:ilvl w:val="0"/>
+          <w:numId w:val="1"/>
+        </w:numPr>
+        <w:spacing w:after="80" w:line="276"/>
+      </w:pPr>
+      <w:r>
+        <w:rPr>
+          <w:rFonts w:ascii="Malgun Gothic" w:cs="Malgun Gothic" w:eastAsia="Malgun Gothic" w:hAnsi="Malgun Gothic"/>
+          <w:b w:val="false"/>
+          <w:bCs w:val="false"/>
+          <w:color w:val="000000"/>
+          <w:sz w:val="20"/>
+          <w:szCs w:val="20"/>
+        </w:rPr>
+        <w:t xml:space="preserve">To limit studies missed by this single-reviewer screening, the excluded records were re-screened at the full abstract with an explicit keyword filter, leaving the residual risk of a missed study confined to reports whose abstracts omit two or more of the screening signals.</w:t>
+      </w:r>
+    </w:p>
+    <w:p>
+      <w:pPr>
+        <w:spacing w:after="120" w:line="276"/>
+      </w:pPr>
+      <w:r>
+        <w:rPr>
+          <w:rFonts w:ascii="Malgun Gothic" w:cs="Malgun Gothic" w:eastAsia="Malgun Gothic" w:hAnsi="Malgun Gothic"/>
+          <w:b w:val="false"/>
+          <w:bCs w:val="false"/>
+          <w:color w:val="000000"/>
+          <w:sz w:val="20"/>
+          <w:szCs w:val="20"/>
+        </w:rPr>
+        <w:t xml:space="preserve">*사유: Add the appraisal to the single-reviewer limitation, and split the paragraph*</w:t>
+      </w:r>
+    </w:p>
+    <w:p>
+      <w:pPr>
+        <w:spacing w:after="120" w:line="276"/>
+      </w:pPr>
+      <w:r>
+        <w:rPr>
+          <w:rFonts w:ascii="Malgun Gothic" w:cs="Malgun Gothic" w:eastAsia="Malgun Gothic" w:hAnsi="Malgun Gothic"/>
+          <w:b w:val="false"/>
+          <w:bCs w:val="false"/>
+          <w:color w:val="000000"/>
+          <w:sz w:val="20"/>
+          <w:szCs w:val="20"/>
+        </w:rPr>
+        <w:t xml:space="preserve">### 24. Discussion — 추가</w:t>
+      </w:r>
+    </w:p>
+    <w:p>
+      <w:pPr>
+        <w:spacing w:after="120" w:line="276"/>
+      </w:pPr>
+      <w:r>
+        <w:rPr>
+          <w:rFonts w:ascii="Malgun Gothic" w:cs="Malgun Gothic" w:eastAsia="Malgun Gothic" w:hAnsi="Malgun Gothic"/>
+          <w:b/>
+          <w:bCs/>
+          <w:color w:val="000000"/>
+          <w:sz w:val="20"/>
+          <w:szCs w:val="20"/>
+        </w:rPr>
+        <w:t xml:space="preserve">찾기:</w:t>
+      </w:r>
+      <w:r>
+        <w:rPr>
+          <w:rFonts w:ascii="Malgun Gothic" w:cs="Malgun Gothic" w:eastAsia="Malgun Gothic" w:hAnsi="Malgun Gothic"/>
+          <w:b w:val="false"/>
+          <w:bCs w:val="false"/>
+          <w:color w:val="000000"/>
+          <w:sz w:val="20"/>
+          <w:szCs w:val="20"/>
+        </w:rPr>
+        <w:t xml:space="preserve"> `Expressing each group's incidence as a ratio to the NHW rate does…`</w:t>
+      </w:r>
+    </w:p>
+    <w:p>
+      <w:pPr>
+        <w:spacing w:after="120" w:line="276"/>
+      </w:pPr>
+      <w:r>
+        <w:rPr>
+          <w:rFonts w:ascii="Malgun Gothic" w:cs="Malgun Gothic" w:eastAsia="Malgun Gothic" w:hAnsi="Malgun Gothic"/>
+          <w:b/>
+          <w:bCs/>
+          <w:color w:val="000000"/>
+          <w:sz w:val="20"/>
+          <w:szCs w:val="20"/>
+        </w:rPr>
+        <w:t xml:space="preserve">추가된 문단</w:t>
+      </w:r>
+      <w:r>
+        <w:rPr>
+          <w:rFonts w:ascii="Malgun Gothic" w:cs="Malgun Gothic" w:eastAsia="Malgun Gothic" w:hAnsi="Malgun Gothic"/>
+          <w:b w:val="false"/>
+          <w:bCs w:val="false"/>
+          <w:color w:val="000000"/>
+          <w:sz w:val="20"/>
+          <w:szCs w:val="20"/>
+        </w:rPr>
+        <w:t xml:space="preserve"> Expressing each group's incidence as a ratio to the NHW rate does not by itself make the estimates commensurable. Within a cell the numerator and denominator share one standard population, period, and region, so the ratio is internally consistent; the ratio does not, however, cancel the standard population, because the age-specific rates of two groups differ in shape and another set of standard weights would move their standardized rates—and so their ratio—by different amounts. Across cells, differences in standard population, underlying age structure, registry region, and diagnosis period therefore remain embedded. Diagnosis period and registry region are the main limits on cross-cell comparability; standard population differed less—most estimates used the 2000 US standard, with a 1970 (world or US) or the 1960 Segi world standard in a few older studies, and restricting to the 2000 US standard left the pattern essentially unchanged.</w:t>
+      </w:r>
+    </w:p>
+    <w:p>
+      <w:pPr>
+        <w:spacing w:after="120" w:line="276"/>
+      </w:pPr>
+      <w:r>
+        <w:rPr>
+          <w:rFonts w:ascii="Malgun Gothic" w:cs="Malgun Gothic" w:eastAsia="Malgun Gothic" w:hAnsi="Malgun Gothic"/>
+          <w:b w:val="false"/>
+          <w:bCs w:val="false"/>
+          <w:color w:val="000000"/>
+          <w:sz w:val="20"/>
+          <w:szCs w:val="20"/>
+        </w:rPr>
+        <w:t xml:space="preserve">*사유: Add the appraisal to the single-reviewer limitation, and split the paragraph*</w:t>
+      </w:r>
+    </w:p>
+    <w:p>
+      <w:pPr>
+        <w:spacing w:after="120" w:line="276"/>
+      </w:pPr>
+      <w:r>
+        <w:rPr>
+          <w:rFonts w:ascii="Malgun Gothic" w:cs="Malgun Gothic" w:eastAsia="Malgun Gothic" w:hAnsi="Malgun Gothic"/>
+          <w:b w:val="false"/>
+          <w:bCs w:val="false"/>
+          <w:color w:val="000000"/>
+          <w:sz w:val="20"/>
+          <w:szCs w:val="20"/>
+        </w:rPr>
+        <w:t xml:space="preserve">### 25. Discussion — 추가</w:t>
+      </w:r>
+    </w:p>
+    <w:p>
+      <w:pPr>
+        <w:spacing w:after="120" w:line="276"/>
+      </w:pPr>
+      <w:r>
+        <w:rPr>
+          <w:rFonts w:ascii="Malgun Gothic" w:cs="Malgun Gothic" w:eastAsia="Malgun Gothic" w:hAnsi="Malgun Gothic"/>
+          <w:b/>
+          <w:bCs/>
+          <w:color w:val="000000"/>
+          <w:sz w:val="20"/>
+          <w:szCs w:val="20"/>
+        </w:rPr>
+        <w:t xml:space="preserve">찾기:</w:t>
+      </w:r>
+      <w:r>
+        <w:rPr>
+          <w:rFonts w:ascii="Malgun Gothic" w:cs="Malgun Gothic" w:eastAsia="Malgun Gothic" w:hAnsi="Malgun Gothic"/>
+          <w:b w:val="false"/>
+          <w:bCs w:val="false"/>
+          <w:color w:val="000000"/>
+          <w:sz w:val="20"/>
+          <w:szCs w:val="20"/>
+        </w:rPr>
+        <w:t xml:space="preserve"> `The review was restricted to U.S.-resident populations, so the estimates are not…`</w:t>
+      </w:r>
+    </w:p>
+    <w:p>
+      <w:pPr>
+        <w:spacing w:after="120" w:line="276"/>
+      </w:pPr>
+      <w:r>
+        <w:rPr>
+          <w:rFonts w:ascii="Malgun Gothic" w:cs="Malgun Gothic" w:eastAsia="Malgun Gothic" w:hAnsi="Malgun Gothic"/>
+          <w:b/>
+          <w:bCs/>
+          <w:color w:val="000000"/>
+          <w:sz w:val="20"/>
+          <w:szCs w:val="20"/>
+        </w:rPr>
+        <w:t xml:space="preserve">추가된 문단</w:t>
+      </w:r>
+      <w:r>
+        <w:rPr>
+          <w:rFonts w:ascii="Malgun Gothic" w:cs="Malgun Gothic" w:eastAsia="Malgun Gothic" w:hAnsi="Malgun Gothic"/>
+          <w:b w:val="false"/>
+          <w:bCs w:val="false"/>
+          <w:color w:val="000000"/>
+          <w:sz w:val="20"/>
+          <w:szCs w:val="20"/>
+        </w:rPr>
+        <w:t xml:space="preserve"> The review was restricted to U.S.-resident populations, so the estimates are not generalizable to countries that use a different White reference, different racial and ethnic categories, and different standard populations. Estimates for the smallest subgroups rested on limited numbers, studies contributing only to the narrative synthesis were not quantified, and grey literature was not searched.</w:t>
+      </w:r>
+    </w:p>
+    <w:p>
+      <w:pPr>
+        <w:spacing w:after="120" w:line="276"/>
+      </w:pPr>
+      <w:r>
+        <w:rPr>
+          <w:rFonts w:ascii="Malgun Gothic" w:cs="Malgun Gothic" w:eastAsia="Malgun Gothic" w:hAnsi="Malgun Gothic"/>
+          <w:b w:val="false"/>
+          <w:bCs w:val="false"/>
+          <w:color w:val="000000"/>
+          <w:sz w:val="20"/>
+          <w:szCs w:val="20"/>
+        </w:rPr>
+        <w:t xml:space="preserve">*사유: Add the appraisal to the single-reviewer limitation, and split the paragraph*</w:t>
+      </w:r>
+    </w:p>
+    <w:p>
+      <w:pPr>
+        <w:spacing w:after="120" w:line="276"/>
+      </w:pPr>
+      <w:r>
+        <w:rPr>
+          <w:rFonts w:ascii="Malgun Gothic" w:cs="Malgun Gothic" w:eastAsia="Malgun Gothic" w:hAnsi="Malgun Gothic"/>
+          <w:b w:val="false"/>
+          <w:bCs w:val="false"/>
+          <w:color w:val="000000"/>
+          <w:sz w:val="20"/>
+          <w:szCs w:val="20"/>
+        </w:rPr>
+        <w:t xml:space="preserve">### 26. Discussion — 추가</w:t>
+      </w:r>
+    </w:p>
+    <w:p>
+      <w:pPr>
+        <w:spacing w:after="120" w:line="276"/>
+      </w:pPr>
+      <w:r>
+        <w:rPr>
+          <w:rFonts w:ascii="Malgun Gothic" w:cs="Malgun Gothic" w:eastAsia="Malgun Gothic" w:hAnsi="Malgun Gothic"/>
+          <w:b/>
+          <w:bCs/>
+          <w:color w:val="000000"/>
+          <w:sz w:val="20"/>
+          <w:szCs w:val="20"/>
+        </w:rPr>
+        <w:t xml:space="preserve">찾기:</w:t>
+      </w:r>
+      <w:r>
+        <w:rPr>
+          <w:rFonts w:ascii="Malgun Gothic" w:cs="Malgun Gothic" w:eastAsia="Malgun Gothic" w:hAnsi="Malgun Gothic"/>
+          <w:b w:val="false"/>
+          <w:bCs w:val="false"/>
+          <w:color w:val="000000"/>
+          <w:sz w:val="20"/>
+          <w:szCs w:val="20"/>
+        </w:rPr>
+        <w:t xml:space="preserve"> `Finally, screening, full-text selection, extraction, and the risk-of-bias appraisal were carried out…`</w:t>
+      </w:r>
+    </w:p>
+    <w:p>
+      <w:pPr>
+        <w:spacing w:after="120" w:line="276"/>
+      </w:pPr>
+      <w:r>
+        <w:rPr>
+          <w:rFonts w:ascii="Malgun Gothic" w:cs="Malgun Gothic" w:eastAsia="Malgun Gothic" w:hAnsi="Malgun Gothic"/>
+          <w:b/>
+          <w:bCs/>
+          <w:color w:val="000000"/>
+          <w:sz w:val="20"/>
+          <w:szCs w:val="20"/>
+        </w:rPr>
+        <w:t xml:space="preserve">추가된 문단</w:t>
+      </w:r>
+      <w:r>
+        <w:rPr>
+          <w:rFonts w:ascii="Malgun Gothic" w:cs="Malgun Gothic" w:eastAsia="Malgun Gothic" w:hAnsi="Malgun Gothic"/>
+          <w:b w:val="false"/>
+          <w:bCs w:val="false"/>
+          <w:color w:val="000000"/>
+          <w:sz w:val="20"/>
+          <w:szCs w:val="20"/>
+        </w:rPr>
+        <w:t xml:space="preserve"> Finally, screening, full-text selection, extraction, and the risk-of-bias appraisal were carried out by a single reviewer with large-language-model assistance rather than by two independent reviewers, which the appraisal checklist asks for. To limit studies missed by this single-reviewer screening, the excluded records were re-screened at the full abstract with an explicit keyword filter, leaving the residual risk of a missed study confined to reports whose abstracts omit two or more of the screening signals.</w:t>
+      </w:r>
+    </w:p>
+    <w:p>
+      <w:pPr>
+        <w:spacing w:after="120" w:line="276"/>
+      </w:pPr>
+      <w:r>
+        <w:rPr>
+          <w:rFonts w:ascii="Malgun Gothic" w:cs="Malgun Gothic" w:eastAsia="Malgun Gothic" w:hAnsi="Malgun Gothic"/>
+          <w:b w:val="false"/>
+          <w:bCs w:val="false"/>
+          <w:color w:val="000000"/>
+          <w:sz w:val="20"/>
+          <w:szCs w:val="20"/>
+        </w:rPr>
+        <w:t xml:space="preserve">*사유: Add the appraisal to the single-reviewer limitation, and split the paragraph*</w:t>
       </w:r>
     </w:p>
     <w:sectPr>

</xml_diff>